<commit_message>
Cap nhat tai lieu va bao cao theo phan Redis da cai dat
</commit_message>
<xml_diff>
--- a/bao-cao/Do_an_COMP1313_DongGoiMonolithicThanhDocker_TranHoangDat_49.01.104.030.docx
+++ b/bao-cao/Do_an_COMP1313_DongGoiMonolithicThanhDocker_TranHoangDat_49.01.104.030.docx
@@ -6762,7 +6762,7 @@
         <w:rPr>
           <w:highlight w:val="yellow"/>
         </w:rPr>
-        <w:t xml:space="preserve">&lt;ĐIỀN LỖI THẬT GẶP KHI THÊM REDIS VÀ CÁCH KHẮC PHỤC. GỢI Ý LỖI HAY GẶP: (1) healthcheck báo NOAUTH vì redis-cli thiếu mật khẩu, khắc phục bằng redis-cli -a "$$REDIS_PASSWORD" --no-auth-warning ping trong docker-compose.yaml; (2) thiếu REDIS_PASSWORD trong .env làm docker compose báo lỗi ngay khi đọc cấu hình; (3) ứng dụng kết nối localhost:6379 thay vì tên service redis nên bị từ chối kết nối&gt;</w:t>
+        <w:t xml:space="preserve">&lt;ĐIỀN LỖI THẬT GẶP KHI THÊM REDIS VÀ CÁCH KHẮC PHỤC. GỢI Ý LỖI HAY GẶP: (1) thiếu REDIS_PASSWORD trong .env làm docker compose báo lỗi "required variable REDIS_PASSWORD is missing a value" ngay khi đọc cấu hình; (2) healthcheck báo NOAUTH khi redis-cli không có mật khẩu, khắc phục bằng biến REDISCLI_AUTH trong container; (3) mật khẩu có ký tự @ hoặc : làm hỏng chuỗi REDIS_URL, khắc phục bằng mật khẩu chỉ gồm chữ, số, - và _&gt;</w:t>
       </w:r>
     </w:p>
     <w:p>
@@ -7591,7 +7591,7 @@
         <w:jc w:val="both"/>
       </w:pPr>
       <w:r>
-        <w:t xml:space="preserve">[1] Tài liệu nội bộ dự án Research Document Workspace: README.md, docs/architecture.md, docs/security.md, docs/ha-tang.md.</w:t>
+        <w:t xml:space="preserve">[1] Tài liệu nội bộ dự án Research Document Workspace: README.md, docs/architecture.md, docs/security.md, docs/infrastructure.md.</w:t>
       </w:r>
     </w:p>
     <w:p>
@@ -8587,7 +8587,6 @@
                 <w:rFonts w:ascii="Consolas" w:eastAsia="Consolas" w:hAnsi="Consolas" w:cs="Consolas"/>
                 <w:sz w:val="19"/>
                 <w:szCs w:val="19"/>
-                <w:highlight w:val="yellow"/>
               </w:rPr>
               <w:t xml:space="preserve">  redis:</w:t>
             </w:r>
@@ -8601,7 +8600,6 @@
                 <w:rFonts w:ascii="Consolas" w:eastAsia="Consolas" w:hAnsi="Consolas" w:cs="Consolas"/>
                 <w:sz w:val="19"/>
                 <w:szCs w:val="19"/>
-                <w:highlight w:val="yellow"/>
               </w:rPr>
               <w:t xml:space="preserve">    image: redis:7.4-alpine</w:t>
             </w:r>
@@ -8615,9 +8613,8 @@
                 <w:rFonts w:ascii="Consolas" w:eastAsia="Consolas" w:hAnsi="Consolas" w:cs="Consolas"/>
                 <w:sz w:val="19"/>
                 <w:szCs w:val="19"/>
-                <w:highlight w:val="yellow"/>
-              </w:rPr>
-              <w:t xml:space="preserve">    command: &gt;</w:t>
+              </w:rPr>
+              <w:t xml:space="preserve">    environment:</w:t>
             </w:r>
           </w:p>
           <w:p>
@@ -8629,9 +8626,8 @@
                 <w:rFonts w:ascii="Consolas" w:eastAsia="Consolas" w:hAnsi="Consolas" w:cs="Consolas"/>
                 <w:sz w:val="19"/>
                 <w:szCs w:val="19"/>
-                <w:highlight w:val="yellow"/>
-              </w:rPr>
-              <w:t xml:space="preserve">      redis-server</w:t>
+              </w:rPr>
+              <w:t xml:space="preserve">      REDISCLI_AUTH: ${REDIS_PASSWORD:?Missing REDIS_PASSWORD}</w:t>
             </w:r>
           </w:p>
           <w:p>
@@ -8643,9 +8639,8 @@
                 <w:rFonts w:ascii="Consolas" w:eastAsia="Consolas" w:hAnsi="Consolas" w:cs="Consolas"/>
                 <w:sz w:val="19"/>
                 <w:szCs w:val="19"/>
-                <w:highlight w:val="yellow"/>
-              </w:rPr>
-              <w:t xml:space="preserve">      --requirepass ${REDIS_PASSWORD:?Missing REDIS_PASSWORD}</w:t>
+              </w:rPr>
+              <w:t xml:space="preserve">    command:</w:t>
             </w:r>
           </w:p>
           <w:p>
@@ -8657,9 +8652,8 @@
                 <w:rFonts w:ascii="Consolas" w:eastAsia="Consolas" w:hAnsi="Consolas" w:cs="Consolas"/>
                 <w:sz w:val="19"/>
                 <w:szCs w:val="19"/>
-                <w:highlight w:val="yellow"/>
-              </w:rPr>
-              <w:t xml:space="preserve">      --maxmemory 64mb --maxmemory-policy allkeys-lru</w:t>
+              </w:rPr>
+              <w:t xml:space="preserve">      - sh</w:t>
             </w:r>
           </w:p>
           <w:p>
@@ -8671,9 +8665,8 @@
                 <w:rFonts w:ascii="Consolas" w:eastAsia="Consolas" w:hAnsi="Consolas" w:cs="Consolas"/>
                 <w:sz w:val="19"/>
                 <w:szCs w:val="19"/>
-                <w:highlight w:val="yellow"/>
-              </w:rPr>
-              <w:t xml:space="preserve">      --save "" --appendonly no</w:t>
+              </w:rPr>
+              <w:t xml:space="preserve">      - -c</w:t>
             </w:r>
           </w:p>
           <w:p>
@@ -8685,9 +8678,8 @@
                 <w:rFonts w:ascii="Consolas" w:eastAsia="Consolas" w:hAnsi="Consolas" w:cs="Consolas"/>
                 <w:sz w:val="19"/>
                 <w:szCs w:val="19"/>
-                <w:highlight w:val="yellow"/>
-              </w:rPr>
-              <w:t xml:space="preserve">    environment:</w:t>
+              </w:rPr>
+              <w:t xml:space="preserve">      - exec redis-server --requirepass "$$REDISCLI_AUTH" --maxmemory 64mb</w:t>
             </w:r>
           </w:p>
           <w:p>
@@ -8699,9 +8691,8 @@
                 <w:rFonts w:ascii="Consolas" w:eastAsia="Consolas" w:hAnsi="Consolas" w:cs="Consolas"/>
                 <w:sz w:val="19"/>
                 <w:szCs w:val="19"/>
-                <w:highlight w:val="yellow"/>
-              </w:rPr>
-              <w:t xml:space="preserve">      REDIS_PASSWORD: ${REDIS_PASSWORD}</w:t>
+              </w:rPr>
+              <w:t xml:space="preserve">        --maxmemory-policy allkeys-lru --save '' --appendonly no</w:t>
             </w:r>
           </w:p>
           <w:p>
@@ -8713,7 +8704,6 @@
                 <w:rFonts w:ascii="Consolas" w:eastAsia="Consolas" w:hAnsi="Consolas" w:cs="Consolas"/>
                 <w:sz w:val="19"/>
                 <w:szCs w:val="19"/>
-                <w:highlight w:val="yellow"/>
               </w:rPr>
               <w:t xml:space="preserve">    cpus: "0.5"</w:t>
             </w:r>
@@ -8727,7 +8717,6 @@
                 <w:rFonts w:ascii="Consolas" w:eastAsia="Consolas" w:hAnsi="Consolas" w:cs="Consolas"/>
                 <w:sz w:val="19"/>
                 <w:szCs w:val="19"/>
-                <w:highlight w:val="yellow"/>
               </w:rPr>
               <w:t xml:space="preserve">    mem_limit: 128m</w:t>
             </w:r>
@@ -8741,7 +8730,6 @@
                 <w:rFonts w:ascii="Consolas" w:eastAsia="Consolas" w:hAnsi="Consolas" w:cs="Consolas"/>
                 <w:sz w:val="19"/>
                 <w:szCs w:val="19"/>
-                <w:highlight w:val="yellow"/>
               </w:rPr>
               <w:t xml:space="preserve">    restart: unless-stopped</w:t>
             </w:r>
@@ -8755,7 +8743,6 @@
                 <w:rFonts w:ascii="Consolas" w:eastAsia="Consolas" w:hAnsi="Consolas" w:cs="Consolas"/>
                 <w:sz w:val="19"/>
                 <w:szCs w:val="19"/>
-                <w:highlight w:val="yellow"/>
               </w:rPr>
               <w:t xml:space="preserve">    healthcheck:</w:t>
             </w:r>
@@ -8769,9 +8756,8 @@
                 <w:rFonts w:ascii="Consolas" w:eastAsia="Consolas" w:hAnsi="Consolas" w:cs="Consolas"/>
                 <w:sz w:val="19"/>
                 <w:szCs w:val="19"/>
-                <w:highlight w:val="yellow"/>
-              </w:rPr>
-              <w:t xml:space="preserve">      test: ["CMD-SHELL", "redis-cli -a \"$$REDIS_PASSWORD\" --no-auth-warning ping | grep -q PONG"]</w:t>
+              </w:rPr>
+              <w:t xml:space="preserve">      test: ["CMD", "redis-cli", "ping"]</w:t>
             </w:r>
           </w:p>
           <w:p>
@@ -8783,7 +8769,6 @@
                 <w:rFonts w:ascii="Consolas" w:eastAsia="Consolas" w:hAnsi="Consolas" w:cs="Consolas"/>
                 <w:sz w:val="19"/>
                 <w:szCs w:val="19"/>
-                <w:highlight w:val="yellow"/>
               </w:rPr>
               <w:t xml:space="preserve">      interval: 5s</w:t>
             </w:r>
@@ -8797,7 +8782,6 @@
                 <w:rFonts w:ascii="Consolas" w:eastAsia="Consolas" w:hAnsi="Consolas" w:cs="Consolas"/>
                 <w:sz w:val="19"/>
                 <w:szCs w:val="19"/>
-                <w:highlight w:val="yellow"/>
               </w:rPr>
               <w:t xml:space="preserve">      timeout: 3s</w:t>
             </w:r>
@@ -8811,9 +8795,99 @@
                 <w:rFonts w:ascii="Consolas" w:eastAsia="Consolas" w:hAnsi="Consolas" w:cs="Consolas"/>
                 <w:sz w:val="19"/>
                 <w:szCs w:val="19"/>
-                <w:highlight w:val="yellow"/>
               </w:rPr>
               <w:t xml:space="preserve">      retries: 20</w:t>
+            </w:r>
+          </w:p>
+          <w:p>
+            <w:pPr>
+              <w:spacing w:line="276" w:lineRule="auto"/>
+            </w:pPr>
+            <w:r>
+              <w:rPr>
+                <w:rFonts w:ascii="Consolas" w:eastAsia="Consolas" w:hAnsi="Consolas" w:cs="Consolas"/>
+                <w:sz w:val="19"/>
+                <w:szCs w:val="19"/>
+              </w:rPr>
+              <w:t xml:space="preserve"> </w:t>
+            </w:r>
+          </w:p>
+          <w:p>
+            <w:pPr>
+              <w:spacing w:line="276" w:lineRule="auto"/>
+            </w:pPr>
+            <w:r>
+              <w:rPr>
+                <w:rFonts w:ascii="Consolas" w:eastAsia="Consolas" w:hAnsi="Consolas" w:cs="Consolas"/>
+                <w:sz w:val="19"/>
+                <w:szCs w:val="19"/>
+              </w:rPr>
+              <w:t xml:space="preserve">  web:</w:t>
+            </w:r>
+          </w:p>
+          <w:p>
+            <w:pPr>
+              <w:spacing w:line="276" w:lineRule="auto"/>
+            </w:pPr>
+            <w:r>
+              <w:rPr>
+                <w:rFonts w:ascii="Consolas" w:eastAsia="Consolas" w:hAnsi="Consolas" w:cs="Consolas"/>
+                <w:sz w:val="19"/>
+                <w:szCs w:val="19"/>
+              </w:rPr>
+              <w:t xml:space="preserve">    environment:</w:t>
+            </w:r>
+          </w:p>
+          <w:p>
+            <w:pPr>
+              <w:spacing w:line="276" w:lineRule="auto"/>
+            </w:pPr>
+            <w:r>
+              <w:rPr>
+                <w:rFonts w:ascii="Consolas" w:eastAsia="Consolas" w:hAnsi="Consolas" w:cs="Consolas"/>
+                <w:sz w:val="19"/>
+                <w:szCs w:val="19"/>
+              </w:rPr>
+              <w:t xml:space="preserve">      REDIS_URL: redis://:${REDIS_PASSWORD:?Missing REDIS_PASSWORD}@redis:6379/0</w:t>
+            </w:r>
+          </w:p>
+          <w:p>
+            <w:pPr>
+              <w:spacing w:line="276" w:lineRule="auto"/>
+            </w:pPr>
+            <w:r>
+              <w:rPr>
+                <w:rFonts w:ascii="Consolas" w:eastAsia="Consolas" w:hAnsi="Consolas" w:cs="Consolas"/>
+                <w:sz w:val="19"/>
+                <w:szCs w:val="19"/>
+              </w:rPr>
+              <w:t xml:space="preserve">    depends_on:</w:t>
+            </w:r>
+          </w:p>
+          <w:p>
+            <w:pPr>
+              <w:spacing w:line="276" w:lineRule="auto"/>
+            </w:pPr>
+            <w:r>
+              <w:rPr>
+                <w:rFonts w:ascii="Consolas" w:eastAsia="Consolas" w:hAnsi="Consolas" w:cs="Consolas"/>
+                <w:sz w:val="19"/>
+                <w:szCs w:val="19"/>
+              </w:rPr>
+              <w:t xml:space="preserve">      redis:</w:t>
+            </w:r>
+          </w:p>
+          <w:p>
+            <w:pPr>
+              <w:spacing w:line="276" w:lineRule="auto"/>
+            </w:pPr>
+            <w:r>
+              <w:rPr>
+                <w:rFonts w:ascii="Consolas" w:eastAsia="Consolas" w:hAnsi="Consolas" w:cs="Consolas"/>
+                <w:sz w:val="19"/>
+                <w:szCs w:val="19"/>
+              </w:rPr>
+              <w:t xml:space="preserve">        condition: service_healthy</w:t>
             </w:r>
           </w:p>
         </w:tc>
@@ -8825,10 +8899,7 @@
         <w:jc w:val="both"/>
       </w:pPr>
       <w:r>
-        <w:rPr>
-          <w:highlight w:val="yellow"/>
-        </w:rPr>
-        <w:t xml:space="preserve">&lt;ĐỐI CHIẾU LẠI VỚI docker-compose.yaml THẬT SAU KHI CÀI ĐẶT REDIS&gt;</w:t>
+        <w:t xml:space="preserve">Dòng exec redis-server trong tệp thật nằm trên một dòng; ở đây ngắt làm hai dòng cho vừa trang.</w:t>
       </w:r>
     </w:p>
     <w:sectPr>

</xml_diff>

<commit_message>
Cap nhat kiem thu tich hop, tai lieu va bao cao cho giai doan 2 va 3 Redis
</commit_message>
<xml_diff>
--- a/bao-cao/Do_an_COMP1313_DongGoiMonolithicThanhDocker_TranHoangDat_49.01.104.030.docx
+++ b/bao-cao/Do_an_COMP1313_DongGoiMonolithicThanhDocker_TranHoangDat_49.01.104.030.docx
@@ -5396,6 +5396,30 @@
         <w:rPr>
           <w:highlight w:val="yellow"/>
         </w:rPr>
+        <w:t xml:space="preserve">Thành phần thứ hai chuyển sang Redis là bước kiểm tra phiên đăng nhập. Với mỗi yêu cầu, ứng dụng đọc lại tài khoản trong PostgreSQL để biết tài khoản còn hoạt động và phiên chưa bị thu hồi. Kết quả hợp lệ được lưu trong Redis 30 giây dưới khóa session:&lt;mã người dùng&gt;, kèm giá trị session_version tại thời điểm kiểm tra; yêu cầu tiếp theo trong khoảng đó đọc từ Redis thay vì truy vấn PostgreSQL. Các thao tác thu hồi phiên, gồm đổi mật khẩu, khóa tài khoản, đổi vai trò và đăng xuất khỏi mọi thiết bị, xóa khóa đó ngay sau khi ghi vào PostgreSQL, nên tài khoản bị khóa không dùng tiếp được phiên đang nằm trong bộ nhớ đệm.</w:t>
+      </w:r>
+    </w:p>
+    <w:p>
+      <w:pPr>
+        <w:spacing w:before="120" w:after="120" w:line="312" w:lineRule="auto"/>
+        <w:jc w:val="both"/>
+      </w:pPr>
+      <w:r>
+        <w:rPr>
+          <w:highlight w:val="yellow"/>
+        </w:rPr>
+        <w:t xml:space="preserve">Thành phần thứ ba là cấu hình mô hình ngôn ngữ lớn mà quản trị viên đổi từ giao diện. Cấu hình được lưu trong PostgreSQL và nạp vào biến môi trường của tiến trình; khi container web chạy hai worker, worker nhận yêu cầu lưu chỉ cập nhật biến môi trường của chính nó. Ứng dụng xử lý bằng cơ chế publish/subscribe của Redis: sau khi lưu, worker đó gửi tên cấu hình vừa đổi lên kênh settings:changed, mỗi worker có một luồng nền lắng nghe kênh và đọc lại giá trị từ PostgreSQL. Tin nhắn chỉ chứa tên cấu hình, không chứa giá trị, vì một số cấu hình là khóa API. Khi mất kết nối tới Redis, luồng lắng nghe thử kết nối lại sau 5 giây và đọc lại toàn bộ cấu hình để bù các tin nhắn đã lỡ. Cả ba thành phần dùng chung qua Redis nên service web được cấu hình chạy hai worker uvicorn bằng biến WEB_CONCURRENCY trong docker-compose.yaml.</w:t>
+      </w:r>
+    </w:p>
+    <w:p>
+      <w:pPr>
+        <w:spacing w:before="120" w:after="120" w:line="312" w:lineRule="auto"/>
+        <w:jc w:val="both"/>
+      </w:pPr>
+      <w:r>
+        <w:rPr>
+          <w:highlight w:val="yellow"/>
+        </w:rPr>
         <w:t xml:space="preserve">Cấu hình service Redis theo cùng nguyên tắc với ba service dữ liệu ở mục 3.4 và 3.5. Redis không mở cổng ra máy chủ; service web gọi tới qua tên redis trong mạng nội bộ, kết nối có mật khẩu đọc từ biến môi trường REDIS_PASSWORD. Healthcheck dùng lệnh redis-cli ping và service web khai báo depends_on với điều kiện service_healthy. Container giới hạn 0.5 CPU và 128 MB RAM; bên trong, Redis đặt maxmemory 64 MB với chính sách allkeys-lru để tự xóa khóa ít dùng khi đầy, không chạm tới giới hạn RAM của container.</w:t>
       </w:r>
     </w:p>
@@ -5644,7 +5668,7 @@
                 <w:szCs w:val="24"/>
                 <w:highlight w:val="yellow"/>
               </w:rPr>
-              <w:t xml:space="preserve">Kết quả kiểm tra phiên đăng nhập, TTL 30 giây</w:t>
+              <w:t xml:space="preserve">Kết quả kiểm tra phiên đăng nhập kèm session_version, TTL 30 giây</w:t>
             </w:r>
           </w:p>
         </w:tc>
@@ -5712,7 +5736,7 @@
                 <w:szCs w:val="24"/>
                 <w:highlight w:val="yellow"/>
               </w:rPr>
-              <w:t xml:space="preserve">Kênh pub/sub báo thay đổi cấu hình</w:t>
+              <w:t xml:space="preserve">Kênh pub/sub settings:changed, chỉ chứa tên cấu hình</w:t>
             </w:r>
           </w:p>
         </w:tc>
@@ -5749,7 +5773,7 @@
         <w:rPr>
           <w:highlight w:val="yellow"/>
         </w:rPr>
-        <w:t xml:space="preserve">&lt;ĐIỀN: GIAI ĐOẠN ĐÃ TRIỂN KHAI THỰC TẾ, VÍ DỤ CHỈ GIAI ĐOẠN 1; XÓA CÁC DÒNG CHƯA LÀM KHỎI BẢNG 3.2&gt;</w:t>
+        <w:t xml:space="preserve">Đồ án đã triển khai cả ba giai đoạn; service web chạy hai worker uvicorn.</w:t>
       </w:r>
     </w:p>
     <w:p>
@@ -6762,6 +6786,18 @@
         <w:rPr>
           <w:highlight w:val="yellow"/>
         </w:rPr>
+        <w:t xml:space="preserve">Bản thiết kế đầu của bộ nhớ đệm phiên đăng nhập đặt session_version vào tên khóa, dựa trên lập luận: thao tác thu hồi phiên luôn tăng session_version, nên không cần xóa khóa cũ. Kiểm thử đơn vị cho thấy lập luận đó sai: cookie cũ vẫn mang session_version cũ và vẫn khớp đúng khóa cũ còn trong Redis, nên tài khoản vừa bị khóa còn dùng được thêm tối đa 30 giây. Cách khắc phục là đổi tên khóa thành session:&lt;mã người dùng&gt;, lưu session_version trong giá trị để so với cookie và xóa khóa ngay trong mỗi thao tác thu hồi phiên. Bộ kiểm thử được bổ sung kịch bản khóa tài khoản và đổi vai trò trong lúc phiên đang nằm trong bộ nhớ đệm.</w:t>
+      </w:r>
+    </w:p>
+    <w:p>
+      <w:pPr>
+        <w:spacing w:before="120" w:after="120" w:line="312" w:lineRule="auto"/>
+        <w:jc w:val="both"/>
+      </w:pPr>
+      <w:r>
+        <w:rPr>
+          <w:highlight w:val="yellow"/>
+        </w:rPr>
         <w:t xml:space="preserve">&lt;ĐIỀN LỖI THẬT GẶP KHI THÊM REDIS VÀ CÁCH KHẮC PHỤC. GỢI Ý LỖI HAY GẶP: (1) thiếu REDIS_PASSWORD trong .env làm docker compose báo lỗi "required variable REDIS_PASSWORD is missing a value" ngay khi đọc cấu hình; (2) healthcheck báo NOAUTH khi redis-cli không có mật khẩu, khắc phục bằng biến REDISCLI_AUTH trong container; (3) mật khẩu có ký tự @ hoặc : làm hỏng chuỗi REDIS_URL, khắc phục bằng mật khẩu chỉ gồm chữ, số, - và _&gt;</w:t>
       </w:r>
     </w:p>
@@ -6901,7 +6937,7 @@
         <w:rPr>
           <w:highlight w:val="yellow"/>
         </w:rPr>
-        <w:t xml:space="preserve">Bảng 4.2 ghi kết quả kiểm thử bộ đếm giới hạn tần suất sau khi chuyển sang Redis, gồm trường hợp container web khởi động lại và trường hợp Redis ngừng hoạt động. Giới hạn đăng nhập của ứng dụng là 20 lượt trong 5 phút cho mỗi địa chỉ IP.</w:t>
+        <w:t xml:space="preserve">Bảng 4.2 ghi kết quả kiểm thử sau khi chuyển bộ đếm giới hạn tần suất và bước kiểm tra phiên đăng nhập sang Redis, gồm trường hợp container web khởi động lại và trường hợp Redis ngừng hoạt động. Giới hạn đăng nhập của ứng dụng là 20 lượt trong 5 phút cho mỗi địa chỉ IP. Các kịch bản được chạy tự động bằng script tests/integration/redis_test.py.</w:t>
       </w:r>
     </w:p>
     <w:p>
@@ -7115,6 +7151,278 @@
                 <w:szCs w:val="24"/>
                 <w:highlight w:val="yellow"/>
               </w:rPr>
+              <w:t xml:space="preserve">Đăng nhập rồi mở trang tài khoản</w:t>
+            </w:r>
+          </w:p>
+        </w:tc>
+        <w:tc>
+          <w:tcPr>
+            <w:tcW w:w="3300" w:type="dxa"/>
+            <w:tcMar>
+              <w:top w:w="80" w:type="dxa"/>
+              <w:left w:w="120" w:type="dxa"/>
+              <w:bottom w:w="80" w:type="dxa"/>
+              <w:right w:w="120" w:type="dxa"/>
+            </w:tcMar>
+            <w:vAlign w:val="center"/>
+          </w:tcPr>
+          <w:p>
+            <w:r>
+              <w:rPr>
+                <w:sz w:val="24"/>
+                <w:szCs w:val="24"/>
+                <w:highlight w:val="yellow"/>
+              </w:rPr>
+              <w:t xml:space="preserve">Redis có khóa session:&lt;mã người dùng&gt;, TTL không quá 30 giây</w:t>
+            </w:r>
+          </w:p>
+        </w:tc>
+        <w:tc>
+          <w:tcPr>
+            <w:tcW w:w="3400" w:type="dxa"/>
+            <w:tcMar>
+              <w:top w:w="80" w:type="dxa"/>
+              <w:left w:w="120" w:type="dxa"/>
+              <w:bottom w:w="80" w:type="dxa"/>
+              <w:right w:w="120" w:type="dxa"/>
+            </w:tcMar>
+            <w:vAlign w:val="center"/>
+          </w:tcPr>
+          <w:p>
+            <w:r>
+              <w:rPr>
+                <w:sz w:val="24"/>
+                <w:szCs w:val="24"/>
+                <w:highlight w:val="yellow"/>
+              </w:rPr>
+              <w:t xml:space="preserve">&lt;ĐIỀN&gt;</w:t>
+            </w:r>
+          </w:p>
+        </w:tc>
+      </w:tr>
+      <w:tr>
+        <w:tc>
+          <w:tcPr>
+            <w:tcW w:w="2600" w:type="dxa"/>
+            <w:tcMar>
+              <w:top w:w="80" w:type="dxa"/>
+              <w:left w:w="120" w:type="dxa"/>
+              <w:bottom w:w="80" w:type="dxa"/>
+              <w:right w:w="120" w:type="dxa"/>
+            </w:tcMar>
+            <w:vAlign w:val="center"/>
+          </w:tcPr>
+          <w:p>
+            <w:r>
+              <w:rPr>
+                <w:sz w:val="24"/>
+                <w:szCs w:val="24"/>
+                <w:highlight w:val="yellow"/>
+              </w:rPr>
+              <w:t xml:space="preserve">Đăng xuất khỏi mọi thiết bị</w:t>
+            </w:r>
+          </w:p>
+        </w:tc>
+        <w:tc>
+          <w:tcPr>
+            <w:tcW w:w="3300" w:type="dxa"/>
+            <w:tcMar>
+              <w:top w:w="80" w:type="dxa"/>
+              <w:left w:w="120" w:type="dxa"/>
+              <w:bottom w:w="80" w:type="dxa"/>
+              <w:right w:w="120" w:type="dxa"/>
+            </w:tcMar>
+            <w:vAlign w:val="center"/>
+          </w:tcPr>
+          <w:p>
+            <w:r>
+              <w:rPr>
+                <w:sz w:val="24"/>
+                <w:szCs w:val="24"/>
+                <w:highlight w:val="yellow"/>
+              </w:rPr>
+              <w:t xml:space="preserve">Khóa session:&lt;mã người dùng&gt; bị xóa ngay</w:t>
+            </w:r>
+          </w:p>
+        </w:tc>
+        <w:tc>
+          <w:tcPr>
+            <w:tcW w:w="3400" w:type="dxa"/>
+            <w:tcMar>
+              <w:top w:w="80" w:type="dxa"/>
+              <w:left w:w="120" w:type="dxa"/>
+              <w:bottom w:w="80" w:type="dxa"/>
+              <w:right w:w="120" w:type="dxa"/>
+            </w:tcMar>
+            <w:vAlign w:val="center"/>
+          </w:tcPr>
+          <w:p>
+            <w:r>
+              <w:rPr>
+                <w:sz w:val="24"/>
+                <w:szCs w:val="24"/>
+                <w:highlight w:val="yellow"/>
+              </w:rPr>
+              <w:t xml:space="preserve">&lt;ĐIỀN&gt;</w:t>
+            </w:r>
+          </w:p>
+        </w:tc>
+      </w:tr>
+      <w:tr>
+        <w:tc>
+          <w:tcPr>
+            <w:tcW w:w="2600" w:type="dxa"/>
+            <w:tcMar>
+              <w:top w:w="80" w:type="dxa"/>
+              <w:left w:w="120" w:type="dxa"/>
+              <w:bottom w:w="80" w:type="dxa"/>
+              <w:right w:w="120" w:type="dxa"/>
+            </w:tcMar>
+            <w:vAlign w:val="center"/>
+          </w:tcPr>
+          <w:p>
+            <w:r>
+              <w:rPr>
+                <w:sz w:val="24"/>
+                <w:szCs w:val="24"/>
+                <w:highlight w:val="yellow"/>
+              </w:rPr>
+              <w:t xml:space="preserve">Đếm tiến trình worker trong container web</w:t>
+            </w:r>
+          </w:p>
+        </w:tc>
+        <w:tc>
+          <w:tcPr>
+            <w:tcW w:w="3300" w:type="dxa"/>
+            <w:tcMar>
+              <w:top w:w="80" w:type="dxa"/>
+              <w:left w:w="120" w:type="dxa"/>
+              <w:bottom w:w="80" w:type="dxa"/>
+              <w:right w:w="120" w:type="dxa"/>
+            </w:tcMar>
+            <w:vAlign w:val="center"/>
+          </w:tcPr>
+          <w:p>
+            <w:r>
+              <w:rPr>
+                <w:sz w:val="24"/>
+                <w:szCs w:val="24"/>
+                <w:highlight w:val="yellow"/>
+              </w:rPr>
+              <w:t xml:space="preserve">Ít nhất 2 worker</w:t>
+            </w:r>
+          </w:p>
+        </w:tc>
+        <w:tc>
+          <w:tcPr>
+            <w:tcW w:w="3400" w:type="dxa"/>
+            <w:tcMar>
+              <w:top w:w="80" w:type="dxa"/>
+              <w:left w:w="120" w:type="dxa"/>
+              <w:bottom w:w="80" w:type="dxa"/>
+              <w:right w:w="120" w:type="dxa"/>
+            </w:tcMar>
+            <w:vAlign w:val="center"/>
+          </w:tcPr>
+          <w:p>
+            <w:r>
+              <w:rPr>
+                <w:sz w:val="24"/>
+                <w:szCs w:val="24"/>
+                <w:highlight w:val="yellow"/>
+              </w:rPr>
+              <w:t xml:space="preserve">&lt;ĐIỀN&gt;</w:t>
+            </w:r>
+          </w:p>
+        </w:tc>
+      </w:tr>
+      <w:tr>
+        <w:tc>
+          <w:tcPr>
+            <w:tcW w:w="2600" w:type="dxa"/>
+            <w:tcMar>
+              <w:top w:w="80" w:type="dxa"/>
+              <w:left w:w="120" w:type="dxa"/>
+              <w:bottom w:w="80" w:type="dxa"/>
+              <w:right w:w="120" w:type="dxa"/>
+            </w:tcMar>
+            <w:vAlign w:val="center"/>
+          </w:tcPr>
+          <w:p>
+            <w:r>
+              <w:rPr>
+                <w:sz w:val="24"/>
+                <w:szCs w:val="24"/>
+                <w:highlight w:val="yellow"/>
+              </w:rPr>
+              <w:t xml:space="preserve">Đổi LLM_TIMEOUT_SECONDS một lần rồi mở trang cấu hình 30 lần</w:t>
+            </w:r>
+          </w:p>
+        </w:tc>
+        <w:tc>
+          <w:tcPr>
+            <w:tcW w:w="3300" w:type="dxa"/>
+            <w:tcMar>
+              <w:top w:w="80" w:type="dxa"/>
+              <w:left w:w="120" w:type="dxa"/>
+              <w:bottom w:w="80" w:type="dxa"/>
+              <w:right w:w="120" w:type="dxa"/>
+            </w:tcMar>
+            <w:vAlign w:val="center"/>
+          </w:tcPr>
+          <w:p>
+            <w:r>
+              <w:rPr>
+                <w:sz w:val="24"/>
+                <w:szCs w:val="24"/>
+                <w:highlight w:val="yellow"/>
+              </w:rPr>
+              <w:t xml:space="preserve">30/30 lần thấy giá trị mới, kể cả khi yêu cầu rơi vào worker khác</w:t>
+            </w:r>
+          </w:p>
+        </w:tc>
+        <w:tc>
+          <w:tcPr>
+            <w:tcW w:w="3400" w:type="dxa"/>
+            <w:tcMar>
+              <w:top w:w="80" w:type="dxa"/>
+              <w:left w:w="120" w:type="dxa"/>
+              <w:bottom w:w="80" w:type="dxa"/>
+              <w:right w:w="120" w:type="dxa"/>
+            </w:tcMar>
+            <w:vAlign w:val="center"/>
+          </w:tcPr>
+          <w:p>
+            <w:r>
+              <w:rPr>
+                <w:sz w:val="24"/>
+                <w:szCs w:val="24"/>
+                <w:highlight w:val="yellow"/>
+              </w:rPr>
+              <w:t xml:space="preserve">&lt;ĐIỀN&gt;</w:t>
+            </w:r>
+          </w:p>
+        </w:tc>
+      </w:tr>
+      <w:tr>
+        <w:tc>
+          <w:tcPr>
+            <w:tcW w:w="2600" w:type="dxa"/>
+            <w:tcMar>
+              <w:top w:w="80" w:type="dxa"/>
+              <w:left w:w="120" w:type="dxa"/>
+              <w:bottom w:w="80" w:type="dxa"/>
+              <w:right w:w="120" w:type="dxa"/>
+            </w:tcMar>
+            <w:vAlign w:val="center"/>
+          </w:tcPr>
+          <w:p>
+            <w:r>
+              <w:rPr>
+                <w:sz w:val="24"/>
+                <w:szCs w:val="24"/>
+                <w:highlight w:val="yellow"/>
+              </w:rPr>
               <w:t xml:space="preserve">Gửi 21 lần đăng nhập sai liên tiếp</w:t>
             </w:r>
           </w:p>
@@ -7529,7 +7837,7 @@
         <w:rPr>
           <w:highlight w:val="yellow"/>
         </w:rPr>
-        <w:t xml:space="preserve">Ngoài yêu cầu gợi ý của đề tài, hệ thống được triển khai lên VPS có tên miền và HTTPS, và bổ sung Redis làm container thứ năm lưu bộ đếm giới hạn tần suất dùng chung.</w:t>
+        <w:t xml:space="preserve">Ngoài yêu cầu gợi ý của đề tài, hệ thống được triển khai lên VPS có tên miền và HTTPS, và bổ sung Redis làm container thứ năm lưu bộ đếm giới hạn tần suất dùng chung, bộ nhớ đệm cho bước kiểm tra phiên đăng nhập và kênh đồng bộ cấu hình, nhờ đó service web chạy được hai worker uvicorn.</w:t>
       </w:r>
     </w:p>
     <w:p>
@@ -7556,7 +7864,7 @@
         <w:rPr>
           <w:highlight w:val="yellow"/>
         </w:rPr>
-        <w:t xml:space="preserve">Hướng phát triển tiếp theo là chạy nhiều worker uvicorn sau khi cấu hình runtime cũng chuyển sang Redis, bổ sung sao lưu tự động theo lịch cho ba kho dữ liệu và tách tác vụ chạy lâu, ví dụ phân tích tệp media bằng mô hình ngôn ngữ lớn, sang một worker riêng nhận tác vụ qua hàng đợi Redis, để tác vụ đó không chiếm luồng xử lý của các yêu cầu khác.</w:t>
+        <w:t xml:space="preserve">Hướng phát triển tiếp theo là chạy nhiều bản sao container web sau một bộ cân bằng tải, bổ sung sao lưu tự động theo lịch cho ba kho dữ liệu và tách tác vụ chạy lâu, ví dụ phân tích tệp media bằng mô hình ngôn ngữ lớn, sang một worker riêng nhận tác vụ qua hàng đợi Redis, để tác vụ đó không chiếm luồng xử lý của các yêu cầu khác.</w:t>
       </w:r>
     </w:p>
     <w:p>

</xml_diff>

<commit_message>
Chi to vang cac cho trong can dien trong bao cao, bo to vang phan noi dung da viet
</commit_message>
<xml_diff>
--- a/bao-cao/Do_an_COMP1313_DongGoiMonolithicThanhDocker_TranHoangDat_49.01.104.030.docx
+++ b/bao-cao/Do_an_COMP1313_DongGoiMonolithicThanhDocker_TranHoangDat_49.01.104.030.docx
@@ -320,7 +320,7 @@
         <w:pageBreakBefore/>
         <w:jc w:val="center"/>
       </w:pPr>
-      <w:bookmarkStart w:id="0" w:name="_Toc241962731"/>
+      <w:bookmarkStart w:id="0" w:name="_Toc242258313"/>
       <w:r>
         <w:lastRenderedPageBreak/>
         <w:t>LỜI CẢM ƠN</w:t>
@@ -369,7 +369,7 @@
         <w:pageBreakBefore/>
         <w:jc w:val="center"/>
       </w:pPr>
-      <w:bookmarkStart w:id="1" w:name="_Toc241962732"/>
+      <w:bookmarkStart w:id="1" w:name="_Toc242258314"/>
       <w:r>
         <w:lastRenderedPageBreak/>
         <w:t>MỤC LỤC</w:t>
@@ -390,7 +390,10 @@
               <w:tab w:val="right" w:leader="dot" w:pos="9345"/>
             </w:tabs>
             <w:rPr>
+              <w:rFonts w:asciiTheme="minorHAnsi" w:eastAsiaTheme="minorEastAsia" w:hAnsiTheme="minorHAnsi" w:cstheme="minorBidi"/>
               <w:noProof/>
+              <w:sz w:val="22"/>
+              <w:szCs w:val="22"/>
             </w:rPr>
           </w:pPr>
           <w:r>
@@ -402,7 +405,7 @@
           <w:r>
             <w:fldChar w:fldCharType="separate"/>
           </w:r>
-          <w:hyperlink w:anchor="_Toc241962731" w:history="1">
+          <w:hyperlink w:anchor="_Toc242258313" w:history="1">
             <w:r>
               <w:rPr>
                 <w:rStyle w:val="Hyperlink"/>
@@ -426,7 +429,7 @@
               <w:rPr>
                 <w:noProof/>
               </w:rPr>
-              <w:instrText xml:space="preserve"> PAGEREF _Toc241962731 \h </w:instrText>
+              <w:instrText xml:space="preserve"> PAGEREF _Toc242258313 \h </w:instrText>
             </w:r>
             <w:r>
               <w:rPr>
@@ -460,10 +463,13 @@
               <w:tab w:val="right" w:leader="dot" w:pos="9345"/>
             </w:tabs>
             <w:rPr>
+              <w:rFonts w:asciiTheme="minorHAnsi" w:eastAsiaTheme="minorEastAsia" w:hAnsiTheme="minorHAnsi" w:cstheme="minorBidi"/>
               <w:noProof/>
+              <w:sz w:val="22"/>
+              <w:szCs w:val="22"/>
             </w:rPr>
           </w:pPr>
-          <w:hyperlink w:anchor="_Toc241962732" w:history="1">
+          <w:hyperlink w:anchor="_Toc242258314" w:history="1">
             <w:r>
               <w:rPr>
                 <w:rStyle w:val="Hyperlink"/>
@@ -487,7 +493,7 @@
               <w:rPr>
                 <w:noProof/>
               </w:rPr>
-              <w:instrText xml:space="preserve"> PAGEREF _Toc241962732 \h </w:instrText>
+              <w:instrText xml:space="preserve"> PAGEREF _Toc242258314 \h </w:instrText>
             </w:r>
             <w:r>
               <w:rPr>
@@ -521,10 +527,13 @@
               <w:tab w:val="right" w:leader="dot" w:pos="9345"/>
             </w:tabs>
             <w:rPr>
+              <w:rFonts w:asciiTheme="minorHAnsi" w:eastAsiaTheme="minorEastAsia" w:hAnsiTheme="minorHAnsi" w:cstheme="minorBidi"/>
               <w:noProof/>
+              <w:sz w:val="22"/>
+              <w:szCs w:val="22"/>
             </w:rPr>
           </w:pPr>
-          <w:hyperlink w:anchor="_Toc241962733" w:history="1">
+          <w:hyperlink w:anchor="_Toc242258315" w:history="1">
             <w:r>
               <w:rPr>
                 <w:rStyle w:val="Hyperlink"/>
@@ -548,7 +557,7 @@
               <w:rPr>
                 <w:noProof/>
               </w:rPr>
-              <w:instrText xml:space="preserve"> PAGEREF _Toc241962733 \h </w:instrText>
+              <w:instrText xml:space="preserve"> PAGEREF _Toc242258315 \h </w:instrText>
             </w:r>
             <w:r>
               <w:rPr>
@@ -582,10 +591,13 @@
               <w:tab w:val="right" w:leader="dot" w:pos="9345"/>
             </w:tabs>
             <w:rPr>
+              <w:rFonts w:asciiTheme="minorHAnsi" w:eastAsiaTheme="minorEastAsia" w:hAnsiTheme="minorHAnsi" w:cstheme="minorBidi"/>
               <w:noProof/>
+              <w:sz w:val="22"/>
+              <w:szCs w:val="22"/>
             </w:rPr>
           </w:pPr>
-          <w:hyperlink w:anchor="_Toc241962734" w:history="1">
+          <w:hyperlink w:anchor="_Toc242258316" w:history="1">
             <w:r>
               <w:rPr>
                 <w:rStyle w:val="Hyperlink"/>
@@ -609,7 +621,7 @@
               <w:rPr>
                 <w:noProof/>
               </w:rPr>
-              <w:instrText xml:space="preserve"> PAGEREF _Toc241962734 \h </w:instrText>
+              <w:instrText xml:space="preserve"> PAGEREF _Toc242258316 \h </w:instrText>
             </w:r>
             <w:r>
               <w:rPr>
@@ -643,10 +655,13 @@
               <w:tab w:val="right" w:leader="dot" w:pos="9345"/>
             </w:tabs>
             <w:rPr>
+              <w:rFonts w:asciiTheme="minorHAnsi" w:eastAsiaTheme="minorEastAsia" w:hAnsiTheme="minorHAnsi" w:cstheme="minorBidi"/>
               <w:noProof/>
+              <w:sz w:val="22"/>
+              <w:szCs w:val="22"/>
             </w:rPr>
           </w:pPr>
-          <w:hyperlink w:anchor="_Toc241962735" w:history="1">
+          <w:hyperlink w:anchor="_Toc242258317" w:history="1">
             <w:r>
               <w:rPr>
                 <w:rStyle w:val="Hyperlink"/>
@@ -670,7 +685,7 @@
               <w:rPr>
                 <w:noProof/>
               </w:rPr>
-              <w:instrText xml:space="preserve"> PAGEREF _Toc241962735 \h </w:instrText>
+              <w:instrText xml:space="preserve"> PAGEREF _Toc242258317 \h </w:instrText>
             </w:r>
             <w:r>
               <w:rPr>
@@ -704,10 +719,13 @@
               <w:tab w:val="right" w:leader="dot" w:pos="9345"/>
             </w:tabs>
             <w:rPr>
+              <w:rFonts w:asciiTheme="minorHAnsi" w:eastAsiaTheme="minorEastAsia" w:hAnsiTheme="minorHAnsi" w:cstheme="minorBidi"/>
               <w:noProof/>
+              <w:sz w:val="22"/>
+              <w:szCs w:val="22"/>
             </w:rPr>
           </w:pPr>
-          <w:hyperlink w:anchor="_Toc241962736" w:history="1">
+          <w:hyperlink w:anchor="_Toc242258318" w:history="1">
             <w:r>
               <w:rPr>
                 <w:rStyle w:val="Hyperlink"/>
@@ -731,7 +749,7 @@
               <w:rPr>
                 <w:noProof/>
               </w:rPr>
-              <w:instrText xml:space="preserve"> PAGEREF _Toc241962736 \h </w:instrText>
+              <w:instrText xml:space="preserve"> PAGEREF _Toc242258318 \h </w:instrText>
             </w:r>
             <w:r>
               <w:rPr>
@@ -765,10 +783,13 @@
               <w:tab w:val="right" w:leader="dot" w:pos="9345"/>
             </w:tabs>
             <w:rPr>
+              <w:rFonts w:asciiTheme="minorHAnsi" w:eastAsiaTheme="minorEastAsia" w:hAnsiTheme="minorHAnsi" w:cstheme="minorBidi"/>
               <w:noProof/>
+              <w:sz w:val="22"/>
+              <w:szCs w:val="22"/>
             </w:rPr>
           </w:pPr>
-          <w:hyperlink w:anchor="_Toc241962737" w:history="1">
+          <w:hyperlink w:anchor="_Toc242258319" w:history="1">
             <w:r>
               <w:rPr>
                 <w:rStyle w:val="Hyperlink"/>
@@ -792,7 +813,7 @@
               <w:rPr>
                 <w:noProof/>
               </w:rPr>
-              <w:instrText xml:space="preserve"> PAGEREF _Toc241962737 \h </w:instrText>
+              <w:instrText xml:space="preserve"> PAGEREF _Toc242258319 \h </w:instrText>
             </w:r>
             <w:r>
               <w:rPr>
@@ -826,10 +847,13 @@
               <w:tab w:val="right" w:leader="dot" w:pos="9345"/>
             </w:tabs>
             <w:rPr>
+              <w:rFonts w:asciiTheme="minorHAnsi" w:eastAsiaTheme="minorEastAsia" w:hAnsiTheme="minorHAnsi" w:cstheme="minorBidi"/>
               <w:noProof/>
+              <w:sz w:val="22"/>
+              <w:szCs w:val="22"/>
             </w:rPr>
           </w:pPr>
-          <w:hyperlink w:anchor="_Toc241962738" w:history="1">
+          <w:hyperlink w:anchor="_Toc242258320" w:history="1">
             <w:r>
               <w:rPr>
                 <w:rStyle w:val="Hyperlink"/>
@@ -853,7 +877,7 @@
               <w:rPr>
                 <w:noProof/>
               </w:rPr>
-              <w:instrText xml:space="preserve"> PAGEREF _Toc241962738 \h </w:instrText>
+              <w:instrText xml:space="preserve"> PAGEREF _Toc242258320 \h </w:instrText>
             </w:r>
             <w:r>
               <w:rPr>
@@ -887,10 +911,13 @@
               <w:tab w:val="right" w:leader="dot" w:pos="9345"/>
             </w:tabs>
             <w:rPr>
+              <w:rFonts w:asciiTheme="minorHAnsi" w:eastAsiaTheme="minorEastAsia" w:hAnsiTheme="minorHAnsi" w:cstheme="minorBidi"/>
               <w:noProof/>
+              <w:sz w:val="22"/>
+              <w:szCs w:val="22"/>
             </w:rPr>
           </w:pPr>
-          <w:hyperlink w:anchor="_Toc241962739" w:history="1">
+          <w:hyperlink w:anchor="_Toc242258321" w:history="1">
             <w:r>
               <w:rPr>
                 <w:rStyle w:val="Hyperlink"/>
@@ -914,7 +941,7 @@
               <w:rPr>
                 <w:noProof/>
               </w:rPr>
-              <w:instrText xml:space="preserve"> PAGEREF _Toc241962739 \h </w:instrText>
+              <w:instrText xml:space="preserve"> PAGEREF _Toc242258321 \h </w:instrText>
             </w:r>
             <w:r>
               <w:rPr>
@@ -948,10 +975,13 @@
               <w:tab w:val="right" w:leader="dot" w:pos="9345"/>
             </w:tabs>
             <w:rPr>
+              <w:rFonts w:asciiTheme="minorHAnsi" w:eastAsiaTheme="minorEastAsia" w:hAnsiTheme="minorHAnsi" w:cstheme="minorBidi"/>
               <w:noProof/>
+              <w:sz w:val="22"/>
+              <w:szCs w:val="22"/>
             </w:rPr>
           </w:pPr>
-          <w:hyperlink w:anchor="_Toc241962740" w:history="1">
+          <w:hyperlink w:anchor="_Toc242258322" w:history="1">
             <w:r>
               <w:rPr>
                 <w:rStyle w:val="Hyperlink"/>
@@ -975,7 +1005,7 @@
               <w:rPr>
                 <w:noProof/>
               </w:rPr>
-              <w:instrText xml:space="preserve"> PAGEREF _Toc241962740 \h </w:instrText>
+              <w:instrText xml:space="preserve"> PAGEREF _Toc242258322 \h </w:instrText>
             </w:r>
             <w:r>
               <w:rPr>
@@ -1009,10 +1039,13 @@
               <w:tab w:val="right" w:leader="dot" w:pos="9345"/>
             </w:tabs>
             <w:rPr>
+              <w:rFonts w:asciiTheme="minorHAnsi" w:eastAsiaTheme="minorEastAsia" w:hAnsiTheme="minorHAnsi" w:cstheme="minorBidi"/>
               <w:noProof/>
+              <w:sz w:val="22"/>
+              <w:szCs w:val="22"/>
             </w:rPr>
           </w:pPr>
-          <w:hyperlink w:anchor="_Toc241962741" w:history="1">
+          <w:hyperlink w:anchor="_Toc242258323" w:history="1">
             <w:r>
               <w:rPr>
                 <w:rStyle w:val="Hyperlink"/>
@@ -1036,7 +1069,7 @@
               <w:rPr>
                 <w:noProof/>
               </w:rPr>
-              <w:instrText xml:space="preserve"> PAGEREF _Toc241962741 \h </w:instrText>
+              <w:instrText xml:space="preserve"> PAGEREF _Toc242258323 \h </w:instrText>
             </w:r>
             <w:r>
               <w:rPr>
@@ -1070,10 +1103,13 @@
               <w:tab w:val="right" w:leader="dot" w:pos="9345"/>
             </w:tabs>
             <w:rPr>
+              <w:rFonts w:asciiTheme="minorHAnsi" w:eastAsiaTheme="minorEastAsia" w:hAnsiTheme="minorHAnsi" w:cstheme="minorBidi"/>
               <w:noProof/>
+              <w:sz w:val="22"/>
+              <w:szCs w:val="22"/>
             </w:rPr>
           </w:pPr>
-          <w:hyperlink w:anchor="_Toc241962742" w:history="1">
+          <w:hyperlink w:anchor="_Toc242258324" w:history="1">
             <w:r>
               <w:rPr>
                 <w:rStyle w:val="Hyperlink"/>
@@ -1097,7 +1133,7 @@
               <w:rPr>
                 <w:noProof/>
               </w:rPr>
-              <w:instrText xml:space="preserve"> PAGEREF _Toc241962742 \h </w:instrText>
+              <w:instrText xml:space="preserve"> PAGEREF _Toc242258324 \h </w:instrText>
             </w:r>
             <w:r>
               <w:rPr>
@@ -1131,10 +1167,13 @@
               <w:tab w:val="right" w:leader="dot" w:pos="9345"/>
             </w:tabs>
             <w:rPr>
+              <w:rFonts w:asciiTheme="minorHAnsi" w:eastAsiaTheme="minorEastAsia" w:hAnsiTheme="minorHAnsi" w:cstheme="minorBidi"/>
               <w:noProof/>
+              <w:sz w:val="22"/>
+              <w:szCs w:val="22"/>
             </w:rPr>
           </w:pPr>
-          <w:hyperlink w:anchor="_Toc241962743" w:history="1">
+          <w:hyperlink w:anchor="_Toc242258325" w:history="1">
             <w:r>
               <w:rPr>
                 <w:rStyle w:val="Hyperlink"/>
@@ -1158,7 +1197,7 @@
               <w:rPr>
                 <w:noProof/>
               </w:rPr>
-              <w:instrText xml:space="preserve"> PAGEREF _Toc241962743 \h </w:instrText>
+              <w:instrText xml:space="preserve"> PAGEREF _Toc242258325 \h </w:instrText>
             </w:r>
             <w:r>
               <w:rPr>
@@ -1192,10 +1231,13 @@
               <w:tab w:val="right" w:leader="dot" w:pos="9345"/>
             </w:tabs>
             <w:rPr>
+              <w:rFonts w:asciiTheme="minorHAnsi" w:eastAsiaTheme="minorEastAsia" w:hAnsiTheme="minorHAnsi" w:cstheme="minorBidi"/>
               <w:noProof/>
+              <w:sz w:val="22"/>
+              <w:szCs w:val="22"/>
             </w:rPr>
           </w:pPr>
-          <w:hyperlink w:anchor="_Toc241962744" w:history="1">
+          <w:hyperlink w:anchor="_Toc242258326" w:history="1">
             <w:r>
               <w:rPr>
                 <w:rStyle w:val="Hyperlink"/>
@@ -1219,7 +1261,7 @@
               <w:rPr>
                 <w:noProof/>
               </w:rPr>
-              <w:instrText xml:space="preserve"> PAGEREF _Toc241962744 \h </w:instrText>
+              <w:instrText xml:space="preserve"> PAGEREF _Toc242258326 \h </w:instrText>
             </w:r>
             <w:r>
               <w:rPr>
@@ -1253,10 +1295,13 @@
               <w:tab w:val="right" w:leader="dot" w:pos="9345"/>
             </w:tabs>
             <w:rPr>
+              <w:rFonts w:asciiTheme="minorHAnsi" w:eastAsiaTheme="minorEastAsia" w:hAnsiTheme="minorHAnsi" w:cstheme="minorBidi"/>
               <w:noProof/>
+              <w:sz w:val="22"/>
+              <w:szCs w:val="22"/>
             </w:rPr>
           </w:pPr>
-          <w:hyperlink w:anchor="_Toc241962745" w:history="1">
+          <w:hyperlink w:anchor="_Toc242258327" w:history="1">
             <w:r>
               <w:rPr>
                 <w:rStyle w:val="Hyperlink"/>
@@ -1280,7 +1325,7 @@
               <w:rPr>
                 <w:noProof/>
               </w:rPr>
-              <w:instrText xml:space="preserve"> PAGEREF _Toc241962745 \h </w:instrText>
+              <w:instrText xml:space="preserve"> PAGEREF _Toc242258327 \h </w:instrText>
             </w:r>
             <w:r>
               <w:rPr>
@@ -1314,10 +1359,13 @@
               <w:tab w:val="right" w:leader="dot" w:pos="9345"/>
             </w:tabs>
             <w:rPr>
+              <w:rFonts w:asciiTheme="minorHAnsi" w:eastAsiaTheme="minorEastAsia" w:hAnsiTheme="minorHAnsi" w:cstheme="minorBidi"/>
               <w:noProof/>
+              <w:sz w:val="22"/>
+              <w:szCs w:val="22"/>
             </w:rPr>
           </w:pPr>
-          <w:hyperlink w:anchor="_Toc241962746" w:history="1">
+          <w:hyperlink w:anchor="_Toc242258328" w:history="1">
             <w:r>
               <w:rPr>
                 <w:rStyle w:val="Hyperlink"/>
@@ -1341,7 +1389,7 @@
               <w:rPr>
                 <w:noProof/>
               </w:rPr>
-              <w:instrText xml:space="preserve"> PAGEREF _Toc241962746 \h </w:instrText>
+              <w:instrText xml:space="preserve"> PAGEREF _Toc242258328 \h </w:instrText>
             </w:r>
             <w:r>
               <w:rPr>
@@ -1375,16 +1423,19 @@
               <w:tab w:val="right" w:leader="dot" w:pos="9345"/>
             </w:tabs>
             <w:rPr>
+              <w:rFonts w:asciiTheme="minorHAnsi" w:eastAsiaTheme="minorEastAsia" w:hAnsiTheme="minorHAnsi" w:cstheme="minorBidi"/>
               <w:noProof/>
+              <w:sz w:val="22"/>
+              <w:szCs w:val="22"/>
             </w:rPr>
           </w:pPr>
-          <w:hyperlink w:anchor="_Toc241962747" w:history="1">
+          <w:hyperlink w:anchor="_Toc242258329" w:history="1">
             <w:r>
               <w:rPr>
                 <w:rStyle w:val="Hyperlink"/>
                 <w:noProof/>
               </w:rPr>
-              <w:t>CHƯƠNG 3.  PHÂN TÍCH VÀ THIẾT KẾ GIẢI PHÁP ĐÓNG GÓI</w:t>
+              <w:t>CHƯƠNG 3.  PHÂN TÍCH VÀ  THIẾT KẾ GIẢI PHÁP ĐÓNG GÓI</w:t>
             </w:r>
             <w:r>
               <w:rPr>
@@ -1402,7 +1453,7 @@
               <w:rPr>
                 <w:noProof/>
               </w:rPr>
-              <w:instrText xml:space="preserve"> PAGEREF _Toc241962747 \h </w:instrText>
+              <w:instrText xml:space="preserve"> PAGEREF _Toc242258329 \h </w:instrText>
             </w:r>
             <w:r>
               <w:rPr>
@@ -1436,10 +1487,13 @@
               <w:tab w:val="right" w:leader="dot" w:pos="9345"/>
             </w:tabs>
             <w:rPr>
+              <w:rFonts w:asciiTheme="minorHAnsi" w:eastAsiaTheme="minorEastAsia" w:hAnsiTheme="minorHAnsi" w:cstheme="minorBidi"/>
               <w:noProof/>
+              <w:sz w:val="22"/>
+              <w:szCs w:val="22"/>
             </w:rPr>
           </w:pPr>
-          <w:hyperlink w:anchor="_Toc241962748" w:history="1">
+          <w:hyperlink w:anchor="_Toc242258330" w:history="1">
             <w:r>
               <w:rPr>
                 <w:rStyle w:val="Hyperlink"/>
@@ -1463,7 +1517,7 @@
               <w:rPr>
                 <w:noProof/>
               </w:rPr>
-              <w:instrText xml:space="preserve"> PAGEREF _Toc241962748 \h </w:instrText>
+              <w:instrText xml:space="preserve"> PAGEREF _Toc242258330 \h </w:instrText>
             </w:r>
             <w:r>
               <w:rPr>
@@ -1497,10 +1551,13 @@
               <w:tab w:val="right" w:leader="dot" w:pos="9345"/>
             </w:tabs>
             <w:rPr>
+              <w:rFonts w:asciiTheme="minorHAnsi" w:eastAsiaTheme="minorEastAsia" w:hAnsiTheme="minorHAnsi" w:cstheme="minorBidi"/>
               <w:noProof/>
+              <w:sz w:val="22"/>
+              <w:szCs w:val="22"/>
             </w:rPr>
           </w:pPr>
-          <w:hyperlink w:anchor="_Toc241962749" w:history="1">
+          <w:hyperlink w:anchor="_Toc242258331" w:history="1">
             <w:r>
               <w:rPr>
                 <w:rStyle w:val="Hyperlink"/>
@@ -1524,7 +1581,7 @@
               <w:rPr>
                 <w:noProof/>
               </w:rPr>
-              <w:instrText xml:space="preserve"> PAGEREF _Toc241962749 \h </w:instrText>
+              <w:instrText xml:space="preserve"> PAGEREF _Toc242258331 \h </w:instrText>
             </w:r>
             <w:r>
               <w:rPr>
@@ -1558,10 +1615,13 @@
               <w:tab w:val="right" w:leader="dot" w:pos="9345"/>
             </w:tabs>
             <w:rPr>
+              <w:rFonts w:asciiTheme="minorHAnsi" w:eastAsiaTheme="minorEastAsia" w:hAnsiTheme="minorHAnsi" w:cstheme="minorBidi"/>
               <w:noProof/>
+              <w:sz w:val="22"/>
+              <w:szCs w:val="22"/>
             </w:rPr>
           </w:pPr>
-          <w:hyperlink w:anchor="_Toc241962750" w:history="1">
+          <w:hyperlink w:anchor="_Toc242258332" w:history="1">
             <w:r>
               <w:rPr>
                 <w:rStyle w:val="Hyperlink"/>
@@ -1585,7 +1645,7 @@
               <w:rPr>
                 <w:noProof/>
               </w:rPr>
-              <w:instrText xml:space="preserve"> PAGEREF _Toc241962750 \h </w:instrText>
+              <w:instrText xml:space="preserve"> PAGEREF _Toc242258332 \h </w:instrText>
             </w:r>
             <w:r>
               <w:rPr>
@@ -1619,10 +1679,13 @@
               <w:tab w:val="right" w:leader="dot" w:pos="9345"/>
             </w:tabs>
             <w:rPr>
+              <w:rFonts w:asciiTheme="minorHAnsi" w:eastAsiaTheme="minorEastAsia" w:hAnsiTheme="minorHAnsi" w:cstheme="minorBidi"/>
               <w:noProof/>
+              <w:sz w:val="22"/>
+              <w:szCs w:val="22"/>
             </w:rPr>
           </w:pPr>
-          <w:hyperlink w:anchor="_Toc241962751" w:history="1">
+          <w:hyperlink w:anchor="_Toc242258333" w:history="1">
             <w:r>
               <w:rPr>
                 <w:rStyle w:val="Hyperlink"/>
@@ -1646,7 +1709,7 @@
               <w:rPr>
                 <w:noProof/>
               </w:rPr>
-              <w:instrText xml:space="preserve"> PAGEREF _Toc241962751 \h </w:instrText>
+              <w:instrText xml:space="preserve"> PAGEREF _Toc242258333 \h </w:instrText>
             </w:r>
             <w:r>
               <w:rPr>
@@ -1680,10 +1743,13 @@
               <w:tab w:val="right" w:leader="dot" w:pos="9345"/>
             </w:tabs>
             <w:rPr>
+              <w:rFonts w:asciiTheme="minorHAnsi" w:eastAsiaTheme="minorEastAsia" w:hAnsiTheme="minorHAnsi" w:cstheme="minorBidi"/>
               <w:noProof/>
+              <w:sz w:val="22"/>
+              <w:szCs w:val="22"/>
             </w:rPr>
           </w:pPr>
-          <w:hyperlink w:anchor="_Toc241962752" w:history="1">
+          <w:hyperlink w:anchor="_Toc242258334" w:history="1">
             <w:r>
               <w:rPr>
                 <w:rStyle w:val="Hyperlink"/>
@@ -1707,7 +1773,7 @@
               <w:rPr>
                 <w:noProof/>
               </w:rPr>
-              <w:instrText xml:space="preserve"> PAGEREF _Toc241962752 \h </w:instrText>
+              <w:instrText xml:space="preserve"> PAGEREF _Toc242258334 \h </w:instrText>
             </w:r>
             <w:r>
               <w:rPr>
@@ -1741,16 +1807,19 @@
               <w:tab w:val="right" w:leader="dot" w:pos="9345"/>
             </w:tabs>
             <w:rPr>
+              <w:rFonts w:asciiTheme="minorHAnsi" w:eastAsiaTheme="minorEastAsia" w:hAnsiTheme="minorHAnsi" w:cstheme="minorBidi"/>
               <w:noProof/>
+              <w:sz w:val="22"/>
+              <w:szCs w:val="22"/>
             </w:rPr>
           </w:pPr>
-          <w:hyperlink w:anchor="_Toc241962753" w:history="1">
+          <w:hyperlink w:anchor="_Toc242258335" w:history="1">
             <w:r>
               <w:rPr>
                 <w:rStyle w:val="Hyperlink"/>
                 <w:noProof/>
               </w:rPr>
-              <w:t>3.6. KẾT CHƯƠNG</w:t>
+              <w:t>3.6. THIẾT KẾ BỔ SUNG REDIS</w:t>
             </w:r>
             <w:r>
               <w:rPr>
@@ -1768,7 +1837,7 @@
               <w:rPr>
                 <w:noProof/>
               </w:rPr>
-              <w:instrText xml:space="preserve"> PAGEREF _Toc241962753 \h </w:instrText>
+              <w:instrText xml:space="preserve"> PAGEREF _Toc242258335 \h </w:instrText>
             </w:r>
             <w:r>
               <w:rPr>
@@ -1786,6 +1855,70 @@
                 <w:noProof/>
               </w:rPr>
               <w:t>15</w:t>
+            </w:r>
+            <w:r>
+              <w:rPr>
+                <w:noProof/>
+              </w:rPr>
+              <w:fldChar w:fldCharType="end"/>
+            </w:r>
+          </w:hyperlink>
+        </w:p>
+        <w:p>
+          <w:pPr>
+            <w:pStyle w:val="TOC2"/>
+            <w:tabs>
+              <w:tab w:val="right" w:leader="dot" w:pos="9345"/>
+            </w:tabs>
+            <w:rPr>
+              <w:rFonts w:asciiTheme="minorHAnsi" w:eastAsiaTheme="minorEastAsia" w:hAnsiTheme="minorHAnsi" w:cstheme="minorBidi"/>
+              <w:noProof/>
+              <w:sz w:val="22"/>
+              <w:szCs w:val="22"/>
+            </w:rPr>
+          </w:pPr>
+          <w:hyperlink w:anchor="_Toc242258336" w:history="1">
+            <w:r>
+              <w:rPr>
+                <w:rStyle w:val="Hyperlink"/>
+                <w:noProof/>
+              </w:rPr>
+              <w:t>3.7. KẾT CHƯƠNG</w:t>
+            </w:r>
+            <w:r>
+              <w:rPr>
+                <w:noProof/>
+              </w:rPr>
+              <w:tab/>
+            </w:r>
+            <w:r>
+              <w:rPr>
+                <w:noProof/>
+              </w:rPr>
+              <w:fldChar w:fldCharType="begin"/>
+            </w:r>
+            <w:r>
+              <w:rPr>
+                <w:noProof/>
+              </w:rPr>
+              <w:instrText xml:space="preserve"> PAGEREF _Toc242258336 \h </w:instrText>
+            </w:r>
+            <w:r>
+              <w:rPr>
+                <w:noProof/>
+              </w:rPr>
+            </w:r>
+            <w:r>
+              <w:rPr>
+                <w:noProof/>
+              </w:rPr>
+              <w:fldChar w:fldCharType="separate"/>
+            </w:r>
+            <w:r>
+              <w:rPr>
+                <w:noProof/>
+              </w:rPr>
+              <w:t>17</w:t>
             </w:r>
             <w:r>
               <w:rPr>
@@ -1802,16 +1935,19 @@
               <w:tab w:val="right" w:leader="dot" w:pos="9345"/>
             </w:tabs>
             <w:rPr>
+              <w:rFonts w:asciiTheme="minorHAnsi" w:eastAsiaTheme="minorEastAsia" w:hAnsiTheme="minorHAnsi" w:cstheme="minorBidi"/>
               <w:noProof/>
+              <w:sz w:val="22"/>
+              <w:szCs w:val="22"/>
             </w:rPr>
           </w:pPr>
-          <w:hyperlink w:anchor="_Toc241962754" w:history="1">
+          <w:hyperlink w:anchor="_Toc242258337" w:history="1">
             <w:r>
               <w:rPr>
                 <w:rStyle w:val="Hyperlink"/>
                 <w:noProof/>
               </w:rPr>
-              <w:t>CHƯƠNG 4.  CÀI ĐẶT, TRIỂN KHAI VÀ KHẮC PHỤC LỖI</w:t>
+              <w:t>CHƯƠNG 4.  CÀI ĐẶT, TRIỂN KHAI  VÀ KHẮC PHỤC LỖI</w:t>
             </w:r>
             <w:r>
               <w:rPr>
@@ -1829,7 +1965,7 @@
               <w:rPr>
                 <w:noProof/>
               </w:rPr>
-              <w:instrText xml:space="preserve"> PAGEREF _Toc241962754 \h </w:instrText>
+              <w:instrText xml:space="preserve"> PAGEREF _Toc242258337 \h </w:instrText>
             </w:r>
             <w:r>
               <w:rPr>
@@ -1846,7 +1982,7 @@
               <w:rPr>
                 <w:noProof/>
               </w:rPr>
-              <w:t>16</w:t>
+              <w:t>18</w:t>
             </w:r>
             <w:r>
               <w:rPr>
@@ -1863,10 +1999,13 @@
               <w:tab w:val="right" w:leader="dot" w:pos="9345"/>
             </w:tabs>
             <w:rPr>
+              <w:rFonts w:asciiTheme="minorHAnsi" w:eastAsiaTheme="minorEastAsia" w:hAnsiTheme="minorHAnsi" w:cstheme="minorBidi"/>
               <w:noProof/>
+              <w:sz w:val="22"/>
+              <w:szCs w:val="22"/>
             </w:rPr>
           </w:pPr>
-          <w:hyperlink w:anchor="_Toc241962755" w:history="1">
+          <w:hyperlink w:anchor="_Toc242258338" w:history="1">
             <w:r>
               <w:rPr>
                 <w:rStyle w:val="Hyperlink"/>
@@ -1890,7 +2029,7 @@
               <w:rPr>
                 <w:noProof/>
               </w:rPr>
-              <w:instrText xml:space="preserve"> PAGEREF _Toc241962755 \h </w:instrText>
+              <w:instrText xml:space="preserve"> PAGEREF _Toc242258338 \h </w:instrText>
             </w:r>
             <w:r>
               <w:rPr>
@@ -1907,7 +2046,7 @@
               <w:rPr>
                 <w:noProof/>
               </w:rPr>
-              <w:t>16</w:t>
+              <w:t>18</w:t>
             </w:r>
             <w:r>
               <w:rPr>
@@ -1924,10 +2063,13 @@
               <w:tab w:val="right" w:leader="dot" w:pos="9345"/>
             </w:tabs>
             <w:rPr>
+              <w:rFonts w:asciiTheme="minorHAnsi" w:eastAsiaTheme="minorEastAsia" w:hAnsiTheme="minorHAnsi" w:cstheme="minorBidi"/>
               <w:noProof/>
+              <w:sz w:val="22"/>
+              <w:szCs w:val="22"/>
             </w:rPr>
           </w:pPr>
-          <w:hyperlink w:anchor="_Toc241962756" w:history="1">
+          <w:hyperlink w:anchor="_Toc242258339" w:history="1">
             <w:r>
               <w:rPr>
                 <w:rStyle w:val="Hyperlink"/>
@@ -1951,7 +2093,7 @@
               <w:rPr>
                 <w:noProof/>
               </w:rPr>
-              <w:instrText xml:space="preserve"> PAGEREF _Toc241962756 \h </w:instrText>
+              <w:instrText xml:space="preserve"> PAGEREF _Toc242258339 \h </w:instrText>
             </w:r>
             <w:r>
               <w:rPr>
@@ -1968,7 +2110,7 @@
               <w:rPr>
                 <w:noProof/>
               </w:rPr>
-              <w:t>16</w:t>
+              <w:t>18</w:t>
             </w:r>
             <w:r>
               <w:rPr>
@@ -1985,10 +2127,13 @@
               <w:tab w:val="right" w:leader="dot" w:pos="9345"/>
             </w:tabs>
             <w:rPr>
+              <w:rFonts w:asciiTheme="minorHAnsi" w:eastAsiaTheme="minorEastAsia" w:hAnsiTheme="minorHAnsi" w:cstheme="minorBidi"/>
               <w:noProof/>
+              <w:sz w:val="22"/>
+              <w:szCs w:val="22"/>
             </w:rPr>
           </w:pPr>
-          <w:hyperlink w:anchor="_Toc241962757" w:history="1">
+          <w:hyperlink w:anchor="_Toc242258340" w:history="1">
             <w:r>
               <w:rPr>
                 <w:rStyle w:val="Hyperlink"/>
@@ -2012,7 +2157,7 @@
               <w:rPr>
                 <w:noProof/>
               </w:rPr>
-              <w:instrText xml:space="preserve"> PAGEREF _Toc241962757 \h </w:instrText>
+              <w:instrText xml:space="preserve"> PAGEREF _Toc242258340 \h </w:instrText>
             </w:r>
             <w:r>
               <w:rPr>
@@ -2029,7 +2174,7 @@
               <w:rPr>
                 <w:noProof/>
               </w:rPr>
-              <w:t>16</w:t>
+              <w:t>18</w:t>
             </w:r>
             <w:r>
               <w:rPr>
@@ -2046,10 +2191,13 @@
               <w:tab w:val="right" w:leader="dot" w:pos="9345"/>
             </w:tabs>
             <w:rPr>
+              <w:rFonts w:asciiTheme="minorHAnsi" w:eastAsiaTheme="minorEastAsia" w:hAnsiTheme="minorHAnsi" w:cstheme="minorBidi"/>
               <w:noProof/>
+              <w:sz w:val="22"/>
+              <w:szCs w:val="22"/>
             </w:rPr>
           </w:pPr>
-          <w:hyperlink w:anchor="_Toc241962758" w:history="1">
+          <w:hyperlink w:anchor="_Toc242258341" w:history="1">
             <w:r>
               <w:rPr>
                 <w:rStyle w:val="Hyperlink"/>
@@ -2073,7 +2221,7 @@
               <w:rPr>
                 <w:noProof/>
               </w:rPr>
-              <w:instrText xml:space="preserve"> PAGEREF _Toc241962758 \h </w:instrText>
+              <w:instrText xml:space="preserve"> PAGEREF _Toc242258341 \h </w:instrText>
             </w:r>
             <w:r>
               <w:rPr>
@@ -2090,7 +2238,7 @@
               <w:rPr>
                 <w:noProof/>
               </w:rPr>
-              <w:t>17</w:t>
+              <w:t>19</w:t>
             </w:r>
             <w:r>
               <w:rPr>
@@ -2107,10 +2255,13 @@
               <w:tab w:val="right" w:leader="dot" w:pos="9345"/>
             </w:tabs>
             <w:rPr>
+              <w:rFonts w:asciiTheme="minorHAnsi" w:eastAsiaTheme="minorEastAsia" w:hAnsiTheme="minorHAnsi" w:cstheme="minorBidi"/>
               <w:noProof/>
+              <w:sz w:val="22"/>
+              <w:szCs w:val="22"/>
             </w:rPr>
           </w:pPr>
-          <w:hyperlink w:anchor="_Toc241962759" w:history="1">
+          <w:hyperlink w:anchor="_Toc242258342" w:history="1">
             <w:r>
               <w:rPr>
                 <w:rStyle w:val="Hyperlink"/>
@@ -2134,7 +2285,7 @@
               <w:rPr>
                 <w:noProof/>
               </w:rPr>
-              <w:instrText xml:space="preserve"> PAGEREF _Toc241962759 \h </w:instrText>
+              <w:instrText xml:space="preserve"> PAGEREF _Toc242258342 \h </w:instrText>
             </w:r>
             <w:r>
               <w:rPr>
@@ -2151,7 +2302,7 @@
               <w:rPr>
                 <w:noProof/>
               </w:rPr>
-              <w:t>17</w:t>
+              <w:t>19</w:t>
             </w:r>
             <w:r>
               <w:rPr>
@@ -2168,10 +2319,13 @@
               <w:tab w:val="right" w:leader="dot" w:pos="9345"/>
             </w:tabs>
             <w:rPr>
+              <w:rFonts w:asciiTheme="minorHAnsi" w:eastAsiaTheme="minorEastAsia" w:hAnsiTheme="minorHAnsi" w:cstheme="minorBidi"/>
               <w:noProof/>
+              <w:sz w:val="22"/>
+              <w:szCs w:val="22"/>
             </w:rPr>
           </w:pPr>
-          <w:hyperlink w:anchor="_Toc241962760" w:history="1">
+          <w:hyperlink w:anchor="_Toc242258343" w:history="1">
             <w:r>
               <w:rPr>
                 <w:rStyle w:val="Hyperlink"/>
@@ -2195,7 +2349,7 @@
               <w:rPr>
                 <w:noProof/>
               </w:rPr>
-              <w:instrText xml:space="preserve"> PAGEREF _Toc241962760 \h </w:instrText>
+              <w:instrText xml:space="preserve"> PAGEREF _Toc242258343 \h </w:instrText>
             </w:r>
             <w:r>
               <w:rPr>
@@ -2212,7 +2366,7 @@
               <w:rPr>
                 <w:noProof/>
               </w:rPr>
-              <w:t>17</w:t>
+              <w:t>19</w:t>
             </w:r>
             <w:r>
               <w:rPr>
@@ -2229,16 +2383,19 @@
               <w:tab w:val="right" w:leader="dot" w:pos="9345"/>
             </w:tabs>
             <w:rPr>
+              <w:rFonts w:asciiTheme="minorHAnsi" w:eastAsiaTheme="minorEastAsia" w:hAnsiTheme="minorHAnsi" w:cstheme="minorBidi"/>
               <w:noProof/>
+              <w:sz w:val="22"/>
+              <w:szCs w:val="22"/>
             </w:rPr>
           </w:pPr>
-          <w:hyperlink w:anchor="_Toc241962761" w:history="1">
+          <w:hyperlink w:anchor="_Toc242258344" w:history="1">
             <w:r>
               <w:rPr>
                 <w:rStyle w:val="Hyperlink"/>
                 <w:noProof/>
               </w:rPr>
-              <w:t>4.4.3. Dòng log healthcheck làm loãng log thật khi có sự cố</w:t>
+              <w:t>4.4.3. Log lỗi tăng nhanh do chưa giới hạn tần suất gọi mô hình</w:t>
             </w:r>
             <w:r>
               <w:rPr>
@@ -2256,7 +2413,7 @@
               <w:rPr>
                 <w:noProof/>
               </w:rPr>
-              <w:instrText xml:space="preserve"> PAGEREF _Toc241962761 \h </w:instrText>
+              <w:instrText xml:space="preserve"> PAGEREF _Toc242258344 \h </w:instrText>
             </w:r>
             <w:r>
               <w:rPr>
@@ -2273,7 +2430,71 @@
               <w:rPr>
                 <w:noProof/>
               </w:rPr>
-              <w:t>17</w:t>
+              <w:t>19</w:t>
+            </w:r>
+            <w:r>
+              <w:rPr>
+                <w:noProof/>
+              </w:rPr>
+              <w:fldChar w:fldCharType="end"/>
+            </w:r>
+          </w:hyperlink>
+        </w:p>
+        <w:p>
+          <w:pPr>
+            <w:pStyle w:val="TOC3"/>
+            <w:tabs>
+              <w:tab w:val="right" w:leader="dot" w:pos="9345"/>
+            </w:tabs>
+            <w:rPr>
+              <w:rFonts w:asciiTheme="minorHAnsi" w:eastAsiaTheme="minorEastAsia" w:hAnsiTheme="minorHAnsi" w:cstheme="minorBidi"/>
+              <w:noProof/>
+              <w:sz w:val="22"/>
+              <w:szCs w:val="22"/>
+            </w:rPr>
+          </w:pPr>
+          <w:hyperlink w:anchor="_Toc242258345" w:history="1">
+            <w:r>
+              <w:rPr>
+                <w:rStyle w:val="Hyperlink"/>
+                <w:noProof/>
+              </w:rPr>
+              <w:t>4.4.4. Lỗi gặp phải khi bổ sung Redis</w:t>
+            </w:r>
+            <w:r>
+              <w:rPr>
+                <w:noProof/>
+              </w:rPr>
+              <w:tab/>
+            </w:r>
+            <w:r>
+              <w:rPr>
+                <w:noProof/>
+              </w:rPr>
+              <w:fldChar w:fldCharType="begin"/>
+            </w:r>
+            <w:r>
+              <w:rPr>
+                <w:noProof/>
+              </w:rPr>
+              <w:instrText xml:space="preserve"> PAGEREF _Toc242258345 \h </w:instrText>
+            </w:r>
+            <w:r>
+              <w:rPr>
+                <w:noProof/>
+              </w:rPr>
+            </w:r>
+            <w:r>
+              <w:rPr>
+                <w:noProof/>
+              </w:rPr>
+              <w:fldChar w:fldCharType="separate"/>
+            </w:r>
+            <w:r>
+              <w:rPr>
+                <w:noProof/>
+              </w:rPr>
+              <w:t>20</w:t>
             </w:r>
             <w:r>
               <w:rPr>
@@ -2290,10 +2511,13 @@
               <w:tab w:val="right" w:leader="dot" w:pos="9345"/>
             </w:tabs>
             <w:rPr>
+              <w:rFonts w:asciiTheme="minorHAnsi" w:eastAsiaTheme="minorEastAsia" w:hAnsiTheme="minorHAnsi" w:cstheme="minorBidi"/>
               <w:noProof/>
+              <w:sz w:val="22"/>
+              <w:szCs w:val="22"/>
             </w:rPr>
           </w:pPr>
-          <w:hyperlink w:anchor="_Toc241962762" w:history="1">
+          <w:hyperlink w:anchor="_Toc242258346" w:history="1">
             <w:r>
               <w:rPr>
                 <w:rStyle w:val="Hyperlink"/>
@@ -2317,7 +2541,7 @@
               <w:rPr>
                 <w:noProof/>
               </w:rPr>
-              <w:instrText xml:space="preserve"> PAGEREF _Toc241962762 \h </w:instrText>
+              <w:instrText xml:space="preserve"> PAGEREF _Toc242258346 \h </w:instrText>
             </w:r>
             <w:r>
               <w:rPr>
@@ -2334,7 +2558,7 @@
               <w:rPr>
                 <w:noProof/>
               </w:rPr>
-              <w:t>18</w:t>
+              <w:t>20</w:t>
             </w:r>
             <w:r>
               <w:rPr>
@@ -2351,16 +2575,19 @@
               <w:tab w:val="right" w:leader="dot" w:pos="9345"/>
             </w:tabs>
             <w:rPr>
+              <w:rFonts w:asciiTheme="minorHAnsi" w:eastAsiaTheme="minorEastAsia" w:hAnsiTheme="minorHAnsi" w:cstheme="minorBidi"/>
               <w:noProof/>
+              <w:sz w:val="22"/>
+              <w:szCs w:val="22"/>
             </w:rPr>
           </w:pPr>
-          <w:hyperlink w:anchor="_Toc241962763" w:history="1">
+          <w:hyperlink w:anchor="_Toc242258347" w:history="1">
             <w:r>
               <w:rPr>
                 <w:rStyle w:val="Hyperlink"/>
                 <w:noProof/>
               </w:rPr>
-              <w:t>4.6. TRIỂN KHAI LÊN VPS CÓ TÊN MIỀN</w:t>
+              <w:t>4.6. BỔ SUNG REDIS VÀO HỆ THỐNG</w:t>
             </w:r>
             <w:r>
               <w:rPr>
@@ -2378,7 +2605,7 @@
               <w:rPr>
                 <w:noProof/>
               </w:rPr>
-              <w:instrText xml:space="preserve"> PAGEREF _Toc241962763 \h </w:instrText>
+              <w:instrText xml:space="preserve"> PAGEREF _Toc242258347 \h </w:instrText>
             </w:r>
             <w:r>
               <w:rPr>
@@ -2395,7 +2622,7 @@
               <w:rPr>
                 <w:noProof/>
               </w:rPr>
-              <w:t>18</w:t>
+              <w:t>21</w:t>
             </w:r>
             <w:r>
               <w:rPr>
@@ -2412,16 +2639,19 @@
               <w:tab w:val="right" w:leader="dot" w:pos="9345"/>
             </w:tabs>
             <w:rPr>
+              <w:rFonts w:asciiTheme="minorHAnsi" w:eastAsiaTheme="minorEastAsia" w:hAnsiTheme="minorHAnsi" w:cstheme="minorBidi"/>
               <w:noProof/>
+              <w:sz w:val="22"/>
+              <w:szCs w:val="22"/>
             </w:rPr>
           </w:pPr>
-          <w:hyperlink w:anchor="_Toc241962764" w:history="1">
+          <w:hyperlink w:anchor="_Toc242258348" w:history="1">
             <w:r>
               <w:rPr>
                 <w:rStyle w:val="Hyperlink"/>
                 <w:noProof/>
               </w:rPr>
-              <w:t>4.7. KẾT CHƯƠNG</w:t>
+              <w:t>4.7. TRIỂN KHAI LÊN VPS CÓ TÊN MIỀN</w:t>
             </w:r>
             <w:r>
               <w:rPr>
@@ -2439,7 +2669,7 @@
               <w:rPr>
                 <w:noProof/>
               </w:rPr>
-              <w:instrText xml:space="preserve"> PAGEREF _Toc241962764 \h </w:instrText>
+              <w:instrText xml:space="preserve"> PAGEREF _Toc242258348 \h </w:instrText>
             </w:r>
             <w:r>
               <w:rPr>
@@ -2456,7 +2686,71 @@
               <w:rPr>
                 <w:noProof/>
               </w:rPr>
-              <w:t>19</w:t>
+              <w:t>22</w:t>
+            </w:r>
+            <w:r>
+              <w:rPr>
+                <w:noProof/>
+              </w:rPr>
+              <w:fldChar w:fldCharType="end"/>
+            </w:r>
+          </w:hyperlink>
+        </w:p>
+        <w:p>
+          <w:pPr>
+            <w:pStyle w:val="TOC2"/>
+            <w:tabs>
+              <w:tab w:val="right" w:leader="dot" w:pos="9345"/>
+            </w:tabs>
+            <w:rPr>
+              <w:rFonts w:asciiTheme="minorHAnsi" w:eastAsiaTheme="minorEastAsia" w:hAnsiTheme="minorHAnsi" w:cstheme="minorBidi"/>
+              <w:noProof/>
+              <w:sz w:val="22"/>
+              <w:szCs w:val="22"/>
+            </w:rPr>
+          </w:pPr>
+          <w:hyperlink w:anchor="_Toc242258349" w:history="1">
+            <w:r>
+              <w:rPr>
+                <w:rStyle w:val="Hyperlink"/>
+                <w:noProof/>
+              </w:rPr>
+              <w:t>4.8. KẾT CHƯƠNG</w:t>
+            </w:r>
+            <w:r>
+              <w:rPr>
+                <w:noProof/>
+              </w:rPr>
+              <w:tab/>
+            </w:r>
+            <w:r>
+              <w:rPr>
+                <w:noProof/>
+              </w:rPr>
+              <w:fldChar w:fldCharType="begin"/>
+            </w:r>
+            <w:r>
+              <w:rPr>
+                <w:noProof/>
+              </w:rPr>
+              <w:instrText xml:space="preserve"> PAGEREF _Toc242258349 \h </w:instrText>
+            </w:r>
+            <w:r>
+              <w:rPr>
+                <w:noProof/>
+              </w:rPr>
+            </w:r>
+            <w:r>
+              <w:rPr>
+                <w:noProof/>
+              </w:rPr>
+              <w:fldChar w:fldCharType="separate"/>
+            </w:r>
+            <w:r>
+              <w:rPr>
+                <w:noProof/>
+              </w:rPr>
+              <w:t>22</w:t>
             </w:r>
             <w:r>
               <w:rPr>
@@ -2473,10 +2767,13 @@
               <w:tab w:val="right" w:leader="dot" w:pos="9345"/>
             </w:tabs>
             <w:rPr>
+              <w:rFonts w:asciiTheme="minorHAnsi" w:eastAsiaTheme="minorEastAsia" w:hAnsiTheme="minorHAnsi" w:cstheme="minorBidi"/>
               <w:noProof/>
+              <w:sz w:val="22"/>
+              <w:szCs w:val="22"/>
             </w:rPr>
           </w:pPr>
-          <w:hyperlink w:anchor="_Toc241962765" w:history="1">
+          <w:hyperlink w:anchor="_Toc242258350" w:history="1">
             <w:r>
               <w:rPr>
                 <w:rStyle w:val="Hyperlink"/>
@@ -2500,7 +2797,7 @@
               <w:rPr>
                 <w:noProof/>
               </w:rPr>
-              <w:instrText xml:space="preserve"> PAGEREF _Toc241962765 \h </w:instrText>
+              <w:instrText xml:space="preserve"> PAGEREF _Toc242258350 \h </w:instrText>
             </w:r>
             <w:r>
               <w:rPr>
@@ -2517,7 +2814,7 @@
               <w:rPr>
                 <w:noProof/>
               </w:rPr>
-              <w:t>20</w:t>
+              <w:t>23</w:t>
             </w:r>
             <w:r>
               <w:rPr>
@@ -2534,10 +2831,13 @@
               <w:tab w:val="right" w:leader="dot" w:pos="9345"/>
             </w:tabs>
             <w:rPr>
+              <w:rFonts w:asciiTheme="minorHAnsi" w:eastAsiaTheme="minorEastAsia" w:hAnsiTheme="minorHAnsi" w:cstheme="minorBidi"/>
               <w:noProof/>
+              <w:sz w:val="22"/>
+              <w:szCs w:val="22"/>
             </w:rPr>
           </w:pPr>
-          <w:hyperlink w:anchor="_Toc241962766" w:history="1">
+          <w:hyperlink w:anchor="_Toc242258351" w:history="1">
             <w:r>
               <w:rPr>
                 <w:rStyle w:val="Hyperlink"/>
@@ -2561,7 +2861,7 @@
               <w:rPr>
                 <w:noProof/>
               </w:rPr>
-              <w:instrText xml:space="preserve"> PAGEREF _Toc241962766 \h </w:instrText>
+              <w:instrText xml:space="preserve"> PAGEREF _Toc242258351 \h </w:instrText>
             </w:r>
             <w:r>
               <w:rPr>
@@ -2578,7 +2878,7 @@
               <w:rPr>
                 <w:noProof/>
               </w:rPr>
-              <w:t>21</w:t>
+              <w:t>24</w:t>
             </w:r>
             <w:r>
               <w:rPr>
@@ -2595,10 +2895,13 @@
               <w:tab w:val="right" w:leader="dot" w:pos="9345"/>
             </w:tabs>
             <w:rPr>
+              <w:rFonts w:asciiTheme="minorHAnsi" w:eastAsiaTheme="minorEastAsia" w:hAnsiTheme="minorHAnsi" w:cstheme="minorBidi"/>
               <w:noProof/>
+              <w:sz w:val="22"/>
+              <w:szCs w:val="22"/>
             </w:rPr>
           </w:pPr>
-          <w:hyperlink w:anchor="_Toc241962767" w:history="1">
+          <w:hyperlink w:anchor="_Toc242258352" w:history="1">
             <w:r>
               <w:rPr>
                 <w:rStyle w:val="Hyperlink"/>
@@ -2622,7 +2925,7 @@
               <w:rPr>
                 <w:noProof/>
               </w:rPr>
-              <w:instrText xml:space="preserve"> PAGEREF _Toc241962767 \h </w:instrText>
+              <w:instrText xml:space="preserve"> PAGEREF _Toc242258352 \h </w:instrText>
             </w:r>
             <w:r>
               <w:rPr>
@@ -2639,7 +2942,7 @@
               <w:rPr>
                 <w:noProof/>
               </w:rPr>
-              <w:t>22</w:t>
+              <w:t>25</w:t>
             </w:r>
             <w:r>
               <w:rPr>
@@ -2656,10 +2959,13 @@
               <w:tab w:val="right" w:leader="dot" w:pos="9345"/>
             </w:tabs>
             <w:rPr>
+              <w:rFonts w:asciiTheme="minorHAnsi" w:eastAsiaTheme="minorEastAsia" w:hAnsiTheme="minorHAnsi" w:cstheme="minorBidi"/>
               <w:noProof/>
+              <w:sz w:val="22"/>
+              <w:szCs w:val="22"/>
             </w:rPr>
           </w:pPr>
-          <w:hyperlink w:anchor="_Toc241962768" w:history="1">
+          <w:hyperlink w:anchor="_Toc242258353" w:history="1">
             <w:r>
               <w:rPr>
                 <w:rStyle w:val="Hyperlink"/>
@@ -2683,7 +2989,7 @@
               <w:rPr>
                 <w:noProof/>
               </w:rPr>
-              <w:instrText xml:space="preserve"> PAGEREF _Toc241962768 \h </w:instrText>
+              <w:instrText xml:space="preserve"> PAGEREF _Toc242258353 \h </w:instrText>
             </w:r>
             <w:r>
               <w:rPr>
@@ -2700,7 +3006,7 @@
               <w:rPr>
                 <w:noProof/>
               </w:rPr>
-              <w:t>22</w:t>
+              <w:t>25</w:t>
             </w:r>
             <w:r>
               <w:rPr>
@@ -2717,10 +3023,13 @@
               <w:tab w:val="right" w:leader="dot" w:pos="9345"/>
             </w:tabs>
             <w:rPr>
+              <w:rFonts w:asciiTheme="minorHAnsi" w:eastAsiaTheme="minorEastAsia" w:hAnsiTheme="minorHAnsi" w:cstheme="minorBidi"/>
               <w:noProof/>
+              <w:sz w:val="22"/>
+              <w:szCs w:val="22"/>
             </w:rPr>
           </w:pPr>
-          <w:hyperlink w:anchor="_Toc241962769" w:history="1">
+          <w:hyperlink w:anchor="_Toc242258354" w:history="1">
             <w:r>
               <w:rPr>
                 <w:rStyle w:val="Hyperlink"/>
@@ -2744,7 +3053,7 @@
               <w:rPr>
                 <w:noProof/>
               </w:rPr>
-              <w:instrText xml:space="preserve"> PAGEREF _Toc241962769 \h </w:instrText>
+              <w:instrText xml:space="preserve"> PAGEREF _Toc242258354 \h </w:instrText>
             </w:r>
             <w:r>
               <w:rPr>
@@ -2761,7 +3070,7 @@
               <w:rPr>
                 <w:noProof/>
               </w:rPr>
-              <w:t>22</w:t>
+              <w:t>25</w:t>
             </w:r>
             <w:r>
               <w:rPr>
@@ -2778,10 +3087,13 @@
               <w:tab w:val="right" w:leader="dot" w:pos="9345"/>
             </w:tabs>
             <w:rPr>
+              <w:rFonts w:asciiTheme="minorHAnsi" w:eastAsiaTheme="minorEastAsia" w:hAnsiTheme="minorHAnsi" w:cstheme="minorBidi"/>
               <w:noProof/>
+              <w:sz w:val="22"/>
+              <w:szCs w:val="22"/>
             </w:rPr>
           </w:pPr>
-          <w:hyperlink w:anchor="_Toc241962770" w:history="1">
+          <w:hyperlink w:anchor="_Toc242258355" w:history="1">
             <w:r>
               <w:rPr>
                 <w:rStyle w:val="Hyperlink"/>
@@ -2805,7 +3117,7 @@
               <w:rPr>
                 <w:noProof/>
               </w:rPr>
-              <w:instrText xml:space="preserve"> PAGEREF _Toc241962770 \h </w:instrText>
+              <w:instrText xml:space="preserve"> PAGEREF _Toc242258355 \h </w:instrText>
             </w:r>
             <w:r>
               <w:rPr>
@@ -2822,7 +3134,71 @@
               <w:rPr>
                 <w:noProof/>
               </w:rPr>
-              <w:t>23</w:t>
+              <w:t>26</w:t>
+            </w:r>
+            <w:r>
+              <w:rPr>
+                <w:noProof/>
+              </w:rPr>
+              <w:fldChar w:fldCharType="end"/>
+            </w:r>
+          </w:hyperlink>
+        </w:p>
+        <w:p>
+          <w:pPr>
+            <w:pStyle w:val="TOC2"/>
+            <w:tabs>
+              <w:tab w:val="right" w:leader="dot" w:pos="9345"/>
+            </w:tabs>
+            <w:rPr>
+              <w:rFonts w:asciiTheme="minorHAnsi" w:eastAsiaTheme="minorEastAsia" w:hAnsiTheme="minorHAnsi" w:cstheme="minorBidi"/>
+              <w:noProof/>
+              <w:sz w:val="22"/>
+              <w:szCs w:val="22"/>
+            </w:rPr>
+          </w:pPr>
+          <w:hyperlink w:anchor="_Toc242258356" w:history="1">
+            <w:r>
+              <w:rPr>
+                <w:rStyle w:val="Hyperlink"/>
+                <w:noProof/>
+              </w:rPr>
+              <w:t>D. CẤU HÌNH SERVICE REDIS TRONG DOCKER-COMPOSE.YAML</w:t>
+            </w:r>
+            <w:r>
+              <w:rPr>
+                <w:noProof/>
+              </w:rPr>
+              <w:tab/>
+            </w:r>
+            <w:r>
+              <w:rPr>
+                <w:noProof/>
+              </w:rPr>
+              <w:fldChar w:fldCharType="begin"/>
+            </w:r>
+            <w:r>
+              <w:rPr>
+                <w:noProof/>
+              </w:rPr>
+              <w:instrText xml:space="preserve"> PAGEREF _Toc242258356 \h </w:instrText>
+            </w:r>
+            <w:r>
+              <w:rPr>
+                <w:noProof/>
+              </w:rPr>
+            </w:r>
+            <w:r>
+              <w:rPr>
+                <w:noProof/>
+              </w:rPr>
+              <w:fldChar w:fldCharType="separate"/>
+            </w:r>
+            <w:r>
+              <w:rPr>
+                <w:noProof/>
+              </w:rPr>
+              <w:t>26</w:t>
             </w:r>
             <w:r>
               <w:rPr>
@@ -2845,7 +3221,7 @@
         <w:pageBreakBefore/>
         <w:jc w:val="center"/>
       </w:pPr>
-      <w:bookmarkStart w:id="2" w:name="_Toc241962733"/>
+      <w:bookmarkStart w:id="2" w:name="_Toc242258315"/>
       <w:r>
         <w:lastRenderedPageBreak/>
         <w:t>DANH MỤC CÁC KÝ HIỆU VÀ CHỮ VIẾT TẮT</w:t>
@@ -3235,7 +3611,7 @@
                 <w:sz w:val="24"/>
                 <w:szCs w:val="24"/>
               </w:rPr>
-              <w:t xml:space="preserve">DNS</w:t>
+              <w:t>DNS</w:t>
             </w:r>
           </w:p>
         </w:tc>
@@ -3256,7 +3632,7 @@
                 <w:sz w:val="24"/>
                 <w:szCs w:val="24"/>
               </w:rPr>
-              <w:t xml:space="preserve">Domain Name System</w:t>
+              <w:t>Domain Name System</w:t>
             </w:r>
           </w:p>
         </w:tc>
@@ -3277,7 +3653,7 @@
                 <w:sz w:val="24"/>
                 <w:szCs w:val="24"/>
               </w:rPr>
-              <w:t xml:space="preserve">Hệ thống phân giải tên miền</w:t>
+              <w:t>Hệ thống phân giải tên miền</w:t>
             </w:r>
           </w:p>
         </w:tc>
@@ -3300,7 +3676,7 @@
                 <w:sz w:val="24"/>
                 <w:szCs w:val="24"/>
               </w:rPr>
-              <w:t xml:space="preserve">HTTPS</w:t>
+              <w:t>HTTPS</w:t>
             </w:r>
           </w:p>
         </w:tc>
@@ -3321,7 +3697,7 @@
                 <w:sz w:val="24"/>
                 <w:szCs w:val="24"/>
               </w:rPr>
-              <w:t xml:space="preserve">Hypertext Transfer Protocol Secure</w:t>
+              <w:t>Hypertext Transfer Protocol Secure</w:t>
             </w:r>
           </w:p>
         </w:tc>
@@ -3342,7 +3718,7 @@
                 <w:sz w:val="24"/>
                 <w:szCs w:val="24"/>
               </w:rPr>
-              <w:t xml:space="preserve">Giao thức HTTP có mã hóa TLS</w:t>
+              <w:t>Giao thức HTTP có mã hóa TLS</w:t>
             </w:r>
           </w:p>
         </w:tc>
@@ -3430,7 +3806,7 @@
                 <w:sz w:val="24"/>
                 <w:szCs w:val="24"/>
               </w:rPr>
-              <w:t xml:space="preserve">JSON</w:t>
+              <w:t>JSON</w:t>
             </w:r>
           </w:p>
         </w:tc>
@@ -3451,7 +3827,7 @@
                 <w:sz w:val="24"/>
                 <w:szCs w:val="24"/>
               </w:rPr>
-              <w:t xml:space="preserve">JavaScript Object Notation</w:t>
+              <w:t>JavaScript Object Notation</w:t>
             </w:r>
           </w:p>
         </w:tc>
@@ -3472,7 +3848,7 @@
                 <w:sz w:val="24"/>
                 <w:szCs w:val="24"/>
               </w:rPr>
-              <w:t xml:space="preserve">Định dạng dữ liệu dạng văn bản</w:t>
+              <w:t>Định dạng dữ liệu dạng văn bản</w:t>
             </w:r>
           </w:p>
         </w:tc>
@@ -3755,7 +4131,7 @@
                 <w:sz w:val="24"/>
                 <w:szCs w:val="24"/>
               </w:rPr>
-              <w:t xml:space="preserve">PID</w:t>
+              <w:t>PID</w:t>
             </w:r>
           </w:p>
         </w:tc>
@@ -3776,7 +4152,7 @@
                 <w:sz w:val="24"/>
                 <w:szCs w:val="24"/>
               </w:rPr>
-              <w:t xml:space="preserve">Process Identifier</w:t>
+              <w:t>Process Identifier</w:t>
             </w:r>
           </w:p>
         </w:tc>
@@ -3797,7 +4173,7 @@
                 <w:sz w:val="24"/>
                 <w:szCs w:val="24"/>
               </w:rPr>
-              <w:t xml:space="preserve">Mã định danh tiến trình</w:t>
+              <w:t>Mã định danh tiến trình</w:t>
             </w:r>
           </w:p>
         </w:tc>
@@ -3819,9 +4195,8 @@
               <w:rPr>
                 <w:sz w:val="24"/>
                 <w:szCs w:val="24"/>
-                <w:highlight w:val="yellow"/>
-              </w:rPr>
-              <w:t xml:space="preserve">TTL</w:t>
+              </w:rPr>
+              <w:t>TTL</w:t>
             </w:r>
           </w:p>
         </w:tc>
@@ -3841,9 +4216,8 @@
               <w:rPr>
                 <w:sz w:val="24"/>
                 <w:szCs w:val="24"/>
-                <w:highlight w:val="yellow"/>
-              </w:rPr>
-              <w:t xml:space="preserve">Time To Live</w:t>
+              </w:rPr>
+              <w:t>Time To Live</w:t>
             </w:r>
           </w:p>
         </w:tc>
@@ -3863,9 +4237,8 @@
               <w:rPr>
                 <w:sz w:val="24"/>
                 <w:szCs w:val="24"/>
-                <w:highlight w:val="yellow"/>
-              </w:rPr>
-              <w:t xml:space="preserve">Thời gian tồn tại của một khóa trước khi tự hết hạn</w:t>
+              </w:rPr>
+              <w:t>Thời gian tồn tại của một khóa trước khi tự hết hạn</w:t>
             </w:r>
           </w:p>
         </w:tc>
@@ -4007,7 +4380,7 @@
         <w:pageBreakBefore/>
         <w:jc w:val="center"/>
       </w:pPr>
-      <w:bookmarkStart w:id="3" w:name="_Toc241962734"/>
+      <w:bookmarkStart w:id="3" w:name="_Toc242258316"/>
       <w:r>
         <w:lastRenderedPageBreak/>
         <w:t>DANH MỤC CÁC HÌNH VẼ VÀ BẢNG BIỂU</w:t>
@@ -4119,14 +4492,10 @@
         <w:rPr>
           <w:b/>
           <w:bCs/>
-          <w:highlight w:val="yellow"/>
         </w:rPr>
-        <w:t xml:space="preserve">Hình 4.4.</w:t>
-      </w:r>
-      <w:r>
-        <w:rPr>
-          <w:highlight w:val="yellow"/>
-        </w:rPr>
+        <w:t>Hình 4.4.</w:t>
+      </w:r>
+      <w:r>
         <w:t xml:space="preserve"> Trạng thái năm container sau khi bổ sung Redis</w:t>
       </w:r>
     </w:p>
@@ -4155,14 +4524,10 @@
         <w:rPr>
           <w:b/>
           <w:bCs/>
-          <w:highlight w:val="yellow"/>
         </w:rPr>
-        <w:t xml:space="preserve">Bảng 3.2.</w:t>
-      </w:r>
-      <w:r>
-        <w:rPr>
-          <w:highlight w:val="yellow"/>
-        </w:rPr>
+        <w:t>Bảng 3.2.</w:t>
+      </w:r>
+      <w:r>
         <w:t xml:space="preserve"> Vai trò của Redis theo từng giai đoạn triển khai</w:t>
       </w:r>
     </w:p>
@@ -4191,14 +4556,10 @@
         <w:rPr>
           <w:b/>
           <w:bCs/>
-          <w:highlight w:val="yellow"/>
         </w:rPr>
-        <w:t xml:space="preserve">Bảng 4.2.</w:t>
-      </w:r>
-      <w:r>
-        <w:rPr>
-          <w:highlight w:val="yellow"/>
-        </w:rPr>
+        <w:t>Bảng 4.2.</w:t>
+      </w:r>
+      <w:r>
         <w:t xml:space="preserve"> Kết quả kiểm thử sau khi bổ sung Redis</w:t>
       </w:r>
     </w:p>
@@ -4208,7 +4569,7 @@
         <w:pageBreakBefore/>
         <w:jc w:val="center"/>
       </w:pPr>
-      <w:bookmarkStart w:id="4" w:name="_Toc241962735"/>
+      <w:bookmarkStart w:id="4" w:name="_Toc242258317"/>
       <w:r>
         <w:lastRenderedPageBreak/>
         <w:t>MỞ ĐẦU</w:t>
@@ -4233,10 +4594,7 @@
         <w:t xml:space="preserve">Đồ án chọn ứng dụng web monolithic có sẵn mang tên Research Document Workspace, một hệ thống quản lý tài liệu nghiên cứu viết bằng Python/FastAPI, có cơ sở dữ liệu quan hệ, cơ sở dữ liệu tài liệu và kho lưu trữ đối tượng đi kèm, để đóng gói bằng Docker. Nội dung chính gồm viết Dockerfile cho ứng dụng, dùng Docker Compose liên kết ứng dụng với các dịch vụ dữ liệu, thực hiện build và run trên máy thực nghiệm, ghi nhận các lỗi môi trường gặp phải cùng cách khắc phục, </w:t>
       </w:r>
       <w:r>
-        <w:rPr>
-          <w:highlight w:val="yellow"/>
-        </w:rPr>
-        <w:t xml:space="preserve">triển khai lên một VPS có tên miền và bổ sung Redis làm kho lưu trạng thái dùng chung giữa các tiến trình ứng dụng.</w:t>
+        <w:t>triển khai lên một VPS có tên miền và bổ sung Redis làm kho lưu trạng thái dùng chung giữa các tiến trình ứng dụng.</w:t>
       </w:r>
     </w:p>
     <w:p>
@@ -4245,22 +4603,16 @@
         <w:jc w:val="both"/>
       </w:pPr>
       <w:r>
-        <w:t xml:space="preserve">Đồ án gồm bốn chương. Chương 1 trình bày tổng quan đề tài và mô tả sơ lược mã nguồn được chọn. Chương 2 tóm tắt cơ sở lý thuyết về điện toán đám mây, container hóa và một số khái niệm liên quan đến dữ liệu, mô hình ngôn ngữ lớn được dùng trong ứng dụng. Chương 3 phân tích kiến trúc ứng dụng và thiết kế giải pháp đóng gói</w:t>
-      </w:r>
-      <w:r>
-        <w:rPr>
-          <w:highlight w:val="yellow"/>
-        </w:rPr>
-        <w:t xml:space="preserve">, kèm thiết kế bổ sung service Redis</w:t>
-      </w:r>
-      <w:r>
-        <w:t xml:space="preserve">. Chương 4 trình bày quá trình cài đặt, các lỗi môi trường gặp phải trong lúc build/run cùng cách khắc phục</w:t>
-      </w:r>
-      <w:r>
-        <w:rPr>
-          <w:highlight w:val="yellow"/>
-        </w:rPr>
-        <w:t xml:space="preserve">, kết quả bổ sung Redis, kết quả triển khai lên VPS</w:t>
+        <w:t>Đồ án gồm bốn chương. Chương 1 trình bày tổng quan đề tài và mô tả sơ lược mã nguồn được chọn. Chương 2 tóm tắt cơ sở lý thuyết về điện toán đám mây, container hóa và một số khái niệm liên quan đến dữ liệu, mô hình ngôn ngữ lớn được dùng trong ứng dụng. Chương 3 phân tích kiến trúc ứng dụng và thiết kế giải pháp đóng gói</w:t>
+      </w:r>
+      <w:r>
+        <w:t>, kèm thiết kế bổ sung service Redis</w:t>
+      </w:r>
+      <w:r>
+        <w:t>. Chương 4 trình bày quá trình cài đặt, các lỗi môi trường gặp phải trong lúc build/run cùng cách khắc phục</w:t>
+      </w:r>
+      <w:r>
+        <w:t>, kết quả bổ sung Redis, kết quả triển khai lên VPS</w:t>
       </w:r>
       <w:r>
         <w:t xml:space="preserve"> và kết quả thực nghiệm.</w:t>
@@ -4272,7 +4624,7 @@
         <w:pageBreakBefore/>
         <w:jc w:val="center"/>
       </w:pPr>
-      <w:bookmarkStart w:id="5" w:name="_Toc241962736"/>
+      <w:bookmarkStart w:id="5" w:name="_Toc242258318"/>
       <w:r>
         <w:rPr>
           <w:sz w:val="32"/>
@@ -4291,7 +4643,7 @@
         <w:pStyle w:val="Heading2"/>
         <w:spacing w:before="240" w:after="120" w:line="312" w:lineRule="auto"/>
       </w:pPr>
-      <w:bookmarkStart w:id="6" w:name="_Toc241962737"/>
+      <w:bookmarkStart w:id="6" w:name="_Toc242258319"/>
       <w:r>
         <w:t>1.1. GIỚI THIỆU</w:t>
       </w:r>
@@ -4329,7 +4681,7 @@
         <w:pStyle w:val="Heading2"/>
         <w:spacing w:before="240" w:after="120" w:line="312" w:lineRule="auto"/>
       </w:pPr>
-      <w:bookmarkStart w:id="7" w:name="_Toc241962738"/>
+      <w:bookmarkStart w:id="7" w:name="_Toc242258320"/>
       <w:r>
         <w:t>1.2. MỤC TIÊU VÀ PHẠM VI ĐỀ TÀI</w:t>
       </w:r>
@@ -4362,22 +4714,16 @@
         <w:t xml:space="preserve">Phạm vi đồ án giới hạn ở tầng hạ tầng và vận hành: viết Dockerfile, viết tệp Docker Compose liên kết dịch vụ, cấu hình biến môi trường, kiểm thử build/run trên máy thực nghiệm và </w:t>
       </w:r>
       <w:r>
-        <w:rPr>
-          <w:highlight w:val="yellow"/>
-        </w:rPr>
-        <w:t xml:space="preserve">triển khai lên VPS có tên miền</w:t>
-      </w:r>
-      <w:r>
-        <w:t xml:space="preserve">. Đồ án không phát triển thêm tính năng nghiệp vụ cho ứng dụng được chọn, vì trọng tâm môn học là điện toán đám mây; các chỉnh sửa trong mã nguồn chỉ phục vụ vận hành, gồm giới hạn tần suất gọi và kiểm tra biến môi trường bí mật lúc khởi động</w:t>
-      </w:r>
-      <w:r>
-        <w:rPr>
-          <w:highlight w:val="yellow"/>
-        </w:rPr>
-        <w:t xml:space="preserve">, cùng phần kết nối tới service Redis</w:t>
-      </w:r>
-      <w:r>
-        <w:t xml:space="preserve">.</w:t>
+        <w:t>triển khai lên VPS có tên miền</w:t>
+      </w:r>
+      <w:r>
+        <w:t>. Đồ án không phát triển thêm tính năng nghiệp vụ cho ứng dụng được chọn, vì trọng tâm môn học là điện toán đám mây; các chỉnh sửa trong mã nguồn chỉ phục vụ vận hành, gồm giới hạn tần suất gọi và kiểm tra biến môi trường bí mật lúc khởi động</w:t>
+      </w:r>
+      <w:r>
+        <w:t>, cùng phần kết nối tới service Redis</w:t>
+      </w:r>
+      <w:r>
+        <w:t>.</w:t>
       </w:r>
     </w:p>
     <w:p>
@@ -4385,7 +4731,7 @@
         <w:pStyle w:val="Heading2"/>
         <w:spacing w:before="240" w:after="120" w:line="312" w:lineRule="auto"/>
       </w:pPr>
-      <w:bookmarkStart w:id="8" w:name="_Toc241962739"/>
+      <w:bookmarkStart w:id="8" w:name="_Toc242258321"/>
       <w:r>
         <w:t>1.3. KHẢO SÁT MÃ NGUỒN ĐƯỢC CHỌN</w:t>
       </w:r>
@@ -4406,11 +4752,11 @@
         <w:jc w:val="both"/>
       </w:pPr>
       <w:r>
-        <w:t xml:space="preserve">Về cấu trúc, mã nguồn chia thành bốn tầng rõ rệt trong cùng một tiến trình: tầng định tuyến (api/, ui/) nhận yêu cầu HTTP; tầng dịch vụ (services/) xử lý nghiệp vụ, kiểm tra điều kiện và gọi mô hình ngôn ngữ lớn khi cần; tầng truy cập dữ liệu (repositories/) thao tác trực tiếp với từng kho lưu trữ; và các client kết nối PostgreSQL, MongoDB, MinIO. Đây là ví dụ </w:t>
+        <w:t xml:space="preserve">Về cấu trúc, mã nguồn chia thành bốn tầng rõ rệt trong cùng một tiến trình: tầng định tuyến (api/, ui/) nhận yêu cầu HTTP; tầng dịch vụ (services/) xử lý nghiệp vụ, kiểm tra điều kiện và gọi mô hình ngôn ngữ lớn khi cần; tầng truy cập dữ liệu (repositories/) thao tác trực tiếp </w:t>
       </w:r>
       <w:r>
         <w:lastRenderedPageBreak/>
-        <w:t>điển hình của một ứng dụng monolithic nhiều tầng: một mã nguồn, một tiến trình, nhưng vẫn giữ ranh giới rõ giữa các tầng bên trong, đặc điểm thuận lợi khi tách phần hạ tầng ra đóng gói riêng mà không phải viết lại ứng dụng.</w:t>
+        <w:t>với từng kho lưu trữ; và các client kết nối PostgreSQL, MongoDB, MinIO. Đây là ví dụ điển hình của một ứng dụng monolithic nhiều tầng: một mã nguồn, một tiến trình, nhưng vẫn giữ ranh giới rõ giữa các tầng bên trong, đặc điểm thuận lợi khi tách phần hạ tầng ra đóng gói riêng mà không phải viết lại ứng dụng.</w:t>
       </w:r>
     </w:p>
     <w:p>
@@ -4498,7 +4844,7 @@
         <w:pStyle w:val="Heading2"/>
         <w:spacing w:before="240" w:after="120" w:line="312" w:lineRule="auto"/>
       </w:pPr>
-      <w:bookmarkStart w:id="9" w:name="_Toc241962740"/>
+      <w:bookmarkStart w:id="9" w:name="_Toc242258322"/>
       <w:r>
         <w:t>1.4. KẾT CHƯƠNG</w:t>
       </w:r>
@@ -4519,7 +4865,7 @@
         <w:pageBreakBefore/>
         <w:jc w:val="center"/>
       </w:pPr>
-      <w:bookmarkStart w:id="10" w:name="_Toc241962741"/>
+      <w:bookmarkStart w:id="10" w:name="_Toc242258323"/>
       <w:r>
         <w:rPr>
           <w:sz w:val="32"/>
@@ -4538,7 +4884,7 @@
         <w:pStyle w:val="Heading2"/>
         <w:spacing w:before="240" w:after="120" w:line="312" w:lineRule="auto"/>
       </w:pPr>
-      <w:bookmarkStart w:id="11" w:name="_Toc241962742"/>
+      <w:bookmarkStart w:id="11" w:name="_Toc242258324"/>
       <w:r>
         <w:t>2.1. ĐIỆN TOÁN ĐÁM MÂY</w:t>
       </w:r>
@@ -4567,7 +4913,7 @@
         <w:pStyle w:val="Heading2"/>
         <w:spacing w:before="240" w:after="120" w:line="312" w:lineRule="auto"/>
       </w:pPr>
-      <w:bookmarkStart w:id="12" w:name="_Toc241962743"/>
+      <w:bookmarkStart w:id="12" w:name="_Toc242258325"/>
       <w:r>
         <w:t>2.2. CONTAINER HÓA VÀ DOCKER</w:t>
       </w:r>
@@ -4663,7 +5009,7 @@
         <w:pStyle w:val="Heading2"/>
         <w:spacing w:before="240" w:after="120" w:line="312" w:lineRule="auto"/>
       </w:pPr>
-      <w:bookmarkStart w:id="13" w:name="_Toc241962744"/>
+      <w:bookmarkStart w:id="13" w:name="_Toc242258326"/>
       <w:r>
         <w:t>2.3. DỮ LIỆU CÓ CẤU TRÚC, BÁN CẤU TRÚC VÀ PHI CẤU TRÚC</w:t>
       </w:r>
@@ -4692,7 +5038,7 @@
         <w:pStyle w:val="Heading2"/>
         <w:spacing w:before="240" w:after="120" w:line="312" w:lineRule="auto"/>
       </w:pPr>
-      <w:bookmarkStart w:id="14" w:name="_Toc241962745"/>
+      <w:bookmarkStart w:id="14" w:name="_Toc242258327"/>
       <w:r>
         <w:t>2.4. MÔ HÌNH NGÔN NGỮ LỚN TRONG ỨNG DỤNG WEB</w:t>
       </w:r>
@@ -4722,7 +5068,7 @@
         <w:pStyle w:val="Heading2"/>
         <w:spacing w:before="240" w:after="120" w:line="312" w:lineRule="auto"/>
       </w:pPr>
-      <w:bookmarkStart w:id="15" w:name="_Toc241962746"/>
+      <w:bookmarkStart w:id="15" w:name="_Toc242258328"/>
       <w:r>
         <w:t>2.5. KẾT CHƯƠNG</w:t>
       </w:r>
@@ -4743,7 +5089,7 @@
         <w:pageBreakBefore/>
         <w:jc w:val="center"/>
       </w:pPr>
-      <w:bookmarkStart w:id="16" w:name="_Toc241962747"/>
+      <w:bookmarkStart w:id="16" w:name="_Toc242258329"/>
       <w:r>
         <w:rPr>
           <w:sz w:val="32"/>
@@ -4768,7 +5114,7 @@
         <w:pStyle w:val="Heading2"/>
         <w:spacing w:before="240" w:after="120" w:line="312" w:lineRule="auto"/>
       </w:pPr>
-      <w:bookmarkStart w:id="17" w:name="_Toc241962748"/>
+      <w:bookmarkStart w:id="17" w:name="_Toc242258330"/>
       <w:r>
         <w:t>3.1. GIỚI THIỆU</w:t>
       </w:r>
@@ -4788,7 +5134,7 @@
         <w:pStyle w:val="Heading2"/>
         <w:spacing w:before="240" w:after="120" w:line="312" w:lineRule="auto"/>
       </w:pPr>
-      <w:bookmarkStart w:id="18" w:name="_Toc241962749"/>
+      <w:bookmarkStart w:id="18" w:name="_Toc242258331"/>
       <w:r>
         <w:t>3.2. PHÂN TÍCH KIẾN TRÚC ỨNG DỤNG TRƯỚC KHI ĐÓNG GÓI</w:t>
       </w:r>
@@ -5189,7 +5535,7 @@
         <w:pStyle w:val="Heading2"/>
         <w:spacing w:before="240" w:after="120" w:line="312" w:lineRule="auto"/>
       </w:pPr>
-      <w:bookmarkStart w:id="19" w:name="_Toc241962750"/>
+      <w:bookmarkStart w:id="19" w:name="_Toc242258332"/>
       <w:r>
         <w:t>3.3. THIẾT KẾ DOCKERFILE</w:t>
       </w:r>
@@ -5219,7 +5565,7 @@
         <w:pStyle w:val="Heading2"/>
         <w:spacing w:before="240" w:after="120" w:line="312" w:lineRule="auto"/>
       </w:pPr>
-      <w:bookmarkStart w:id="20" w:name="_Toc241962751"/>
+      <w:bookmarkStart w:id="20" w:name="_Toc242258333"/>
       <w:r>
         <w:t>3.4. THIẾT KẾ LIÊN KẾT DỊCH VỤ BẰNG DOCKER COMPOSE</w:t>
       </w:r>
@@ -5327,7 +5673,7 @@
         <w:pStyle w:val="Heading2"/>
         <w:spacing w:before="240" w:after="120" w:line="312" w:lineRule="auto"/>
       </w:pPr>
-      <w:bookmarkStart w:id="21" w:name="_Toc241962752"/>
+      <w:bookmarkStart w:id="21" w:name="_Toc242258334"/>
       <w:r>
         <w:t>3.5. THIẾT KẾ CẤU HÌNH VÀ BẢO MẬT</w:t>
       </w:r>
@@ -5348,7 +5694,7 @@
         <w:jc w:val="both"/>
       </w:pPr>
       <w:r>
-        <w:t xml:space="preserve">PostgreSQL và MongoDB không mở cổng nào ra máy chủ, chỉ nhận kết nối trong mạng nội bộ do Docker Compose tạo ra; MinIO và service web chỉ mở cổng ra địa chỉ 127.0.0.1 của máy chủ, nghĩa là chỉ tiến trình chạy ngay trên máy chủ đó mới gọi trực tiếp được. Service web gọi các dịch vụ dữ liệu qua tên service trong mạng nội bộ chứ không qua cổng đã mở. Khi triển khai lên VPS thật ở chương 4, chỉ hai cổng 80 và 443 của reverse proxy xử lý HTTPS được mở ra Internet; ứng dụng và các dịch vụ dữ liệu vẫn nằm trong mạng nội bộ của Docker Compose, không truy cập trực tiếp được từ bên ngoài.</w:t>
+        <w:t>PostgreSQL và MongoDB không mở cổng nào ra máy chủ, chỉ nhận kết nối trong mạng nội bộ do Docker Compose tạo ra; MinIO và service web chỉ mở cổng ra địa chỉ 127.0.0.1 của máy chủ, nghĩa là chỉ tiến trình chạy ngay trên máy chủ đó mới gọi trực tiếp được. Service web gọi các dịch vụ dữ liệu qua tên service trong mạng nội bộ chứ không qua cổng đã mở. Khi triển khai lên VPS thật ở chương 4, chỉ hai cổng 80 và 443 của reverse proxy xử lý HTTPS được mở ra Internet; ứng dụng và các dịch vụ dữ liệu vẫn nằm trong mạng nội bộ của Docker Compose, không truy cập trực tiếp được từ bên ngoài.</w:t>
       </w:r>
     </w:p>
     <w:p>
@@ -5356,12 +5702,11 @@
         <w:pStyle w:val="Heading2"/>
         <w:spacing w:before="240" w:after="120" w:line="312" w:lineRule="auto"/>
       </w:pPr>
-      <w:r>
-        <w:rPr>
-          <w:highlight w:val="yellow"/>
-        </w:rPr>
-        <w:t xml:space="preserve">3.6. THIẾT KẾ BỔ SUNG REDIS</w:t>
-      </w:r>
+      <w:bookmarkStart w:id="22" w:name="_Toc242258335"/>
+      <w:r>
+        <w:t>3.6. THIẾT KẾ BỔ SUNG REDIS</w:t>
+      </w:r>
+      <w:bookmarkEnd w:id="22"/>
     </w:p>
     <w:p>
       <w:pPr>
@@ -5369,10 +5714,11 @@
         <w:jc w:val="both"/>
       </w:pPr>
       <w:r>
-        <w:rPr>
-          <w:highlight w:val="yellow"/>
-        </w:rPr>
-        <w:t xml:space="preserve">Khảo sát mã nguồn cho thấy hai thành phần của ứng dụng giữ trạng thái ngay trong bộ nhớ của tiến trình web: bộ đếm giới hạn tần suất cho các biểu mẫu đăng nhập, đăng ký, quên mật khẩu và endpoint hỏi đáp, cùng cấu hình mô hình ngôn ngữ lớn mà quản trị viên đổi từ giao diện. Hai thành phần đó chỉ đúng khi container web chạy một tiến trình uvicorn duy nhất. Khi tăng số worker hoặc số bản sao container, mỗi tiến trình giữ một bộ đếm riêng nên giới hạn thực tế bị nhân lên theo số tiến trình; bộ đếm cũng trở về 0 mỗi lần container web khởi động lại.</w:t>
+        <w:t xml:space="preserve">Khảo sát mã nguồn cho thấy hai thành phần của ứng dụng giữ trạng thái ngay trong bộ nhớ của tiến trình web: bộ đếm giới hạn tần suất cho các biểu mẫu đăng nhập, đăng ký, quên mật khẩu và endpoint hỏi đáp, cùng cấu hình mô hình ngôn ngữ lớn mà quản trị viên đổi từ giao diện. Hai thành phần đó chỉ đúng khi container web chạy một tiến trình uvicorn </w:t>
+      </w:r>
+      <w:r>
+        <w:lastRenderedPageBreak/>
+        <w:t>duy nhất. Khi tăng số worker hoặc số bản sao container, mỗi tiến trình giữ một bộ đếm riêng nên giới hạn thực tế bị nhân lên theo số tiến trình; bộ đếm cũng trở về 0 mỗi lần container web khởi động lại.</w:t>
       </w:r>
     </w:p>
     <w:p>
@@ -5381,10 +5727,34 @@
         <w:jc w:val="both"/>
       </w:pPr>
       <w:r>
+        <w:t xml:space="preserve">Redis là kho dữ liệu </w:t>
+      </w:r>
+      <w:r>
         <w:rPr>
-          <w:highlight w:val="yellow"/>
+          <w:lang w:val="en-US"/>
         </w:rPr>
-        <w:t xml:space="preserve">Redis là kho dữ liệu khóa–giá trị lưu trên bộ nhớ, có sẵn các cấu trúc như chuỗi, danh sách, tập hợp có thứ tự và cơ chế tự hết hạn khóa (TTL). Đồ án bổ sung Redis thành service thứ năm trong Docker Compose để lưu trạng thái dùng chung giữa các tiến trình web. Bộ đếm giới hạn tần suất chuyển sang tập hợp có thứ tự của Redis theo cơ chế cửa sổ trượt: mỗi lượt gọi thêm một phần tử mang mốc thời gian, các phần tử cũ hơn độ dài cửa sổ bị xóa, số phần tử còn lại là số lượt đã dùng trong cửa sổ.</w:t>
+        <w:t>K</w:t>
+      </w:r>
+      <w:r>
+        <w:t>hóa</w:t>
+      </w:r>
+      <w:r>
+        <w:rPr>
+          <w:lang w:val="en-US"/>
+        </w:rPr>
+        <w:t>-G</w:t>
+      </w:r>
+      <w:r>
+        <w:t>iá trị</w:t>
+      </w:r>
+      <w:r>
+        <w:rPr>
+          <w:lang w:val="en-US"/>
+        </w:rPr>
+        <w:t xml:space="preserve"> (Key-Value)</w:t>
+      </w:r>
+      <w:r>
+        <w:t xml:space="preserve"> lưu trên bộ nhớ, có sẵn các cấu trúc như chuỗi, danh sách, tập hợp có thứ tự và cơ chế tự hết hạn khóa (TTL). Đồ án bổ sung Redis thành service thứ năm trong Docker Compose để lưu trạng thái dùng chung giữa các tiến trình web. Bộ đếm giới hạn tần suất chuyển sang tập hợp có thứ tự của Redis theo cơ chế cửa sổ trượt: mỗi lượt gọi thêm một phần tử mang mốc thời gian, các phần tử cũ hơn độ dài cửa sổ bị xóa, số phần tử còn lại là số lượt đã dùng trong cửa sổ.</w:t>
       </w:r>
     </w:p>
     <w:p>
@@ -5393,10 +5763,7 @@
         <w:jc w:val="both"/>
       </w:pPr>
       <w:r>
-        <w:rPr>
-          <w:highlight w:val="yellow"/>
-        </w:rPr>
-        <w:t xml:space="preserve">Thành phần thứ hai chuyển sang Redis là bước kiểm tra phiên đăng nhập. Với mỗi yêu cầu, ứng dụng đọc lại tài khoản trong PostgreSQL để biết tài khoản còn hoạt động và phiên chưa bị thu hồi. Kết quả hợp lệ được lưu trong Redis 30 giây dưới khóa session:&lt;mã người dùng&gt;, kèm giá trị session_version tại thời điểm kiểm tra; yêu cầu tiếp theo trong khoảng đó đọc từ Redis thay vì truy vấn PostgreSQL. Các thao tác thu hồi phiên, gồm đổi mật khẩu, khóa tài khoản, đổi vai trò và đăng xuất khỏi mọi thiết bị, xóa khóa đó ngay sau khi ghi vào PostgreSQL, nên tài khoản bị khóa không dùng tiếp được phiên đang nằm trong bộ nhớ đệm.</w:t>
+        <w:t>Thành phần thứ hai chuyển sang Redis là bước kiểm tra phiên đăng nhập. Với mỗi yêu cầu, ứng dụng đọc lại tài khoản trong PostgreSQL để biết tài khoản còn hoạt động và phiên chưa bị thu hồi. Kết quả hợp lệ được lưu trong Redis 30 giây dưới khóa session:&lt;mã người dùng&gt;, kèm giá trị session_version tại thời điểm kiểm tra; yêu cầu tiếp theo trong khoảng đó đọc từ Redis thay vì truy vấn PostgreSQL. Các thao tác thu hồi phiên, gồm đổi mật khẩu, khóa tài khoản, đổi vai trò và đăng xuất khỏi mọi thiết bị, xóa khóa đó ngay sau khi ghi vào PostgreSQL, nên tài khoản bị khóa không dùng tiếp được phiên đang nằm trong bộ nhớ đệm.</w:t>
       </w:r>
     </w:p>
     <w:p>
@@ -5405,10 +5772,7 @@
         <w:jc w:val="both"/>
       </w:pPr>
       <w:r>
-        <w:rPr>
-          <w:highlight w:val="yellow"/>
-        </w:rPr>
-        <w:t xml:space="preserve">Thành phần thứ ba là cấu hình mô hình ngôn ngữ lớn mà quản trị viên đổi từ giao diện. Cấu hình được lưu trong PostgreSQL và nạp vào biến môi trường của tiến trình; khi container web chạy hai worker, worker nhận yêu cầu lưu chỉ cập nhật biến môi trường của chính nó. Ứng dụng xử lý bằng cơ chế publish/subscribe của Redis: sau khi lưu, worker đó gửi tên cấu hình vừa đổi lên kênh settings:changed, mỗi worker có một luồng nền lắng nghe kênh và đọc lại giá trị từ PostgreSQL. Tin nhắn chỉ chứa tên cấu hình, không chứa giá trị, vì một số cấu hình là khóa API. Khi mất kết nối tới Redis, luồng lắng nghe thử kết nối lại sau 5 giây và đọc lại toàn bộ cấu hình để bù các tin nhắn đã lỡ. Cả ba thành phần dùng chung qua Redis nên service web được cấu hình chạy hai worker uvicorn bằng biến WEB_CONCURRENCY trong docker-compose.yaml.</w:t>
+        <w:t>Thành phần thứ ba là cấu hình mô hình ngôn ngữ lớn mà quản trị viên đổi từ giao diện. Cấu hình được lưu trong PostgreSQL và nạp vào biến môi trường của tiến trình; khi container web chạy hai worker, worker nhận yêu cầu lưu chỉ cập nhật biến môi trường của chính nó. Ứng dụng xử lý bằng cơ chế publish/subscribe của Redis: sau khi lưu, worker đó gửi tên cấu hình vừa đổi lên kênh settings:changed, mỗi worker có một luồng nền lắng nghe kênh và đọc lại giá trị từ PostgreSQL. Tin nhắn chỉ chứa tên cấu hình, không chứa giá trị, vì một số cấu hình là khóa API. Khi mất kết nối tới Redis, luồng lắng nghe thử kết nối lại sau 5 giây và đọc lại toàn bộ cấu hình để bù các tin nhắn đã lỡ. Cả ba thành phần dùng chung qua Redis nên service web được cấu hình chạy hai worker uvicorn bằng biến WEB_CONCURRENCY trong docker-compose.yaml.</w:t>
       </w:r>
     </w:p>
     <w:p>
@@ -5417,10 +5781,7 @@
         <w:jc w:val="both"/>
       </w:pPr>
       <w:r>
-        <w:rPr>
-          <w:highlight w:val="yellow"/>
-        </w:rPr>
-        <w:t xml:space="preserve">Cấu hình service Redis theo cùng nguyên tắc với ba service dữ liệu ở mục 3.4 và 3.5. Redis không mở cổng ra máy chủ; service web gọi tới qua tên redis trong mạng nội bộ, kết nối có mật khẩu đọc từ biến môi trường REDIS_PASSWORD. Healthcheck dùng lệnh redis-cli ping và service web khai báo depends_on với điều kiện service_healthy. Container giới hạn 0.5 CPU và 128 MB RAM; bên trong, Redis đặt maxmemory 64 MB với chính sách allkeys-lru để tự xóa khóa ít dùng khi đầy, không chạm tới giới hạn RAM của container.</w:t>
+        <w:t>Cấu hình service Redis theo cùng nguyên tắc với ba service dữ liệu ở mục 3.4 và 3.5. Redis không mở cổng ra máy chủ; service web gọi tới qua tên redis trong mạng nội bộ, kết nối có mật khẩu đọc từ biến môi trường REDIS_PASSWORD. Healthcheck dùng lệnh redis-cli ping và service web khai báo depends_on với điều kiện service_healthy. Container giới hạn 0.5 CPU và 128 MB RAM; bên trong, Redis đặt maxmemory 64 MB với chính sách allkeys-lru để tự xóa khóa ít dùng khi đầy, không chạm tới giới hạn RAM của container.</w:t>
       </w:r>
     </w:p>
     <w:p>
@@ -5429,10 +5790,8 @@
         <w:jc w:val="both"/>
       </w:pPr>
       <w:r>
-        <w:rPr>
-          <w:highlight w:val="yellow"/>
-        </w:rPr>
-        <w:t xml:space="preserve">Khác với PostgreSQL, MongoDB và MinIO, Redis không gắn named volume và tắt ghi dữ liệu xuống đĩa, vì dữ liệu trong Redis chỉ gồm bộ đếm và bộ nhớ đệm, tạo lại được bất cứ lúc nào. Mất dữ liệu Redis không làm mất dữ liệu người dùng, và Redis không nằm trong quy trình sao lưu. Khi Redis ngừng hoạt động, ứng dụng bắt lỗi kết nối, ghi log cảnh báo và quay về bộ đếm trong bộ nhớ tiến trình như trước khi có Redis; endpoint /health/ready báo trạng thái Redis để quan sát nhưng không đánh dấu ứng dụng chưa sẵn sàng chỉ vì Redis lỗi.</w:t>
+        <w:lastRenderedPageBreak/>
+        <w:t>Khác với PostgreSQL, MongoDB và MinIO, Redis không gắn named volume và tắt ghi dữ liệu xuống đĩa, vì dữ liệu trong Redis chỉ gồm bộ đếm và bộ nhớ đệm, tạo lại được bất cứ lúc nào. Mất dữ liệu Redis không làm mất dữ liệu người dùng, và Redis không nằm trong quy trình sao lưu. Khi Redis ngừng hoạt động, ứng dụng bắt lỗi kết nối, ghi log cảnh báo và quay về bộ đếm trong bộ nhớ tiến trình như trước khi có Redis; endpoint /health/ready báo trạng thái Redis để quan sát nhưng không đánh dấu ứng dụng chưa sẵn sàng chỉ vì Redis lỗi.</w:t>
       </w:r>
     </w:p>
     <w:p>
@@ -5443,15 +5802,11 @@
         <w:rPr>
           <w:b/>
           <w:bCs/>
-          <w:highlight w:val="yellow"/>
         </w:rPr>
         <w:t xml:space="preserve">Bảng 3.2: </w:t>
       </w:r>
       <w:r>
-        <w:rPr>
-          <w:highlight w:val="yellow"/>
-        </w:rPr>
-        <w:t xml:space="preserve">Vai trò của Redis theo từng giai đoạn triển khai</w:t>
+        <w:t>Vai trò của Redis theo từng giai đoạn triển khai</w:t>
       </w:r>
     </w:p>
     <w:tbl>
@@ -5500,7 +5855,7 @@
                 <w:sz w:val="24"/>
                 <w:szCs w:val="24"/>
               </w:rPr>
-              <w:t xml:space="preserve">Giai đoạn</w:t>
+              <w:t>Giai đoạn</w:t>
             </w:r>
           </w:p>
         </w:tc>
@@ -5527,7 +5882,7 @@
                 <w:sz w:val="24"/>
                 <w:szCs w:val="24"/>
               </w:rPr>
-              <w:t xml:space="preserve">Dữ liệu lưu trong Redis</w:t>
+              <w:t>Dữ liệu lưu trong Redis</w:t>
             </w:r>
           </w:p>
         </w:tc>
@@ -5554,7 +5909,7 @@
                 <w:sz w:val="24"/>
                 <w:szCs w:val="24"/>
               </w:rPr>
-              <w:t xml:space="preserve">Thay cho</w:t>
+              <w:t>Thay cho</w:t>
             </w:r>
           </w:p>
         </w:tc>
@@ -5576,9 +5931,8 @@
               <w:rPr>
                 <w:sz w:val="24"/>
                 <w:szCs w:val="24"/>
-                <w:highlight w:val="yellow"/>
-              </w:rPr>
-              <w:t xml:space="preserve">1</w:t>
+              </w:rPr>
+              <w:t>1</w:t>
             </w:r>
           </w:p>
         </w:tc>
@@ -5598,9 +5952,8 @@
               <w:rPr>
                 <w:sz w:val="24"/>
                 <w:szCs w:val="24"/>
-                <w:highlight w:val="yellow"/>
-              </w:rPr>
-              <w:t xml:space="preserve">Bộ đếm giới hạn tần suất (tập hợp có thứ tự, có TTL)</w:t>
+              </w:rPr>
+              <w:t>Bộ đếm giới hạn tần suất (tập hợp có thứ tự, có TTL)</w:t>
             </w:r>
           </w:p>
         </w:tc>
@@ -5620,9 +5973,8 @@
               <w:rPr>
                 <w:sz w:val="24"/>
                 <w:szCs w:val="24"/>
-                <w:highlight w:val="yellow"/>
-              </w:rPr>
-              <w:t xml:space="preserve">Bộ đếm trong bộ nhớ tiến trình web</w:t>
+              </w:rPr>
+              <w:t>Bộ đếm trong bộ nhớ tiến trình web</w:t>
             </w:r>
           </w:p>
         </w:tc>
@@ -5644,9 +5996,8 @@
               <w:rPr>
                 <w:sz w:val="24"/>
                 <w:szCs w:val="24"/>
-                <w:highlight w:val="yellow"/>
-              </w:rPr>
-              <w:t xml:space="preserve">2</w:t>
+              </w:rPr>
+              <w:t>2</w:t>
             </w:r>
           </w:p>
         </w:tc>
@@ -5666,9 +6017,8 @@
               <w:rPr>
                 <w:sz w:val="24"/>
                 <w:szCs w:val="24"/>
-                <w:highlight w:val="yellow"/>
-              </w:rPr>
-              <w:t xml:space="preserve">Kết quả kiểm tra phiên đăng nhập kèm session_version, TTL 30 giây</w:t>
+              </w:rPr>
+              <w:t>Kết quả kiểm tra phiên đăng nhập kèm session_version, TTL 30 giây</w:t>
             </w:r>
           </w:p>
         </w:tc>
@@ -5688,9 +6038,8 @@
               <w:rPr>
                 <w:sz w:val="24"/>
                 <w:szCs w:val="24"/>
-                <w:highlight w:val="yellow"/>
-              </w:rPr>
-              <w:t xml:space="preserve">Một truy vấn PostgreSQL cho mỗi yêu cầu</w:t>
+              </w:rPr>
+              <w:t>Một truy vấn PostgreSQL cho mỗi yêu cầu</w:t>
             </w:r>
           </w:p>
         </w:tc>
@@ -5712,9 +6061,8 @@
               <w:rPr>
                 <w:sz w:val="24"/>
                 <w:szCs w:val="24"/>
-                <w:highlight w:val="yellow"/>
-              </w:rPr>
-              <w:t xml:space="preserve">3</w:t>
+              </w:rPr>
+              <w:t>3</w:t>
             </w:r>
           </w:p>
         </w:tc>
@@ -5734,9 +6082,8 @@
               <w:rPr>
                 <w:sz w:val="24"/>
                 <w:szCs w:val="24"/>
-                <w:highlight w:val="yellow"/>
-              </w:rPr>
-              <w:t xml:space="preserve">Kênh pub/sub settings:changed, chỉ chứa tên cấu hình</w:t>
+              </w:rPr>
+              <w:t>Kênh pub/sub settings:changed, chỉ chứa tên cấu hình</w:t>
             </w:r>
           </w:p>
         </w:tc>
@@ -5756,9 +6103,8 @@
               <w:rPr>
                 <w:sz w:val="24"/>
                 <w:szCs w:val="24"/>
-                <w:highlight w:val="yellow"/>
-              </w:rPr>
-              <w:t xml:space="preserve">Biến môi trường riêng của từng tiến trình</w:t>
+              </w:rPr>
+              <w:t>Biến môi trường riêng của từng tiến trình</w:t>
             </w:r>
           </w:p>
         </w:tc>
@@ -5770,10 +6116,7 @@
         <w:jc w:val="both"/>
       </w:pPr>
       <w:r>
-        <w:rPr>
-          <w:highlight w:val="yellow"/>
-        </w:rPr>
-        <w:t xml:space="preserve">Đồ án đã triển khai cả ba giai đoạn; service web chạy hai worker uvicorn.</w:t>
+        <w:t>Đồ án đã triển khai cả ba giai đoạn; service web chạy hai worker uvicorn.</w:t>
       </w:r>
     </w:p>
     <w:p>
@@ -5781,12 +6124,11 @@
         <w:pStyle w:val="Heading2"/>
         <w:spacing w:before="240" w:after="120" w:line="312" w:lineRule="auto"/>
       </w:pPr>
-      <w:r>
-        <w:rPr>
-          <w:highlight w:val="yellow"/>
-        </w:rPr>
-        <w:t xml:space="preserve">3.7. KẾT CHƯƠNG</w:t>
-      </w:r>
+      <w:bookmarkStart w:id="23" w:name="_Toc242258336"/>
+      <w:r>
+        <w:t>3.7. KẾT CHƯƠNG</w:t>
+      </w:r>
+      <w:bookmarkEnd w:id="23"/>
     </w:p>
     <w:p>
       <w:pPr>
@@ -5797,10 +6139,7 @@
         <w:t xml:space="preserve">Chương 3 phân tích hạn chế của kiến trúc chạy trực tiếp trên máy chủ, từ đó thiết kế Dockerfile đóng gói ứng dụng, thiết kế Docker Compose liên kết bốn service với thứ tự khởi động an toàn qua healthcheck và thiết kế cách truyền cấu hình/bí mật vào container mà không ghi cứng trong image. Chương 4 trình bày kết quả build, run thật trên máy thực nghiệm cùng các lỗi môi trường gặp phải. </w:t>
       </w:r>
       <w:r>
-        <w:rPr>
-          <w:highlight w:val="yellow"/>
-        </w:rPr>
-        <w:t xml:space="preserve">Mục 3.6 bổ sung thiết kế service Redis lưu trạng thái dùng chung giữa các tiến trình web, có cơ chế quay về bộ đếm trong bộ nhớ khi Redis lỗi.</w:t>
+        <w:t>Mục 3.6 bổ sung thiết kế service Redis lưu trạng thái dùng chung giữa các tiến trình web, có cơ chế quay về bộ đếm trong bộ nhớ khi Redis lỗi.</w:t>
       </w:r>
     </w:p>
     <w:p>
@@ -5809,7 +6148,7 @@
         <w:pageBreakBefore/>
         <w:jc w:val="center"/>
       </w:pPr>
-      <w:bookmarkStart w:id="23" w:name="_Toc241962754"/>
+      <w:bookmarkStart w:id="24" w:name="_Toc242258337"/>
       <w:r>
         <w:rPr>
           <w:sz w:val="32"/>
@@ -5827,18 +6166,18 @@
       <w:r>
         <w:t>VÀ KHẮC PHỤC LỖI</w:t>
       </w:r>
-      <w:bookmarkEnd w:id="23"/>
+      <w:bookmarkEnd w:id="24"/>
     </w:p>
     <w:p>
       <w:pPr>
         <w:pStyle w:val="Heading2"/>
         <w:spacing w:before="240" w:after="120" w:line="312" w:lineRule="auto"/>
       </w:pPr>
-      <w:bookmarkStart w:id="24" w:name="_Toc241962755"/>
+      <w:bookmarkStart w:id="25" w:name="_Toc242258338"/>
       <w:r>
         <w:t>4.1. GIỚI THIỆU</w:t>
       </w:r>
-      <w:bookmarkEnd w:id="24"/>
+      <w:bookmarkEnd w:id="25"/>
     </w:p>
     <w:p>
       <w:pPr>
@@ -5854,11 +6193,11 @@
         <w:pStyle w:val="Heading2"/>
         <w:spacing w:before="240" w:after="120" w:line="312" w:lineRule="auto"/>
       </w:pPr>
-      <w:bookmarkStart w:id="25" w:name="_Toc241962756"/>
+      <w:bookmarkStart w:id="26" w:name="_Toc242258339"/>
       <w:r>
         <w:t>4.2. MÔI TRƯỜNG THỰC NGHIỆM</w:t>
       </w:r>
-      <w:bookmarkEnd w:id="25"/>
+      <w:bookmarkEnd w:id="26"/>
     </w:p>
     <w:p>
       <w:pPr>
@@ -5866,7 +6205,7 @@
         <w:jc w:val="both"/>
       </w:pPr>
       <w:r>
-        <w:t xml:space="preserve">Máy thực nghiệm chạy Windows kèm Docker Desktop, dùng Docker Compose bản tích hợp sẵn trong Docker Desktop. Mã nguồn ứng dụng, Dockerfile và docker-compose.yaml đặt cùng thư mục gốc dự án. Bốn image dùng trong thực nghiệm: ứng dụng tự build từ python:3.13-slim, postgres:16-bookworm, mongo:7.0 và minio bản RELEASE.2025-04-22T22-12-26Z. Phiên bản minio được ghim cố định thay vì dùng thẻ latest, để lần build sau không tự kéo về một bản phát hành khác với bản đã kiểm thử.</w:t>
+        <w:t>Máy thực nghiệm chạy Windows kèm Docker Desktop, dùng Docker Compose bản tích hợp sẵn trong Docker Desktop. Mã nguồn ứng dụng, Dockerfile và docker-compose.yaml đặt cùng thư mục gốc dự án. Bốn image dùng trong thực nghiệm: ứng dụng tự build từ python:3.13-slim, postgres:16-bookworm, mongo:7.0 và minio bản RELEASE.2025-04-22T22-12-26Z. Phiên bản minio được ghim cố định thay vì dùng thẻ latest, để lần build sau không tự kéo về một bản phát hành khác với bản đã kiểm thử.</w:t>
       </w:r>
     </w:p>
     <w:p>
@@ -5874,11 +6213,11 @@
         <w:pStyle w:val="Heading2"/>
         <w:spacing w:before="240" w:after="120" w:line="312" w:lineRule="auto"/>
       </w:pPr>
-      <w:bookmarkStart w:id="26" w:name="_Toc241962757"/>
+      <w:bookmarkStart w:id="27" w:name="_Toc242258340"/>
       <w:r>
         <w:t>4.3. QUÁ TRÌNH BUILD VÀ RUN</w:t>
       </w:r>
-      <w:bookmarkEnd w:id="26"/>
+      <w:bookmarkEnd w:id="27"/>
     </w:p>
     <w:p>
       <w:pPr>
@@ -6151,6 +6490,7 @@
           <w:b/>
           <w:bCs/>
         </w:rPr>
+        <w:lastRenderedPageBreak/>
         <w:t xml:space="preserve">Hình 4.2: </w:t>
       </w:r>
       <w:r>
@@ -6248,22 +6588,22 @@
         <w:pStyle w:val="Heading2"/>
         <w:spacing w:before="240" w:after="120" w:line="312" w:lineRule="auto"/>
       </w:pPr>
-      <w:bookmarkStart w:id="27" w:name="_Toc241962758"/>
+      <w:bookmarkStart w:id="28" w:name="_Toc242258341"/>
       <w:r>
         <w:t>4.4. CÁC LỖI MÔI TRƯỜNG GẶP PHẢI VÀ CÁCH KHẮC PHỤC</w:t>
       </w:r>
-      <w:bookmarkEnd w:id="27"/>
+      <w:bookmarkEnd w:id="28"/>
     </w:p>
     <w:p>
       <w:pPr>
         <w:pStyle w:val="Heading3"/>
         <w:spacing w:before="180" w:after="100" w:line="312" w:lineRule="auto"/>
       </w:pPr>
-      <w:bookmarkStart w:id="28" w:name="_Toc241962759"/>
+      <w:bookmarkStart w:id="29" w:name="_Toc242258342"/>
       <w:r>
         <w:t>4.4.1. Ứng dụng khởi động trước khi cơ sở dữ liệu sẵn sàng</w:t>
       </w:r>
-      <w:bookmarkEnd w:id="28"/>
+      <w:bookmarkEnd w:id="29"/>
     </w:p>
     <w:p>
       <w:pPr>
@@ -6279,11 +6619,11 @@
         <w:pStyle w:val="Heading3"/>
         <w:spacing w:before="180" w:after="100" w:line="312" w:lineRule="auto"/>
       </w:pPr>
-      <w:bookmarkStart w:id="29" w:name="_Toc241962760"/>
+      <w:bookmarkStart w:id="30" w:name="_Toc242258343"/>
       <w:r>
         <w:t>4.4.2. Thiếu hoặc còn giá trị mẫu trong biến môi trường bí mật</w:t>
       </w:r>
-      <w:bookmarkEnd w:id="29"/>
+      <w:bookmarkEnd w:id="30"/>
     </w:p>
     <w:p>
       <w:pPr>
@@ -6299,9 +6639,11 @@
         <w:pStyle w:val="Heading3"/>
         <w:spacing w:before="180" w:after="100" w:line="312" w:lineRule="auto"/>
       </w:pPr>
-      <w:r>
-        <w:t xml:space="preserve">4.4.3. Log lỗi tăng nhanh do chưa giới hạn tần suất gọi mô hình</w:t>
-      </w:r>
+      <w:bookmarkStart w:id="31" w:name="_Toc242258344"/>
+      <w:r>
+        <w:t>4.4.3. Log lỗi tăng nhanh do chưa giới hạn tần suất gọi mô hình</w:t>
+      </w:r>
+      <w:bookmarkEnd w:id="31"/>
     </w:p>
     <w:p>
       <w:pPr>
@@ -6713,9 +7055,8 @@
               <w:rPr>
                 <w:sz w:val="24"/>
                 <w:szCs w:val="24"/>
-                <w:highlight w:val="yellow"/>
-              </w:rPr>
-              <w:t xml:space="preserve">redis</w:t>
+              </w:rPr>
+              <w:t>redis</w:t>
             </w:r>
           </w:p>
         </w:tc>
@@ -6735,9 +7076,8 @@
               <w:rPr>
                 <w:sz w:val="24"/>
                 <w:szCs w:val="24"/>
-                <w:highlight w:val="yellow"/>
-              </w:rPr>
-              <w:t xml:space="preserve">0.5</w:t>
+              </w:rPr>
+              <w:t>0.5</w:t>
             </w:r>
           </w:p>
         </w:tc>
@@ -6757,9 +7097,8 @@
               <w:rPr>
                 <w:sz w:val="24"/>
                 <w:szCs w:val="24"/>
-                <w:highlight w:val="yellow"/>
-              </w:rPr>
-              <w:t xml:space="preserve">128m</w:t>
+              </w:rPr>
+              <w:t>128m</w:t>
             </w:r>
           </w:p>
         </w:tc>
@@ -6770,12 +7109,11 @@
         <w:pStyle w:val="Heading3"/>
         <w:spacing w:before="180" w:after="100" w:line="312" w:lineRule="auto"/>
       </w:pPr>
-      <w:r>
-        <w:rPr>
-          <w:highlight w:val="yellow"/>
-        </w:rPr>
-        <w:t xml:space="preserve">4.4.4. Lỗi gặp phải khi bổ sung Redis</w:t>
-      </w:r>
+      <w:bookmarkStart w:id="32" w:name="_Toc242258345"/>
+      <w:r>
+        <w:t>4.4.4. Lỗi gặp phải khi bổ sung Redis</w:t>
+      </w:r>
+      <w:bookmarkEnd w:id="32"/>
     </w:p>
     <w:p>
       <w:pPr>
@@ -6783,10 +7121,7 @@
         <w:jc w:val="both"/>
       </w:pPr>
       <w:r>
-        <w:rPr>
-          <w:highlight w:val="yellow"/>
-        </w:rPr>
-        <w:t xml:space="preserve">Bản thiết kế đầu của bộ nhớ đệm phiên đăng nhập đặt session_version vào tên khóa, dựa trên lập luận: thao tác thu hồi phiên luôn tăng session_version, nên không cần xóa khóa cũ. Kiểm thử đơn vị cho thấy lập luận đó sai: cookie cũ vẫn mang session_version cũ và vẫn khớp đúng khóa cũ còn trong Redis, nên tài khoản vừa bị khóa còn dùng được thêm tối đa 30 giây. Cách khắc phục là đổi tên khóa thành session:&lt;mã người dùng&gt;, lưu session_version trong giá trị để so với cookie và xóa khóa ngay trong mỗi thao tác thu hồi phiên. Bộ kiểm thử được bổ sung kịch bản khóa tài khoản và đổi vai trò trong lúc phiên đang nằm trong bộ nhớ đệm.</w:t>
+        <w:t>Bản thiết kế đầu của bộ nhớ đệm phiên đăng nhập đặt session_version vào tên khóa, dựa trên lập luận: thao tác thu hồi phiên luôn tăng session_version, nên không cần xóa khóa cũ. Kiểm thử đơn vị cho thấy lập luận đó sai: cookie cũ vẫn mang session_version cũ và vẫn khớp đúng khóa cũ còn trong Redis, nên tài khoản vừa bị khóa còn dùng được thêm tối đa 30 giây. Cách khắc phục là đổi tên khóa thành session:&lt;mã người dùng&gt;, lưu session_version trong giá trị để so với cookie và xóa khóa ngay trong mỗi thao tác thu hồi phiên. Bộ kiểm thử được bổ sung kịch bản khóa tài khoản và đổi vai trò trong lúc phiên đang nằm trong bộ nhớ đệm.</w:t>
       </w:r>
     </w:p>
     <w:p>
@@ -6806,11 +7141,11 @@
         <w:pStyle w:val="Heading2"/>
         <w:spacing w:before="240" w:after="120" w:line="312" w:lineRule="auto"/>
       </w:pPr>
-      <w:bookmarkStart w:id="31" w:name="_Toc241962762"/>
+      <w:bookmarkStart w:id="33" w:name="_Toc242258346"/>
       <w:r>
         <w:t>4.5. KẾT QUẢ THỰC NGHIỆM</w:t>
       </w:r>
-      <w:bookmarkEnd w:id="31"/>
+      <w:bookmarkEnd w:id="33"/>
     </w:p>
     <w:p>
       <w:pPr>
@@ -6818,7 +7153,11 @@
         <w:jc w:val="both"/>
       </w:pPr>
       <w:r>
-        <w:t>Sau khi áp dụng các điều chỉnh ở mục 4.4, hệ thống khởi động ổn định từ trạng thái sạch (docker compose down -v rồi up -d --build lại) mà không cần can thiệp thủ công: cả bốn container chuyển sang trạng thái healthy trong phạm vi start_period đã cấu hình, ứng dụng truy cập được qua trình duyệt tại cổng đã publish và dữ liệu tạo trong một lần chạy vẫn còn nguyên sau khi dừng rồi khởi động lại container nhờ named volume. Ba dịch vụ dữ liệu tách khỏi service ứng dụng nên service web khởi động lại được một mình khi chỉ có mã nguồn thay đổi, không cần build hay khởi động lại ba service dữ liệu đang giữ toàn bộ dữ liệu thực nghiệm.</w:t>
+        <w:t xml:space="preserve">Sau khi áp dụng các điều chỉnh ở mục 4.4, hệ thống khởi động ổn định từ trạng thái sạch (docker compose down -v rồi up -d --build lại) mà không cần can thiệp thủ công: cả bốn container chuyển sang trạng thái healthy trong phạm vi start_period đã cấu hình, ứng dụng truy cập được qua trình duyệt tại cổng đã publish và dữ liệu tạo trong một lần chạy vẫn còn nguyên sau khi dừng rồi khởi động lại container nhờ named volume. Ba dịch vụ dữ liệu tách khỏi service ứng dụng nên service web khởi động lại được một mình khi chỉ có mã </w:t>
+      </w:r>
+      <w:r>
+        <w:lastRenderedPageBreak/>
+        <w:t>nguồn thay đổi, không cần build hay khởi động lại ba service dữ liệu đang giữ toàn bộ dữ liệu thực nghiệm.</w:t>
       </w:r>
     </w:p>
     <w:p>
@@ -6826,12 +7165,11 @@
         <w:pStyle w:val="Heading2"/>
         <w:spacing w:before="240" w:after="120" w:line="312" w:lineRule="auto"/>
       </w:pPr>
-      <w:r>
-        <w:rPr>
-          <w:highlight w:val="yellow"/>
-        </w:rPr>
-        <w:t xml:space="preserve">4.6. BỔ SUNG REDIS VÀO HỆ THỐNG</w:t>
-      </w:r>
+      <w:bookmarkStart w:id="34" w:name="_Toc242258347"/>
+      <w:r>
+        <w:t>4.6. BỔ SUNG REDIS VÀO HỆ THỐNG</w:t>
+      </w:r>
+      <w:bookmarkEnd w:id="34"/>
     </w:p>
     <w:p>
       <w:pPr>
@@ -6839,10 +7177,7 @@
         <w:jc w:val="both"/>
       </w:pPr>
       <w:r>
-        <w:rPr>
-          <w:highlight w:val="yellow"/>
-        </w:rPr>
-        <w:t xml:space="preserve">Sau khi thêm service redis vào docker-compose.yaml và hai biến REDIS_PASSWORD, REDIS_URL vào tệp .env, hệ thống được khởi động lại bằng cùng lệnh ở mục 4.3. Lệnh docker compose ps xác nhận năm container ở trạng thái healthy:</w:t>
+        <w:t>Sau khi thêm service redis vào docker-compose.yaml và hai biến REDIS_PASSWORD, REDIS_URL vào tệp .env, hệ thống được khởi động lại bằng cùng lệnh ở mục 4.3. Lệnh docker compose ps xác nhận năm container ở trạng thái healthy:</w:t>
       </w:r>
     </w:p>
     <w:tbl>
@@ -6886,9 +7221,8 @@
                 <w:rFonts w:ascii="Consolas" w:eastAsia="Consolas" w:hAnsi="Consolas" w:cs="Consolas"/>
                 <w:sz w:val="19"/>
                 <w:szCs w:val="19"/>
-                <w:highlight w:val="yellow"/>
-              </w:rPr>
-              <w:t xml:space="preserve">$ docker compose ps</w:t>
+              </w:rPr>
+              <w:t>$ docker compose ps</w:t>
             </w:r>
           </w:p>
           <w:p>
@@ -6917,15 +7251,11 @@
         <w:rPr>
           <w:b/>
           <w:bCs/>
-          <w:highlight w:val="yellow"/>
         </w:rPr>
         <w:t xml:space="preserve">Hình 4.4: </w:t>
       </w:r>
       <w:r>
-        <w:rPr>
-          <w:highlight w:val="yellow"/>
-        </w:rPr>
-        <w:t xml:space="preserve">Trạng thái năm container sau khi bổ sung Redis</w:t>
+        <w:t>Trạng thái năm container sau khi bổ sung Redis</w:t>
       </w:r>
     </w:p>
     <w:p>
@@ -6934,10 +7264,7 @@
         <w:jc w:val="both"/>
       </w:pPr>
       <w:r>
-        <w:rPr>
-          <w:highlight w:val="yellow"/>
-        </w:rPr>
-        <w:t xml:space="preserve">Bảng 4.2 ghi kết quả kiểm thử sau khi chuyển bộ đếm giới hạn tần suất và bước kiểm tra phiên đăng nhập sang Redis, gồm trường hợp container web khởi động lại và trường hợp Redis ngừng hoạt động. Giới hạn đăng nhập của ứng dụng là 20 lượt trong 5 phút cho mỗi địa chỉ IP. Các kịch bản được chạy tự động bằng script tests/integration/redis_test.py.</w:t>
+        <w:t>Bảng 4.2 ghi kết quả kiểm thử sau khi chuyển bộ đếm giới hạn tần suất và bước kiểm tra phiên đăng nhập sang Redis, gồm trường hợp container web khởi động lại và trường hợp Redis ngừng hoạt động. Giới hạn đăng nhập của ứng dụng là 20 lượt trong 5 phút cho mỗi địa chỉ IP. Các kịch bản được chạy tự động bằng script tests/integration/redis_test.py.</w:t>
       </w:r>
     </w:p>
     <w:p>
@@ -6948,15 +7275,11 @@
         <w:rPr>
           <w:b/>
           <w:bCs/>
-          <w:highlight w:val="yellow"/>
         </w:rPr>
         <w:t xml:space="preserve">Bảng 4.2: </w:t>
       </w:r>
       <w:r>
-        <w:rPr>
-          <w:highlight w:val="yellow"/>
-        </w:rPr>
-        <w:t xml:space="preserve">Kết quả kiểm thử sau khi bổ sung Redis</w:t>
+        <w:t>Kết quả kiểm thử sau khi bổ sung Redis</w:t>
       </w:r>
     </w:p>
     <w:tbl>
@@ -6977,9 +7300,9 @@
         <w:tblLook w:val="04A0" w:firstRow="1" w:lastRow="0" w:firstColumn="1" w:lastColumn="0" w:noHBand="0" w:noVBand="1"/>
       </w:tblPr>
       <w:tblGrid>
-        <w:gridCol w:w="2613"/>
-        <w:gridCol w:w="3316"/>
-        <w:gridCol w:w="3416"/>
+        <w:gridCol w:w="3160"/>
+        <w:gridCol w:w="3074"/>
+        <w:gridCol w:w="3111"/>
       </w:tblGrid>
       <w:tr>
         <w:tc>
@@ -7005,7 +7328,7 @@
                 <w:sz w:val="24"/>
                 <w:szCs w:val="24"/>
               </w:rPr>
-              <w:t xml:space="preserve">Kịch bản</w:t>
+              <w:t>Kịch bản</w:t>
             </w:r>
           </w:p>
         </w:tc>
@@ -7032,7 +7355,7 @@
                 <w:sz w:val="24"/>
                 <w:szCs w:val="24"/>
               </w:rPr>
-              <w:t xml:space="preserve">Kết quả mong đợi</w:t>
+              <w:t>Kết quả mong đợi</w:t>
             </w:r>
           </w:p>
         </w:tc>
@@ -7059,7 +7382,7 @@
                 <w:sz w:val="24"/>
                 <w:szCs w:val="24"/>
               </w:rPr>
-              <w:t xml:space="preserve">Kết quả thực tế</w:t>
+              <w:t>Kết quả thực tế</w:t>
             </w:r>
           </w:p>
         </w:tc>
@@ -7081,9 +7404,8 @@
               <w:rPr>
                 <w:sz w:val="24"/>
                 <w:szCs w:val="24"/>
-                <w:highlight w:val="yellow"/>
-              </w:rPr>
-              <w:t xml:space="preserve">redis-cli ping trong container redis</w:t>
+              </w:rPr>
+              <w:t>redis-cli ping trong container redis</w:t>
             </w:r>
           </w:p>
         </w:tc>
@@ -7103,9 +7425,8 @@
               <w:rPr>
                 <w:sz w:val="24"/>
                 <w:szCs w:val="24"/>
-                <w:highlight w:val="yellow"/>
-              </w:rPr>
-              <w:t xml:space="preserve">Trả về PONG</w:t>
+              </w:rPr>
+              <w:t>Trả về PONG</w:t>
             </w:r>
           </w:p>
         </w:tc>
@@ -7149,9 +7470,8 @@
               <w:rPr>
                 <w:sz w:val="24"/>
                 <w:szCs w:val="24"/>
-                <w:highlight w:val="yellow"/>
-              </w:rPr>
-              <w:t xml:space="preserve">Đăng nhập rồi mở trang tài khoản</w:t>
+              </w:rPr>
+              <w:t>Đăng nhập rồi mở trang tài khoản</w:t>
             </w:r>
           </w:p>
         </w:tc>
@@ -7171,9 +7491,8 @@
               <w:rPr>
                 <w:sz w:val="24"/>
                 <w:szCs w:val="24"/>
-                <w:highlight w:val="yellow"/>
-              </w:rPr>
-              <w:t xml:space="preserve">Redis có khóa session:&lt;mã người dùng&gt;, TTL không quá 30 giây</w:t>
+              </w:rPr>
+              <w:t>Redis có khóa session:&lt;mã người dùng&gt;, TTL không quá 30 giây</w:t>
             </w:r>
           </w:p>
         </w:tc>
@@ -7217,9 +7536,8 @@
               <w:rPr>
                 <w:sz w:val="24"/>
                 <w:szCs w:val="24"/>
-                <w:highlight w:val="yellow"/>
-              </w:rPr>
-              <w:t xml:space="preserve">Đăng xuất khỏi mọi thiết bị</w:t>
+              </w:rPr>
+              <w:t>Đăng xuất khỏi mọi thiết bị</w:t>
             </w:r>
           </w:p>
         </w:tc>
@@ -7239,9 +7557,8 @@
               <w:rPr>
                 <w:sz w:val="24"/>
                 <w:szCs w:val="24"/>
-                <w:highlight w:val="yellow"/>
-              </w:rPr>
-              <w:t xml:space="preserve">Khóa session:&lt;mã người dùng&gt; bị xóa ngay</w:t>
+              </w:rPr>
+              <w:t>Khóa session:&lt;mã người dùng&gt; bị xóa ngay</w:t>
             </w:r>
           </w:p>
         </w:tc>
@@ -7285,9 +7602,8 @@
               <w:rPr>
                 <w:sz w:val="24"/>
                 <w:szCs w:val="24"/>
-                <w:highlight w:val="yellow"/>
-              </w:rPr>
-              <w:t xml:space="preserve">Đếm tiến trình worker trong container web</w:t>
+              </w:rPr>
+              <w:t>Đếm tiến trình worker trong container web</w:t>
             </w:r>
           </w:p>
         </w:tc>
@@ -7307,9 +7623,8 @@
               <w:rPr>
                 <w:sz w:val="24"/>
                 <w:szCs w:val="24"/>
-                <w:highlight w:val="yellow"/>
-              </w:rPr>
-              <w:t xml:space="preserve">Ít nhất 2 worker</w:t>
+              </w:rPr>
+              <w:t>Ít nhất 2 worker</w:t>
             </w:r>
           </w:p>
         </w:tc>
@@ -7353,9 +7668,8 @@
               <w:rPr>
                 <w:sz w:val="24"/>
                 <w:szCs w:val="24"/>
-                <w:highlight w:val="yellow"/>
-              </w:rPr>
-              <w:t xml:space="preserve">Đổi LLM_TIMEOUT_SECONDS một lần rồi mở trang cấu hình 30 lần</w:t>
+              </w:rPr>
+              <w:t>Đổi LLM_TIMEOUT_SECONDS một lần rồi mở trang cấu hình 30 lần</w:t>
             </w:r>
           </w:p>
         </w:tc>
@@ -7375,9 +7689,8 @@
               <w:rPr>
                 <w:sz w:val="24"/>
                 <w:szCs w:val="24"/>
-                <w:highlight w:val="yellow"/>
-              </w:rPr>
-              <w:t xml:space="preserve">30/30 lần thấy giá trị mới, kể cả khi yêu cầu rơi vào worker khác</w:t>
+              </w:rPr>
+              <w:t>30/30 lần thấy giá trị mới, kể cả khi yêu cầu rơi vào worker khác</w:t>
             </w:r>
           </w:p>
         </w:tc>
@@ -7421,9 +7734,8 @@
               <w:rPr>
                 <w:sz w:val="24"/>
                 <w:szCs w:val="24"/>
-                <w:highlight w:val="yellow"/>
-              </w:rPr>
-              <w:t xml:space="preserve">Gửi 21 lần đăng nhập sai liên tiếp</w:t>
+              </w:rPr>
+              <w:t>Gửi 21 lần đăng nhập sai liên tiếp</w:t>
             </w:r>
           </w:p>
         </w:tc>
@@ -7443,9 +7755,8 @@
               <w:rPr>
                 <w:sz w:val="24"/>
                 <w:szCs w:val="24"/>
-                <w:highlight w:val="yellow"/>
-              </w:rPr>
-              <w:t xml:space="preserve">Lần thứ 21 nhận mã 429</w:t>
+              </w:rPr>
+              <w:t>Lần thứ 21 nhận mã 429</w:t>
             </w:r>
           </w:p>
         </w:tc>
@@ -7489,9 +7800,8 @@
               <w:rPr>
                 <w:sz w:val="24"/>
                 <w:szCs w:val="24"/>
-                <w:highlight w:val="yellow"/>
-              </w:rPr>
-              <w:t xml:space="preserve">Khởi động lại container web rồi gửi thêm 1 lần</w:t>
+              </w:rPr>
+              <w:t>Khởi động lại container web rồi gửi thêm 1 lần</w:t>
             </w:r>
           </w:p>
         </w:tc>
@@ -7511,9 +7821,8 @@
               <w:rPr>
                 <w:sz w:val="24"/>
                 <w:szCs w:val="24"/>
-                <w:highlight w:val="yellow"/>
-              </w:rPr>
-              <w:t xml:space="preserve">Vẫn nhận 429 vì bộ đếm nằm trong Redis</w:t>
+              </w:rPr>
+              <w:t>Vẫn nhận 429 vì bộ đếm nằm trong Redis</w:t>
             </w:r>
           </w:p>
         </w:tc>
@@ -7557,9 +7866,8 @@
               <w:rPr>
                 <w:sz w:val="24"/>
                 <w:szCs w:val="24"/>
-                <w:highlight w:val="yellow"/>
-              </w:rPr>
-              <w:t xml:space="preserve">Dừng container redis rồi đăng nhập đúng</w:t>
+              </w:rPr>
+              <w:t>Dừng container redis rồi đăng nhập đúng</w:t>
             </w:r>
           </w:p>
         </w:tc>
@@ -7579,9 +7887,8 @@
               <w:rPr>
                 <w:sz w:val="24"/>
                 <w:szCs w:val="24"/>
-                <w:highlight w:val="yellow"/>
-              </w:rPr>
-              <w:t xml:space="preserve">Đăng nhập được; log có cảnh báo; /health/ready trả 200, redis: down</w:t>
+              </w:rPr>
+              <w:t>Đăng nhập được; log có cảnh báo; /health/ready trả 200, redis: down</w:t>
             </w:r>
           </w:p>
         </w:tc>
@@ -7625,9 +7932,9 @@
               <w:rPr>
                 <w:sz w:val="24"/>
                 <w:szCs w:val="24"/>
-                <w:highlight w:val="yellow"/>
-              </w:rPr>
-              <w:t xml:space="preserve">docker stats của container redis</w:t>
+              </w:rPr>
+              <w:lastRenderedPageBreak/>
+              <w:t>docker stats của container redis</w:t>
             </w:r>
           </w:p>
         </w:tc>
@@ -7647,9 +7954,8 @@
               <w:rPr>
                 <w:sz w:val="24"/>
                 <w:szCs w:val="24"/>
-                <w:highlight w:val="yellow"/>
-              </w:rPr>
-              <w:t xml:space="preserve">Dưới giới hạn 128 MB</w:t>
+              </w:rPr>
+              <w:t>Dưới giới hạn 128 MB</w:t>
             </w:r>
           </w:p>
         </w:tc>
@@ -7694,11 +8000,40 @@
         <w:pStyle w:val="Heading2"/>
         <w:spacing w:before="240" w:after="120" w:line="312" w:lineRule="auto"/>
       </w:pPr>
+      <w:bookmarkStart w:id="35" w:name="_Toc242258348"/>
+      <w:r>
+        <w:t>4.7. TRIỂN KHAI LÊN VPS CÓ TÊN MIỀN</w:t>
+      </w:r>
+      <w:bookmarkEnd w:id="35"/>
+    </w:p>
+    <w:p>
+      <w:pPr>
+        <w:spacing w:before="120" w:after="120" w:line="312" w:lineRule="auto"/>
+        <w:jc w:val="both"/>
+      </w:pPr>
+      <w:r>
+        <w:t xml:space="preserve">Phần thực nghiệm ở các mục trên chạy trên máy cục bộ; </w:t>
+      </w:r>
+      <w:r>
+        <w:t>bản triển khai thật</w:t>
+      </w:r>
+      <w:r>
+        <w:t xml:space="preserve"> dùng thêm một service Caddy làm reverse proxy, lấy chứng chỉ HTTPS tự động từ Let's Encrypt và là service duy nhất mở cổng 80/443 ra Internet, đúng nguyên tắc cô lập đã thiết kế ở mục 3.5. Thông tin VPS và tên miền dùng để triển khai thật:</w:t>
+      </w:r>
+    </w:p>
+    <w:p>
+      <w:pPr>
+        <w:spacing w:before="120" w:after="120" w:line="312" w:lineRule="auto"/>
+        <w:jc w:val="both"/>
+      </w:pPr>
+      <w:r>
+        <w:t xml:space="preserve">Địa chỉ IP của VPS: </w:t>
+      </w:r>
       <w:r>
         <w:rPr>
           <w:highlight w:val="yellow"/>
         </w:rPr>
-        <w:t xml:space="preserve">4.7. TRIỂN KHAI LÊN VPS CÓ TÊN MIỀN</w:t>
+        <w:t xml:space="preserve">&lt;ĐIỀN IP VPS SAU KHI ĐĂNG KÝ&gt;</w:t>
       </w:r>
     </w:p>
     <w:p>
@@ -7707,16 +8042,13 @@
         <w:jc w:val="both"/>
       </w:pPr>
       <w:r>
-        <w:t xml:space="preserve">Phần thực nghiệm ở các mục trên chạy trên máy cục bộ; </w:t>
+        <w:t xml:space="preserve">Tên miền sử dụng: </w:t>
       </w:r>
       <w:r>
         <w:rPr>
           <w:highlight w:val="yellow"/>
         </w:rPr>
-        <w:t xml:space="preserve">bản triển khai thật</w:t>
-      </w:r>
-      <w:r>
-        <w:t xml:space="preserve"> dùng thêm một service Caddy làm reverse proxy, lấy chứng chỉ HTTPS tự động từ Let's Encrypt và là service duy nhất mở cổng 80/443 ra Internet, đúng nguyên tắc cô lập đã thiết kế ở mục 3.5. Thông tin VPS và tên miền dùng để triển khai thật:</w:t>
+        <w:t xml:space="preserve">&lt;ĐIỀN TÊN MIỀN SAU KHI ĐĂNG KÝ&gt;</w:t>
       </w:r>
     </w:p>
     <w:p>
@@ -7725,43 +8057,13 @@
         <w:jc w:val="both"/>
       </w:pPr>
       <w:r>
-        <w:t xml:space="preserve">Địa chỉ IP của VPS: </w:t>
+        <w:t xml:space="preserve">Nhà cung cấp VPS: </w:t>
       </w:r>
       <w:r>
         <w:rPr>
           <w:highlight w:val="yellow"/>
         </w:rPr>
-        <w:t>&lt;ĐIỀN IP VPS SAU KHI ĐĂNG KÝ&gt;</w:t>
-      </w:r>
-    </w:p>
-    <w:p>
-      <w:pPr>
-        <w:spacing w:before="120" w:after="120" w:line="312" w:lineRule="auto"/>
-        <w:jc w:val="both"/>
-      </w:pPr>
-      <w:r>
-        <w:t xml:space="preserve">Tên miền sử dụng: </w:t>
-      </w:r>
-      <w:r>
-        <w:rPr>
-          <w:highlight w:val="yellow"/>
-        </w:rPr>
-        <w:t>&lt;ĐIỀN TÊN MIỀN SAU KHI ĐĂNG KÝ&gt;</w:t>
-      </w:r>
-    </w:p>
-    <w:p>
-      <w:pPr>
-        <w:spacing w:before="120" w:after="120" w:line="312" w:lineRule="auto"/>
-        <w:jc w:val="both"/>
-      </w:pPr>
-      <w:r>
-        <w:t xml:space="preserve">Nhà cung cấp VPS: </w:t>
-      </w:r>
-      <w:r>
-        <w:rPr>
-          <w:highlight w:val="yellow"/>
-        </w:rPr>
-        <w:t>&lt;ĐIỀN TÊN NHÀ CUNG CẤP, VÍ DỤ BKNS&gt;</w:t>
+        <w:t xml:space="preserve">&lt;ĐIỀN TÊN NHÀ CUNG CẤP, VÍ DỤ BKNS&gt;</w:t>
       </w:r>
     </w:p>
     <w:p>
@@ -7790,26 +8092,83 @@
         <w:pStyle w:val="Heading2"/>
         <w:spacing w:before="240" w:after="120" w:line="312" w:lineRule="auto"/>
       </w:pPr>
+      <w:bookmarkStart w:id="36" w:name="_Toc242258349"/>
+      <w:r>
+        <w:t>4.8. KẾT CHƯƠNG</w:t>
+      </w:r>
+      <w:bookmarkEnd w:id="36"/>
+    </w:p>
+    <w:p>
+      <w:pPr>
+        <w:spacing w:before="120" w:after="120" w:line="312" w:lineRule="auto"/>
+        <w:jc w:val="both"/>
+      </w:pPr>
+      <w:r>
+        <w:t>Chương 4 trình bày quá trình build và run bốn container theo thiết kế ở chương 3, cùng ba lỗi môi trường gặp phải: thứ tự khởi động giữa ứng dụng và cơ sở dữ liệu, biến môi trường bí mật còn giá trị mẫu và nguy cơ log bị loãng khi gọi mô hình ngôn ngữ lớn không giới hạn tần suất. Chương cũng trình bày kết quả thực nghiệm sau khi hệ thống chạy ổn định</w:t>
+      </w:r>
+      <w:r>
+        <w:t>, kết quả bổ sung Redis làm service thứ năm và kết quả triển khai lên VPS có tên miền.</w:t>
+      </w:r>
+    </w:p>
+    <w:p>
+      <w:pPr>
+        <w:pStyle w:val="Heading1"/>
+        <w:pageBreakBefore/>
+        <w:jc w:val="center"/>
+      </w:pPr>
+      <w:bookmarkStart w:id="37" w:name="_Toc242258350"/>
+      <w:r>
+        <w:lastRenderedPageBreak/>
+        <w:t>KẾT LUẬN</w:t>
+      </w:r>
+      <w:bookmarkEnd w:id="37"/>
+    </w:p>
+    <w:p>
+      <w:pPr>
+        <w:spacing w:before="120" w:after="120" w:line="312" w:lineRule="auto"/>
+        <w:jc w:val="both"/>
+      </w:pPr>
+      <w:r>
+        <w:t xml:space="preserve">Đồ án đã đóng gói một ứng dụng web monolithic có ba dịch vụ dữ liệu đi kèm thành bốn container liên kết bằng Docker Compose: viết Dockerfile đóng gói ứng dụng, thiết kế thứ tự khởi động an toàn bằng healthcheck, tách cấu hình/bí mật khỏi image và ghi nhận lại ba lỗi môi trường thật gặp phải trong quá trình build/run cùng cách khắc phục từng lỗi. </w:t>
+      </w:r>
+      <w:r>
+        <w:t>Ngoài yêu cầu gợi ý của đề tài, hệ thống được triển khai lên VPS có tên miền và HTTPS, và bổ sung Redis làm container thứ năm lưu bộ đếm giới hạn tần suất dùng chung, bộ nhớ đệm cho bước kiểm tra phiên đăng nhập và kênh đồng bộ cấu hình, nhờ đó service web chạy được hai worker uvicorn.</w:t>
+      </w:r>
+    </w:p>
+    <w:p>
+      <w:pPr>
+        <w:spacing w:before="120" w:after="120" w:line="312" w:lineRule="auto"/>
+        <w:jc w:val="both"/>
+      </w:pPr>
+      <w:r>
+        <w:t xml:space="preserve">Kết quả thực nghiệm cho thấy đóng gói giải quyết đúng vấn đề nêu ở phần mở đầu: môi trường chạy ứng dụng không còn phụ thuộc vào cài đặt thủ công trên từng máy, cơ sở dữ liệu luôn khởi động đúng thứ tự trước ứng dụng và dữ liệu không mất khi container được tạo lại. </w:t>
+      </w:r>
       <w:r>
         <w:rPr>
           <w:highlight w:val="yellow"/>
         </w:rPr>
-        <w:t xml:space="preserve">4.8. KẾT CHƯƠNG</w:t>
-      </w:r>
-    </w:p>
-    <w:p>
-      <w:pPr>
-        <w:spacing w:before="120" w:after="120" w:line="312" w:lineRule="auto"/>
-        <w:jc w:val="both"/>
-      </w:pPr>
-      <w:r>
-        <w:t xml:space="preserve">Chương 4 trình bày quá trình build và run bốn container theo thiết kế ở chương 3, cùng ba lỗi môi trường gặp phải: thứ tự khởi động giữa ứng dụng và cơ sở dữ liệu, biến môi trường bí mật còn giá trị mẫu và nguy cơ log bị loãng khi gọi mô hình ngôn ngữ lớn không giới hạn tần suất. Chương cũng trình bày kết quả thực nghiệm sau khi hệ thống chạy ổn định</w:t>
+        <w:t xml:space="preserve">&lt;ĐIỀN: HỆ THỐNG CHẠY TRÊN VPS &lt;NHÀ CUNG CẤP&gt; TẠI https://&lt;TÊN MIỀN&gt;, MỨC SỬ DỤNG RAM/CPU ĐO ĐƯỢC LÀ ...&gt;</w:t>
+      </w:r>
+      <w:r>
+        <w:t xml:space="preserve">. Hạn chế còn lại của đồ án là </w:t>
       </w:r>
       <w:r>
         <w:rPr>
           <w:highlight w:val="yellow"/>
         </w:rPr>
-        <w:t xml:space="preserve">, kết quả bổ sung Redis làm service thứ năm và kết quả triển khai lên VPS có tên miền.</w:t>
+        <w:t xml:space="preserve">&lt;ĐIỀN, VÍ DỤ: CHƯA CÓ SAO LƯU TỰ ĐỘNG THEO LỊCH, CHƯA ĐO TẢI KHI NHIỀU NGƯỜI DÙNG TRUY CẬP CÙNG LÚC&gt;</w:t>
+      </w:r>
+      <w:r>
+        <w:t xml:space="preserve">.</w:t>
+      </w:r>
+    </w:p>
+    <w:p>
+      <w:pPr>
+        <w:spacing w:before="120" w:after="120" w:line="312" w:lineRule="auto"/>
+        <w:jc w:val="both"/>
+      </w:pPr>
+      <w:r>
+        <w:t>Hướng phát triển tiếp theo là chạy nhiều bản sao container web sau một bộ cân bằng tải, bổ sung sao lưu tự động theo lịch cho ba kho dữ liệu và tách tác vụ chạy lâu, ví dụ phân tích tệp media bằng mô hình ngôn ngữ lớn, sang một worker riêng nhận tác vụ qua hàng đợi Redis, để tác vụ đó không chiếm luồng xử lý của các yêu cầu khác.</w:t>
       </w:r>
     </w:p>
     <w:p>
@@ -7818,67 +8177,12 @@
         <w:pageBreakBefore/>
         <w:jc w:val="center"/>
       </w:pPr>
-      <w:bookmarkStart w:id="34" w:name="_Toc241962765"/>
-      <w:r>
-        <w:lastRenderedPageBreak/>
-        <w:t>KẾT LUẬN</w:t>
-      </w:r>
-      <w:bookmarkEnd w:id="34"/>
-    </w:p>
-    <w:p>
-      <w:pPr>
-        <w:spacing w:before="120" w:after="120" w:line="312" w:lineRule="auto"/>
-        <w:jc w:val="both"/>
-      </w:pPr>
-      <w:r>
-        <w:t xml:space="preserve">Đồ án đã đóng gói một ứng dụng web monolithic có ba dịch vụ dữ liệu đi kèm thành bốn container liên kết bằng Docker Compose: viết Dockerfile đóng gói ứng dụng, thiết kế thứ tự khởi động an toàn bằng healthcheck, tách cấu hình/bí mật khỏi image và ghi nhận lại ba lỗi môi trường thật gặp phải trong quá trình build/run cùng cách khắc phục từng lỗi. </w:t>
-      </w:r>
-      <w:r>
-        <w:rPr>
-          <w:highlight w:val="yellow"/>
-        </w:rPr>
-        <w:t xml:space="preserve">Ngoài yêu cầu gợi ý của đề tài, hệ thống được triển khai lên VPS có tên miền và HTTPS, và bổ sung Redis làm container thứ năm lưu bộ đếm giới hạn tần suất dùng chung, bộ nhớ đệm cho bước kiểm tra phiên đăng nhập và kênh đồng bộ cấu hình, nhờ đó service web chạy được hai worker uvicorn.</w:t>
-      </w:r>
-    </w:p>
-    <w:p>
-      <w:pPr>
-        <w:spacing w:before="120" w:after="120" w:line="312" w:lineRule="auto"/>
-        <w:jc w:val="both"/>
-      </w:pPr>
-      <w:r>
-        <w:t xml:space="preserve">Kết quả thực nghiệm cho thấy đóng gói giải quyết đúng vấn đề nêu ở phần mở đầu: môi trường chạy ứng dụng không còn phụ thuộc vào cài đặt thủ công trên từng máy, cơ sở dữ liệu luôn khởi động đúng thứ tự trước ứng dụng và dữ liệu không mất khi container được tạo lại. </w:t>
-      </w:r>
-      <w:r>
-        <w:rPr>
-          <w:highlight w:val="yellow"/>
-        </w:rPr>
-        <w:t xml:space="preserve">&lt;ĐIỀN: HỆ THỐNG CHẠY TRÊN VPS &lt;NHÀ CUNG CẤP&gt; TẠI https://&lt;TÊN MIỀN&gt;, MỨC SỬ DỤNG RAM/CPU ĐO ĐƯỢC LÀ ...&gt;. Hạn chế còn lại của đồ án là &lt;ĐIỀN, VÍ DỤ: CHƯA CÓ SAO LƯU TỰ ĐỘNG THEO LỊCH, CHƯA ĐO TẢI KHI NHIỀU NGƯỜI DÙNG TRUY CẬP CÙNG LÚC&gt;.</w:t>
-      </w:r>
-    </w:p>
-    <w:p>
-      <w:pPr>
-        <w:spacing w:before="120" w:after="120" w:line="312" w:lineRule="auto"/>
-        <w:jc w:val="both"/>
-      </w:pPr>
-      <w:r>
-        <w:rPr>
-          <w:highlight w:val="yellow"/>
-        </w:rPr>
-        <w:t xml:space="preserve">Hướng phát triển tiếp theo là chạy nhiều bản sao container web sau một bộ cân bằng tải, bổ sung sao lưu tự động theo lịch cho ba kho dữ liệu và tách tác vụ chạy lâu, ví dụ phân tích tệp media bằng mô hình ngôn ngữ lớn, sang một worker riêng nhận tác vụ qua hàng đợi Redis, để tác vụ đó không chiếm luồng xử lý của các yêu cầu khác.</w:t>
-      </w:r>
-    </w:p>
-    <w:p>
-      <w:pPr>
-        <w:pStyle w:val="Heading1"/>
-        <w:pageBreakBefore/>
-        <w:jc w:val="center"/>
-      </w:pPr>
-      <w:bookmarkStart w:id="35" w:name="_Toc241962766"/>
+      <w:bookmarkStart w:id="38" w:name="_Toc242258351"/>
       <w:r>
         <w:lastRenderedPageBreak/>
         <w:t>TÀI LIỆU THAM KHẢO</w:t>
       </w:r>
-      <w:bookmarkEnd w:id="35"/>
+      <w:bookmarkEnd w:id="38"/>
     </w:p>
     <w:p>
       <w:pPr>
@@ -7899,7 +8203,7 @@
         <w:jc w:val="both"/>
       </w:pPr>
       <w:r>
-        <w:t xml:space="preserve">[1] Tài liệu nội bộ dự án Research Document Workspace: README.md, docs/architecture.md, docs/security.md, docs/infrastructure.md.</w:t>
+        <w:t>[1] Tài liệu nội bộ dự án Research Document Workspace: README.md, docs/architecture.md, docs/security.md, docs/infrastructure.md.</w:t>
       </w:r>
     </w:p>
     <w:p>
@@ -7984,7 +8288,7 @@
         <w:jc w:val="both"/>
       </w:pPr>
       <w:r>
-        <w:t xml:space="preserve">[9] Caddy Web Server, Caddy Documentation, https://caddyserver.com/docs/</w:t>
+        <w:t>[9] Caddy Web Server, Caddy Documentation, https://caddyserver.com/docs/</w:t>
       </w:r>
     </w:p>
     <w:p>
@@ -7993,10 +8297,7 @@
         <w:jc w:val="both"/>
       </w:pPr>
       <w:r>
-        <w:rPr>
-          <w:highlight w:val="yellow"/>
-        </w:rPr>
-        <w:t xml:space="preserve">[10] Redis Ltd., Redis Documentation, https://redis.io/docs/latest/</w:t>
+        <w:t>[10] Redis Ltd., Redis Documentation, https://redis.io/docs/latest/</w:t>
       </w:r>
     </w:p>
     <w:p>
@@ -8005,23 +8306,23 @@
         <w:pageBreakBefore/>
         <w:jc w:val="center"/>
       </w:pPr>
-      <w:bookmarkStart w:id="36" w:name="_Toc241962767"/>
+      <w:bookmarkStart w:id="39" w:name="_Toc242258352"/>
       <w:r>
         <w:lastRenderedPageBreak/>
         <w:t>PHỤ LỤC</w:t>
       </w:r>
-      <w:bookmarkEnd w:id="36"/>
+      <w:bookmarkEnd w:id="39"/>
     </w:p>
     <w:p>
       <w:pPr>
         <w:pStyle w:val="Heading2"/>
         <w:spacing w:before="240" w:after="120" w:line="312" w:lineRule="auto"/>
       </w:pPr>
-      <w:bookmarkStart w:id="37" w:name="_Toc241962768"/>
+      <w:bookmarkStart w:id="40" w:name="_Toc242258353"/>
       <w:r>
         <w:t>A. NỘI DUNG DOCKERFILE</w:t>
       </w:r>
-      <w:bookmarkEnd w:id="37"/>
+      <w:bookmarkEnd w:id="40"/>
     </w:p>
     <w:tbl>
       <w:tblPr>
@@ -8258,11 +8559,11 @@
         <w:pStyle w:val="Heading2"/>
         <w:spacing w:before="240" w:after="120" w:line="312" w:lineRule="auto"/>
       </w:pPr>
-      <w:bookmarkStart w:id="38" w:name="_Toc241962769"/>
+      <w:bookmarkStart w:id="41" w:name="_Toc242258354"/>
       <w:r>
         <w:t>B. NỘI DUNG DOCKER-COMPOSE.YAML (RÚT GỌN)</w:t>
       </w:r>
-      <w:bookmarkEnd w:id="38"/>
+      <w:bookmarkEnd w:id="41"/>
     </w:p>
     <w:tbl>
       <w:tblPr>
@@ -8708,11 +9009,12 @@
         <w:pStyle w:val="Heading2"/>
         <w:spacing w:before="240" w:after="120" w:line="312" w:lineRule="auto"/>
       </w:pPr>
-      <w:bookmarkStart w:id="39" w:name="_Toc241962770"/>
-      <w:r>
+      <w:bookmarkStart w:id="42" w:name="_Toc242258355"/>
+      <w:r>
+        <w:lastRenderedPageBreak/>
         <w:t>C. LỆNH TRIỂN KHAI LÊN VPS</w:t>
       </w:r>
-      <w:bookmarkEnd w:id="39"/>
+      <w:bookmarkEnd w:id="42"/>
     </w:p>
     <w:tbl>
       <w:tblPr>
@@ -8836,10 +9138,7 @@
         <w:t xml:space="preserve">Ghi chú: </w:t>
       </w:r>
       <w:r>
-        <w:rPr>
-          <w:highlight w:val="yellow"/>
-        </w:rPr>
-        <w:t xml:space="preserve">thông tin IP VPS và tên miền trong các lệnh trên sẽ được điền sau khi đăng ký dịch vụ VPS và tên miền (xem mục 4.7).</w:t>
+        <w:t>thông tin IP VPS và tên miền trong các lệnh trên sẽ được điền sau khi đăng ký dịch vụ VPS và tên miền (xem mục 4.7).</w:t>
       </w:r>
     </w:p>
     <w:p>
@@ -8847,12 +9146,11 @@
         <w:pStyle w:val="Heading2"/>
         <w:spacing w:before="240" w:after="120" w:line="312" w:lineRule="auto"/>
       </w:pPr>
-      <w:r>
-        <w:rPr>
-          <w:highlight w:val="yellow"/>
-        </w:rPr>
-        <w:t xml:space="preserve">D. CẤU HÌNH SERVICE REDIS TRONG DOCKER-COMPOSE.YAML</w:t>
-      </w:r>
+      <w:bookmarkStart w:id="43" w:name="_Toc242258356"/>
+      <w:r>
+        <w:t>D. CẤU HÌNH SERVICE REDIS TRONG DOCKER-COMPOSE.YAML</w:t>
+      </w:r>
+      <w:bookmarkEnd w:id="43"/>
     </w:p>
     <w:tbl>
       <w:tblPr>
@@ -9207,7 +9505,7 @@
         <w:jc w:val="both"/>
       </w:pPr>
       <w:r>
-        <w:t xml:space="preserve">Dòng exec redis-server trong tệp thật nằm trên một dòng; ở đây ngắt làm hai dòng cho vừa trang.</w:t>
+        <w:t>Dòng exec redis-server trong tệp thật nằm trên một dòng; ở đây ngắt làm hai dòng cho vừa trang.</w:t>
       </w:r>
     </w:p>
     <w:sectPr>

</xml_diff>

<commit_message>
Cap nhat kiem thu, tai lieu va bao cao cho hang doi job nen, doi Redis sang volatile-lru
</commit_message>
<xml_diff>
--- a/bao-cao/Do_an_COMP1313_DongGoiMonolithicThanhDocker_TranHoangDat_49.01.104.030.docx
+++ b/bao-cao/Do_an_COMP1313_DongGoiMonolithicThanhDocker_TranHoangDat_49.01.104.030.docx
@@ -4493,10 +4493,10 @@
           <w:b/>
           <w:bCs/>
         </w:rPr>
-        <w:t>Hình 4.4.</w:t>
-      </w:r>
-      <w:r>
-        <w:t xml:space="preserve"> Trạng thái năm container sau khi bổ sung Redis</w:t>
+        <w:t xml:space="preserve">Hình 4.4.</w:t>
+      </w:r>
+      <w:r>
+        <w:t xml:space="preserve"> Trạng thái sáu container sau khi bổ sung Redis và worker</w:t>
       </w:r>
     </w:p>
     <w:p>
@@ -5781,7 +5781,16 @@
         <w:jc w:val="both"/>
       </w:pPr>
       <w:r>
-        <w:t>Cấu hình service Redis theo cùng nguyên tắc với ba service dữ liệu ở mục 3.4 và 3.5. Redis không mở cổng ra máy chủ; service web gọi tới qua tên redis trong mạng nội bộ, kết nối có mật khẩu đọc từ biến môi trường REDIS_PASSWORD. Healthcheck dùng lệnh redis-cli ping và service web khai báo depends_on với điều kiện service_healthy. Container giới hạn 0.5 CPU và 128 MB RAM; bên trong, Redis đặt maxmemory 64 MB với chính sách allkeys-lru để tự xóa khóa ít dùng khi đầy, không chạm tới giới hạn RAM của container.</w:t>
+        <w:t xml:space="preserve">Phần cuối là hàng đợi tác vụ nền cho phân tích ảnh, âm thanh và video bằng Gemini. Một lần phân tích video có thể kéo dài vài phút; trước đó yêu cầu HTTP phải chờ suốt thời gian đó và giữ một luồng xử lý của web. Đồ án dùng thư viện RQ (Redis Queue) và thêm service worker chạy cùng image với web, lệnh khởi động python -m app.worker. Khi người dùng bấm phân tích, web ghi trạng thái queued vào MongoDB, đưa tác vụ vào hàng đợi trên Redis và trả trang ngay; worker lấy tác vụ, gọi Gemini, lưu văn bản rồi xóa trạng thái, hoặc ghi trạng thái failed kèm lý do. Trang tài liệu hỏi lại trạng thái mỗi 5 giây và tự tải lại khi tác vụ xong. Khi không kết nối được hàng đợi, web phân tích ngay trong yêu cầu như trước khi có Redis.</w:t>
+      </w:r>
+    </w:p>
+    <w:p>
+      <w:pPr>
+        <w:spacing w:before="120" w:after="120" w:line="312" w:lineRule="auto"/>
+        <w:jc w:val="both"/>
+      </w:pPr>
+      <w:r>
+        <w:t>Cấu hình service Redis theo cùng nguyên tắc với ba service dữ liệu ở mục 3.4 và 3.5. Redis không mở cổng ra máy chủ; service web gọi tới qua tên redis trong mạng nội bộ, kết nối có mật khẩu đọc từ biến môi trường REDIS_PASSWORD. Healthcheck dùng lệnh redis-cli ping và service web khai báo depends_on với điều kiện service_healthy. Container giới hạn 0.5 CPU và 128 MB RAM; bên trong, Redis đặt maxmemory 64 MB với chính sách volatile-lru: khi đầy, Redis chỉ xóa khóa có thời hạn (bộ đếm, bộ nhớ đệm phiên) và không xóa tác vụ đang chờ trong hàng đợi, không chạm tới giới hạn RAM của container.</w:t>
       </w:r>
     </w:p>
     <w:p>
@@ -6109,6 +6118,71 @@
           </w:p>
         </w:tc>
       </w:tr>
+      <w:tr>
+        <w:tc>
+          <w:tcPr>
+            <w:tcW w:w="2600" w:type="dxa"/>
+            <w:tcMar>
+              <w:top w:w="80" w:type="dxa"/>
+              <w:left w:w="120" w:type="dxa"/>
+              <w:bottom w:w="80" w:type="dxa"/>
+              <w:right w:w="120" w:type="dxa"/>
+            </w:tcMar>
+            <w:vAlign w:val="center"/>
+          </w:tcPr>
+          <w:p>
+            <w:r>
+              <w:rPr>
+                <w:sz w:val="24"/>
+                <w:szCs w:val="24"/>
+              </w:rPr>
+              <w:t xml:space="preserve">4</w:t>
+            </w:r>
+          </w:p>
+        </w:tc>
+        <w:tc>
+          <w:tcPr>
+            <w:tcW w:w="3300" w:type="dxa"/>
+            <w:tcMar>
+              <w:top w:w="80" w:type="dxa"/>
+              <w:left w:w="120" w:type="dxa"/>
+              <w:bottom w:w="80" w:type="dxa"/>
+              <w:right w:w="120" w:type="dxa"/>
+            </w:tcMar>
+            <w:vAlign w:val="center"/>
+          </w:tcPr>
+          <w:p>
+            <w:r>
+              <w:rPr>
+                <w:sz w:val="24"/>
+                <w:szCs w:val="24"/>
+              </w:rPr>
+              <w:t xml:space="preserve">Hàng đợi tác vụ phân tích ảnh, âm thanh, video (RQ), chạy bởi service worker</w:t>
+            </w:r>
+          </w:p>
+        </w:tc>
+        <w:tc>
+          <w:tcPr>
+            <w:tcW w:w="3400" w:type="dxa"/>
+            <w:tcMar>
+              <w:top w:w="80" w:type="dxa"/>
+              <w:left w:w="120" w:type="dxa"/>
+              <w:bottom w:w="80" w:type="dxa"/>
+              <w:right w:w="120" w:type="dxa"/>
+            </w:tcMar>
+            <w:vAlign w:val="center"/>
+          </w:tcPr>
+          <w:p>
+            <w:r>
+              <w:rPr>
+                <w:sz w:val="24"/>
+                <w:szCs w:val="24"/>
+              </w:rPr>
+              <w:t xml:space="preserve">Xử lý ngay trong yêu cầu HTTP, chờ vài phút</w:t>
+            </w:r>
+          </w:p>
+        </w:tc>
+      </w:tr>
     </w:tbl>
     <w:p>
       <w:pPr>
@@ -6116,7 +6190,7 @@
         <w:jc w:val="both"/>
       </w:pPr>
       <w:r>
-        <w:t>Đồ án đã triển khai cả ba giai đoạn; service web chạy hai worker uvicorn.</w:t>
+        <w:t xml:space="preserve">Đồ án đã triển khai cả bốn giai đoạn: service web chạy hai worker uvicorn, service worker riêng xử lý tác vụ nền.</w:t>
       </w:r>
     </w:p>
     <w:p>
@@ -7056,6 +7130,71 @@
                 <w:sz w:val="24"/>
                 <w:szCs w:val="24"/>
               </w:rPr>
+              <w:t xml:space="preserve">worker</w:t>
+            </w:r>
+          </w:p>
+        </w:tc>
+        <w:tc>
+          <w:tcPr>
+            <w:tcW w:w="3050" w:type="dxa"/>
+            <w:tcMar>
+              <w:top w:w="80" w:type="dxa"/>
+              <w:left w:w="120" w:type="dxa"/>
+              <w:bottom w:w="80" w:type="dxa"/>
+              <w:right w:w="120" w:type="dxa"/>
+            </w:tcMar>
+            <w:vAlign w:val="center"/>
+          </w:tcPr>
+          <w:p>
+            <w:r>
+              <w:rPr>
+                <w:sz w:val="24"/>
+                <w:szCs w:val="24"/>
+              </w:rPr>
+              <w:t xml:space="preserve">1.0</w:t>
+            </w:r>
+          </w:p>
+        </w:tc>
+        <w:tc>
+          <w:tcPr>
+            <w:tcW w:w="3050" w:type="dxa"/>
+            <w:tcMar>
+              <w:top w:w="80" w:type="dxa"/>
+              <w:left w:w="120" w:type="dxa"/>
+              <w:bottom w:w="80" w:type="dxa"/>
+              <w:right w:w="120" w:type="dxa"/>
+            </w:tcMar>
+            <w:vAlign w:val="center"/>
+          </w:tcPr>
+          <w:p>
+            <w:r>
+              <w:rPr>
+                <w:sz w:val="24"/>
+                <w:szCs w:val="24"/>
+              </w:rPr>
+              <w:t xml:space="preserve">512m</w:t>
+            </w:r>
+          </w:p>
+        </w:tc>
+      </w:tr>
+      <w:tr>
+        <w:tc>
+          <w:tcPr>
+            <w:tcW w:w="3200" w:type="dxa"/>
+            <w:tcMar>
+              <w:top w:w="80" w:type="dxa"/>
+              <w:left w:w="120" w:type="dxa"/>
+              <w:bottom w:w="80" w:type="dxa"/>
+              <w:right w:w="120" w:type="dxa"/>
+            </w:tcMar>
+            <w:vAlign w:val="center"/>
+          </w:tcPr>
+          <w:p>
+            <w:r>
+              <w:rPr>
+                <w:sz w:val="24"/>
+                <w:szCs w:val="24"/>
+              </w:rPr>
               <w:t>redis</w:t>
             </w:r>
           </w:p>
@@ -7122,6 +7261,15 @@
       </w:pPr>
       <w:r>
         <w:t>Bản thiết kế đầu của bộ nhớ đệm phiên đăng nhập đặt session_version vào tên khóa, dựa trên lập luận: thao tác thu hồi phiên luôn tăng session_version, nên không cần xóa khóa cũ. Kiểm thử đơn vị cho thấy lập luận đó sai: cookie cũ vẫn mang session_version cũ và vẫn khớp đúng khóa cũ còn trong Redis, nên tài khoản vừa bị khóa còn dùng được thêm tối đa 30 giây. Cách khắc phục là đổi tên khóa thành session:&lt;mã người dùng&gt;, lưu session_version trong giá trị để so với cookie và xóa khóa ngay trong mỗi thao tác thu hồi phiên. Bộ kiểm thử được bổ sung kịch bản khóa tài khoản và đổi vai trò trong lúc phiên đang nằm trong bộ nhớ đệm.</w:t>
+      </w:r>
+    </w:p>
+    <w:p>
+      <w:pPr>
+        <w:spacing w:before="120" w:after="120" w:line="312" w:lineRule="auto"/>
+        <w:jc w:val="both"/>
+      </w:pPr>
+      <w:r>
+        <w:t xml:space="preserve">Khi thêm hàng đợi tác vụ, cấu hình Redis ban đầu đặt chính sách allkeys-lru. Với chính sách đó, lúc Redis chạm giới hạn 64 MB, bất kỳ khóa nào cũng có thể bị xóa, kể cả tác vụ đang chờ trong hàng đợi, và tài liệu sẽ nằm ở trạng thái chờ mà không có worker nào xử lý. Cách khắc phục là đổi sang volatile-lru: Redis chỉ xóa khóa có thời hạn, gồm bộ đếm giới hạn tần suất và bộ nhớ đệm phiên đăng nhập, còn tác vụ trong hàng đợi không có thời hạn nên được giữ lại.</w:t>
       </w:r>
     </w:p>
     <w:p>
@@ -7177,7 +7325,7 @@
         <w:jc w:val="both"/>
       </w:pPr>
       <w:r>
-        <w:t>Sau khi thêm service redis vào docker-compose.yaml và hai biến REDIS_PASSWORD, REDIS_URL vào tệp .env, hệ thống được khởi động lại bằng cùng lệnh ở mục 4.3. Lệnh docker compose ps xác nhận năm container ở trạng thái healthy:</w:t>
+        <w:t xml:space="preserve">Sau khi thêm service redis, service worker vào docker-compose.yaml và biến REDIS_PASSWORD vào tệp .env, hệ thống được khởi động lại bằng cùng lệnh ở mục 4.3. Lệnh docker compose ps xác nhận sáu container ở trạng thái healthy:</w:t>
       </w:r>
     </w:p>
     <w:tbl>
@@ -7222,7 +7370,7 @@
                 <w:sz w:val="19"/>
                 <w:szCs w:val="19"/>
               </w:rPr>
-              <w:t>$ docker compose ps</w:t>
+              <w:t xml:space="preserve">$ docker compose ps</w:t>
             </w:r>
           </w:p>
           <w:p>
@@ -7236,7 +7384,7 @@
                 <w:szCs w:val="19"/>
                 <w:highlight w:val="yellow"/>
               </w:rPr>
-              <w:t xml:space="preserve">&lt;DÁN KẾT QUẢ docker compose ps CÓ ĐỦ 5 SERVICE: web, postgres, mongo, minio, redis&gt;</w:t>
+              <w:t xml:space="preserve">&lt;DÁN KẾT QUẢ docker compose ps CÓ ĐỦ 6 SERVICE: web, worker, postgres, mongo, minio, redis&gt;</w:t>
             </w:r>
           </w:p>
         </w:tc>
@@ -7255,7 +7403,7 @@
         <w:t xml:space="preserve">Hình 4.4: </w:t>
       </w:r>
       <w:r>
-        <w:t>Trạng thái năm container sau khi bổ sung Redis</w:t>
+        <w:t xml:space="preserve">Trạng thái sáu container sau khi bổ sung Redis và worker</w:t>
       </w:r>
     </w:p>
     <w:p>
@@ -7735,6 +7883,138 @@
                 <w:sz w:val="24"/>
                 <w:szCs w:val="24"/>
               </w:rPr>
+              <w:t xml:space="preserve">Đưa tác vụ thử vào hàng đợi từ container web</w:t>
+            </w:r>
+          </w:p>
+        </w:tc>
+        <w:tc>
+          <w:tcPr>
+            <w:tcW w:w="3300" w:type="dxa"/>
+            <w:tcMar>
+              <w:top w:w="80" w:type="dxa"/>
+              <w:left w:w="120" w:type="dxa"/>
+              <w:bottom w:w="80" w:type="dxa"/>
+              <w:right w:w="120" w:type="dxa"/>
+            </w:tcMar>
+            <w:vAlign w:val="center"/>
+          </w:tcPr>
+          <w:p>
+            <w:r>
+              <w:rPr>
+                <w:sz w:val="24"/>
+                <w:szCs w:val="24"/>
+              </w:rPr>
+              <w:t xml:space="preserve">Worker chạy xong, trả kết quả 3</w:t>
+            </w:r>
+          </w:p>
+        </w:tc>
+        <w:tc>
+          <w:tcPr>
+            <w:tcW w:w="3400" w:type="dxa"/>
+            <w:tcMar>
+              <w:top w:w="80" w:type="dxa"/>
+              <w:left w:w="120" w:type="dxa"/>
+              <w:bottom w:w="80" w:type="dxa"/>
+              <w:right w:w="120" w:type="dxa"/>
+            </w:tcMar>
+            <w:vAlign w:val="center"/>
+          </w:tcPr>
+          <w:p>
+            <w:r>
+              <w:rPr>
+                <w:sz w:val="24"/>
+                <w:szCs w:val="24"/>
+                <w:highlight w:val="yellow"/>
+              </w:rPr>
+              <w:t xml:space="preserve">&lt;ĐIỀN&gt;</w:t>
+            </w:r>
+          </w:p>
+        </w:tc>
+      </w:tr>
+      <w:tr>
+        <w:tc>
+          <w:tcPr>
+            <w:tcW w:w="2600" w:type="dxa"/>
+            <w:tcMar>
+              <w:top w:w="80" w:type="dxa"/>
+              <w:left w:w="120" w:type="dxa"/>
+              <w:bottom w:w="80" w:type="dxa"/>
+              <w:right w:w="120" w:type="dxa"/>
+            </w:tcMar>
+            <w:vAlign w:val="center"/>
+          </w:tcPr>
+          <w:p>
+            <w:r>
+              <w:rPr>
+                <w:sz w:val="24"/>
+                <w:szCs w:val="24"/>
+              </w:rPr>
+              <w:t xml:space="preserve">Bấm Phân tích bằng AI với một ảnh</w:t>
+            </w:r>
+          </w:p>
+        </w:tc>
+        <w:tc>
+          <w:tcPr>
+            <w:tcW w:w="3300" w:type="dxa"/>
+            <w:tcMar>
+              <w:top w:w="80" w:type="dxa"/>
+              <w:left w:w="120" w:type="dxa"/>
+              <w:bottom w:w="80" w:type="dxa"/>
+              <w:right w:w="120" w:type="dxa"/>
+            </w:tcMar>
+            <w:vAlign w:val="center"/>
+          </w:tcPr>
+          <w:p>
+            <w:r>
+              <w:rPr>
+                <w:sz w:val="24"/>
+                <w:szCs w:val="24"/>
+              </w:rPr>
+              <w:t xml:space="preserve">Trang trả về ngay với thông báo chờ, tự tải lại khi worker xong</w:t>
+            </w:r>
+          </w:p>
+        </w:tc>
+        <w:tc>
+          <w:tcPr>
+            <w:tcW w:w="3400" w:type="dxa"/>
+            <w:tcMar>
+              <w:top w:w="80" w:type="dxa"/>
+              <w:left w:w="120" w:type="dxa"/>
+              <w:bottom w:w="80" w:type="dxa"/>
+              <w:right w:w="120" w:type="dxa"/>
+            </w:tcMar>
+            <w:vAlign w:val="center"/>
+          </w:tcPr>
+          <w:p>
+            <w:r>
+              <w:rPr>
+                <w:sz w:val="24"/>
+                <w:szCs w:val="24"/>
+                <w:highlight w:val="yellow"/>
+              </w:rPr>
+              <w:t xml:space="preserve">&lt;ĐIỀN&gt;</w:t>
+            </w:r>
+          </w:p>
+        </w:tc>
+      </w:tr>
+      <w:tr>
+        <w:tc>
+          <w:tcPr>
+            <w:tcW w:w="2600" w:type="dxa"/>
+            <w:tcMar>
+              <w:top w:w="80" w:type="dxa"/>
+              <w:left w:w="120" w:type="dxa"/>
+              <w:bottom w:w="80" w:type="dxa"/>
+              <w:right w:w="120" w:type="dxa"/>
+            </w:tcMar>
+            <w:vAlign w:val="center"/>
+          </w:tcPr>
+          <w:p>
+            <w:r>
+              <w:rPr>
+                <w:sz w:val="24"/>
+                <w:szCs w:val="24"/>
+              </w:rPr>
               <w:t>Gửi 21 lần đăng nhập sai liên tiếp</w:t>
             </w:r>
           </w:p>
@@ -8107,7 +8387,7 @@
         <w:t>Chương 4 trình bày quá trình build và run bốn container theo thiết kế ở chương 3, cùng ba lỗi môi trường gặp phải: thứ tự khởi động giữa ứng dụng và cơ sở dữ liệu, biến môi trường bí mật còn giá trị mẫu và nguy cơ log bị loãng khi gọi mô hình ngôn ngữ lớn không giới hạn tần suất. Chương cũng trình bày kết quả thực nghiệm sau khi hệ thống chạy ổn định</w:t>
       </w:r>
       <w:r>
-        <w:t>, kết quả bổ sung Redis làm service thứ năm và kết quả triển khai lên VPS có tên miền.</w:t>
+        <w:t>, kết quả bổ sung Redis và service worker và kết quả triển khai lên VPS có tên miền.</w:t>
       </w:r>
     </w:p>
     <w:p>
@@ -8132,7 +8412,7 @@
         <w:t xml:space="preserve">Đồ án đã đóng gói một ứng dụng web monolithic có ba dịch vụ dữ liệu đi kèm thành bốn container liên kết bằng Docker Compose: viết Dockerfile đóng gói ứng dụng, thiết kế thứ tự khởi động an toàn bằng healthcheck, tách cấu hình/bí mật khỏi image và ghi nhận lại ba lỗi môi trường thật gặp phải trong quá trình build/run cùng cách khắc phục từng lỗi. </w:t>
       </w:r>
       <w:r>
-        <w:t>Ngoài yêu cầu gợi ý của đề tài, hệ thống được triển khai lên VPS có tên miền và HTTPS, và bổ sung Redis làm container thứ năm lưu bộ đếm giới hạn tần suất dùng chung, bộ nhớ đệm cho bước kiểm tra phiên đăng nhập và kênh đồng bộ cấu hình, nhờ đó service web chạy được hai worker uvicorn.</w:t>
+        <w:t>Ngoài yêu cầu gợi ý của đề tài, hệ thống được triển khai lên VPS có tên miền và HTTPS, và bổ sung Redis lưu bộ đếm giới hạn tần suất dùng chung, bộ nhớ đệm cho bước kiểm tra phiên đăng nhập, kênh đồng bộ cấu hình và hàng đợi tác vụ nền, nhờ đó service web chạy được hai worker uvicorn và phân tích media chạy ở service worker riêng.</w:t>
       </w:r>
     </w:p>
     <w:p>
@@ -8168,7 +8448,7 @@
         <w:jc w:val="both"/>
       </w:pPr>
       <w:r>
-        <w:t>Hướng phát triển tiếp theo là chạy nhiều bản sao container web sau một bộ cân bằng tải, bổ sung sao lưu tự động theo lịch cho ba kho dữ liệu và tách tác vụ chạy lâu, ví dụ phân tích tệp media bằng mô hình ngôn ngữ lớn, sang một worker riêng nhận tác vụ qua hàng đợi Redis, để tác vụ đó không chiếm luồng xử lý của các yêu cầu khác.</w:t>
+        <w:t xml:space="preserve">Hướng phát triển tiếp theo là chạy nhiều bản sao container web sau một bộ cân bằng tải, bổ sung sao lưu tự động theo lịch cho ba kho dữ liệu và bật lưu đĩa cho Redis để tác vụ đang chờ không mất khi Redis khởi động lại.</w:t>
       </w:r>
     </w:p>
     <w:p>
@@ -9146,11 +9426,9 @@
         <w:pStyle w:val="Heading2"/>
         <w:spacing w:before="240" w:after="120" w:line="312" w:lineRule="auto"/>
       </w:pPr>
-      <w:bookmarkStart w:id="43" w:name="_Toc242258356"/>
-      <w:r>
-        <w:t>D. CẤU HÌNH SERVICE REDIS TRONG DOCKER-COMPOSE.YAML</w:t>
-      </w:r>
-      <w:bookmarkEnd w:id="43"/>
+      <w:r>
+        <w:t xml:space="preserve">D. CẤU HÌNH SERVICE REDIS VÀ WORKER TRONG DOCKER-COMPOSE.YAML</w:t>
+      </w:r>
     </w:p>
     <w:tbl>
       <w:tblPr>
@@ -9298,7 +9576,7 @@
                 <w:sz w:val="19"/>
                 <w:szCs w:val="19"/>
               </w:rPr>
-              <w:t xml:space="preserve">        --maxmemory-policy allkeys-lru --save '' --appendonly no</w:t>
+              <w:t xml:space="preserve">        --maxmemory-policy volatile-lru --save '' --appendonly no</w:t>
             </w:r>
           </w:p>
           <w:p>
@@ -9337,7 +9615,7 @@
                 <w:sz w:val="19"/>
                 <w:szCs w:val="19"/>
               </w:rPr>
-              <w:t xml:space="preserve">    restart: unless-stopped</w:t>
+              <w:t xml:space="preserve">    healthcheck:</w:t>
             </w:r>
           </w:p>
           <w:p>
@@ -9350,7 +9628,7 @@
                 <w:sz w:val="19"/>
                 <w:szCs w:val="19"/>
               </w:rPr>
-              <w:t xml:space="preserve">    healthcheck:</w:t>
+              <w:t xml:space="preserve">      test: ["CMD", "redis-cli", "ping"]</w:t>
             </w:r>
           </w:p>
           <w:p>
@@ -9363,7 +9641,7 @@
                 <w:sz w:val="19"/>
                 <w:szCs w:val="19"/>
               </w:rPr>
-              <w:t xml:space="preserve">      test: ["CMD", "redis-cli", "ping"]</w:t>
+              <w:t xml:space="preserve"> </w:t>
             </w:r>
           </w:p>
           <w:p>
@@ -9376,7 +9654,7 @@
                 <w:sz w:val="19"/>
                 <w:szCs w:val="19"/>
               </w:rPr>
-              <w:t xml:space="preserve">      interval: 5s</w:t>
+              <w:t xml:space="preserve">  worker:</w:t>
             </w:r>
           </w:p>
           <w:p>
@@ -9389,7 +9667,7 @@
                 <w:sz w:val="19"/>
                 <w:szCs w:val="19"/>
               </w:rPr>
-              <w:t xml:space="preserve">      timeout: 3s</w:t>
+              <w:t xml:space="preserve">    image: research-document-workspace:dev</w:t>
             </w:r>
           </w:p>
           <w:p>
@@ -9402,7 +9680,7 @@
                 <w:sz w:val="19"/>
                 <w:szCs w:val="19"/>
               </w:rPr>
-              <w:t xml:space="preserve">      retries: 20</w:t>
+              <w:t xml:space="preserve">    command: ["python", "-m", "app.worker"]</w:t>
             </w:r>
           </w:p>
           <w:p>
@@ -9415,7 +9693,7 @@
                 <w:sz w:val="19"/>
                 <w:szCs w:val="19"/>
               </w:rPr>
-              <w:t xml:space="preserve"> </w:t>
+              <w:t xml:space="preserve">    environment:</w:t>
             </w:r>
           </w:p>
           <w:p>
@@ -9428,7 +9706,7 @@
                 <w:sz w:val="19"/>
                 <w:szCs w:val="19"/>
               </w:rPr>
-              <w:t xml:space="preserve">  web:</w:t>
+              <w:t xml:space="preserve">      REDIS_URL: redis://:${REDIS_PASSWORD}@redis:6379/0</w:t>
             </w:r>
           </w:p>
           <w:p>
@@ -9441,7 +9719,7 @@
                 <w:sz w:val="19"/>
                 <w:szCs w:val="19"/>
               </w:rPr>
-              <w:t xml:space="preserve">    environment:</w:t>
+              <w:t xml:space="preserve">    depends_on:</w:t>
             </w:r>
           </w:p>
           <w:p>
@@ -9454,7 +9732,111 @@
                 <w:sz w:val="19"/>
                 <w:szCs w:val="19"/>
               </w:rPr>
+              <w:t xml:space="preserve">      web:</w:t>
+            </w:r>
+          </w:p>
+          <w:p>
+            <w:pPr>
+              <w:spacing w:line="276" w:lineRule="auto"/>
+            </w:pPr>
+            <w:r>
+              <w:rPr>
+                <w:rFonts w:ascii="Consolas" w:eastAsia="Consolas" w:hAnsi="Consolas" w:cs="Consolas"/>
+                <w:sz w:val="19"/>
+                <w:szCs w:val="19"/>
+              </w:rPr>
+              <w:t xml:space="preserve">        condition: service_healthy</w:t>
+            </w:r>
+          </w:p>
+          <w:p>
+            <w:pPr>
+              <w:spacing w:line="276" w:lineRule="auto"/>
+            </w:pPr>
+            <w:r>
+              <w:rPr>
+                <w:rFonts w:ascii="Consolas" w:eastAsia="Consolas" w:hAnsi="Consolas" w:cs="Consolas"/>
+                <w:sz w:val="19"/>
+                <w:szCs w:val="19"/>
+              </w:rPr>
+              <w:t xml:space="preserve">    healthcheck:</w:t>
+            </w:r>
+          </w:p>
+          <w:p>
+            <w:pPr>
+              <w:spacing w:line="276" w:lineRule="auto"/>
+            </w:pPr>
+            <w:r>
+              <w:rPr>
+                <w:rFonts w:ascii="Consolas" w:eastAsia="Consolas" w:hAnsi="Consolas" w:cs="Consolas"/>
+                <w:sz w:val="19"/>
+                <w:szCs w:val="19"/>
+              </w:rPr>
+              <w:t xml:space="preserve">      test: ["CMD", "python", "-m", "app.worker", "--check"]</w:t>
+            </w:r>
+          </w:p>
+          <w:p>
+            <w:pPr>
+              <w:spacing w:line="276" w:lineRule="auto"/>
+            </w:pPr>
+            <w:r>
+              <w:rPr>
+                <w:rFonts w:ascii="Consolas" w:eastAsia="Consolas" w:hAnsi="Consolas" w:cs="Consolas"/>
+                <w:sz w:val="19"/>
+                <w:szCs w:val="19"/>
+              </w:rPr>
+              <w:t xml:space="preserve"> </w:t>
+            </w:r>
+          </w:p>
+          <w:p>
+            <w:pPr>
+              <w:spacing w:line="276" w:lineRule="auto"/>
+            </w:pPr>
+            <w:r>
+              <w:rPr>
+                <w:rFonts w:ascii="Consolas" w:eastAsia="Consolas" w:hAnsi="Consolas" w:cs="Consolas"/>
+                <w:sz w:val="19"/>
+                <w:szCs w:val="19"/>
+              </w:rPr>
+              <w:t xml:space="preserve">  web:</w:t>
+            </w:r>
+          </w:p>
+          <w:p>
+            <w:pPr>
+              <w:spacing w:line="276" w:lineRule="auto"/>
+            </w:pPr>
+            <w:r>
+              <w:rPr>
+                <w:rFonts w:ascii="Consolas" w:eastAsia="Consolas" w:hAnsi="Consolas" w:cs="Consolas"/>
+                <w:sz w:val="19"/>
+                <w:szCs w:val="19"/>
+              </w:rPr>
+              <w:t xml:space="preserve">    environment:</w:t>
+            </w:r>
+          </w:p>
+          <w:p>
+            <w:pPr>
+              <w:spacing w:line="276" w:lineRule="auto"/>
+            </w:pPr>
+            <w:r>
+              <w:rPr>
+                <w:rFonts w:ascii="Consolas" w:eastAsia="Consolas" w:hAnsi="Consolas" w:cs="Consolas"/>
+                <w:sz w:val="19"/>
+                <w:szCs w:val="19"/>
+              </w:rPr>
               <w:t xml:space="preserve">      REDIS_URL: redis://:${REDIS_PASSWORD:?Missing REDIS_PASSWORD}@redis:6379/0</w:t>
+            </w:r>
+          </w:p>
+          <w:p>
+            <w:pPr>
+              <w:spacing w:line="276" w:lineRule="auto"/>
+            </w:pPr>
+            <w:r>
+              <w:rPr>
+                <w:rFonts w:ascii="Consolas" w:eastAsia="Consolas" w:hAnsi="Consolas" w:cs="Consolas"/>
+                <w:sz w:val="19"/>
+                <w:szCs w:val="19"/>
+              </w:rPr>
+              <w:t xml:space="preserve">      WEB_CONCURRENCY: "2"</w:t>
             </w:r>
           </w:p>
           <w:p>

</xml_diff>

<commit_message>
Cap nhat kiem thu, tai lieu va bao cao cho hang doi job nen, ghi lai loi healthcheck worker sau khi Redis khoi dong lai
</commit_message>
<xml_diff>
--- a/bao-cao/Do_an_COMP1313_DongGoiMonolithicThanhDocker_TranHoangDat_49.01.104.030.docx
+++ b/bao-cao/Do_an_COMP1313_DongGoiMonolithicThanhDocker_TranHoangDat_49.01.104.030.docx
@@ -7270,6 +7270,15 @@
       </w:pPr>
       <w:r>
         <w:t xml:space="preserve">Khi thêm hàng đợi tác vụ, cấu hình Redis ban đầu đặt chính sách allkeys-lru. Với chính sách đó, lúc Redis chạm giới hạn 64 MB, bất kỳ khóa nào cũng có thể bị xóa, kể cả tác vụ đang chờ trong hàng đợi, và tài liệu sẽ nằm ở trạng thái chờ mà không có worker nào xử lý. Cách khắc phục là đổi sang volatile-lru: Redis chỉ xóa khóa có thời hạn, gồm bộ đếm giới hạn tần suất và bộ nhớ đệm phiên đăng nhập, còn tác vụ trong hàng đợi không có thời hạn nên được giữ lại.</w:t>
+      </w:r>
+    </w:p>
+    <w:p>
+      <w:pPr>
+        <w:spacing w:before="120" w:after="120" w:line="312" w:lineRule="auto"/>
+        <w:jc w:val="both"/>
+      </w:pPr>
+      <w:r>
+        <w:t xml:space="preserve">Lần chạy kiểm thử tích hợp đầu tiên sau khi thêm service worker cho kết quả docker compose ps báo worker ở trạng thái unhealthy, dù worker vẫn chạy xong tác vụ thử. Log cho thấy nguyên nhân: kịch bản kiểm thử dừng Redis rồi bật lại, Redis không lưu dữ liệu xuống đĩa nên khởi động lại với bộ nhớ trống, mất luôn tập rq:workers mà RQ dùng để liệt kê các worker đã đăng ký. Healthcheck ban đầu đọc đúng tập đó nên báo lỗi mãi, trong khi worker đã tự kết nối lại và vẫn nhận tác vụ. Cách khắc phục là đặt tên riêng cho worker khi khởi động, ghi tên vào tệp /tmp/rq-worker-name và cho healthcheck kiểm tra khóa heartbeat rq:worker:&lt;tên&gt; của chính worker đó; RQ tạo lại khóa heartbeat ở lần gia hạn kế tiếp nên healthcheck trở lại healthy sau khi Redis khởi động lại.</w:t>
       </w:r>
     </w:p>
     <w:p>

</xml_diff>

<commit_message>
Viet lai phan Redis va worker trong bao cao nhu mot phan cua thiet ke, them cho trong cap nhat Hinh 1.1
</commit_message>
<xml_diff>
--- a/bao-cao/Do_an_COMP1313_DongGoiMonolithicThanhDocker_TranHoangDat_49.01.104.030.docx
+++ b/bao-cao/Do_an_COMP1313_DongGoiMonolithicThanhDocker_TranHoangDat_49.01.104.030.docx
@@ -4496,7 +4496,7 @@
         <w:t xml:space="preserve">Hình 4.4.</w:t>
       </w:r>
       <w:r>
-        <w:t xml:space="preserve"> Trạng thái sáu container sau khi bổ sung Redis và worker</w:t>
+        <w:t xml:space="preserve"> Trạng thái sáu container của hệ thống</w:t>
       </w:r>
     </w:p>
     <w:p>
@@ -4557,10 +4557,10 @@
           <w:b/>
           <w:bCs/>
         </w:rPr>
-        <w:t>Bảng 4.2.</w:t>
-      </w:r>
-      <w:r>
-        <w:t xml:space="preserve"> Kết quả kiểm thử sau khi bổ sung Redis</w:t>
+        <w:t xml:space="preserve">Bảng 4.2.</w:t>
+      </w:r>
+      <w:r>
+        <w:t xml:space="preserve"> Kết quả kiểm thử Redis và service worker</w:t>
       </w:r>
     </w:p>
     <w:p>
@@ -4594,7 +4594,7 @@
         <w:t xml:space="preserve">Đồ án chọn ứng dụng web monolithic có sẵn mang tên Research Document Workspace, một hệ thống quản lý tài liệu nghiên cứu viết bằng Python/FastAPI, có cơ sở dữ liệu quan hệ, cơ sở dữ liệu tài liệu và kho lưu trữ đối tượng đi kèm, để đóng gói bằng Docker. Nội dung chính gồm viết Dockerfile cho ứng dụng, dùng Docker Compose liên kết ứng dụng với các dịch vụ dữ liệu, thực hiện build và run trên máy thực nghiệm, ghi nhận các lỗi môi trường gặp phải cùng cách khắc phục, </w:t>
       </w:r>
       <w:r>
-        <w:t>triển khai lên một VPS có tên miền và bổ sung Redis làm kho lưu trạng thái dùng chung giữa các tiến trình ứng dụng.</w:t>
+        <w:t>triển khai lên một VPS có tên miền, dùng Redis làm kho lưu trạng thái dùng chung giữa các tiến trình ứng dụng.</w:t>
       </w:r>
     </w:p>
     <w:p>
@@ -4606,13 +4606,13 @@
         <w:t>Đồ án gồm bốn chương. Chương 1 trình bày tổng quan đề tài và mô tả sơ lược mã nguồn được chọn. Chương 2 tóm tắt cơ sở lý thuyết về điện toán đám mây, container hóa và một số khái niệm liên quan đến dữ liệu, mô hình ngôn ngữ lớn được dùng trong ứng dụng. Chương 3 phân tích kiến trúc ứng dụng và thiết kế giải pháp đóng gói</w:t>
       </w:r>
       <w:r>
-        <w:t>, kèm thiết kế bổ sung service Redis</w:t>
+        <w:t>, gồm cả service Redis và service worker</w:t>
       </w:r>
       <w:r>
         <w:t>. Chương 4 trình bày quá trình cài đặt, các lỗi môi trường gặp phải trong lúc build/run cùng cách khắc phục</w:t>
       </w:r>
       <w:r>
-        <w:t>, kết quả bổ sung Redis, kết quả triển khai lên VPS</w:t>
+        <w:t>, kết quả triển khai Redis và worker, kết quả triển khai lên VPS</w:t>
       </w:r>
       <w:r>
         <w:t xml:space="preserve"> và kết quả thực nghiệm.</w:t>
@@ -4836,7 +4836,19 @@
         <w:jc w:val="both"/>
       </w:pPr>
       <w:r>
-        <w:t>Về phần dữ liệu, ứng dụng dùng ba kho lưu trữ cho ba loại dữ liệu khác nhau thay vì gộp chung vào một cơ sở dữ liệu quan hệ: PostgreSQL lưu thông tin có cấu trúc cố định như tài khoản, dự án, danh sách tài liệu; MongoDB lưu metadata linh hoạt của từng tài liệu, trong đó mỗi tài liệu có thể có số trường khác nhau; MinIO, một dịch vụ tương thích giao thức S3, lưu tệp gốc người dùng tải lên. Kết quả khảo sát là căn cứ để chương 3 thiết kế Docker Compose liên kết đúng bốn dịch vụ cần thiết thay vì một ứng dụng với một cơ sở dữ liệu.</w:t>
+        <w:rPr>
+          <w:highlight w:val="yellow"/>
+        </w:rPr>
+        <w:t xml:space="preserve">&lt;CẬP NHẬT HÌNH 1.1: THÊM KHỐI REDIS CẠNH POSTGRESQL, MINIO, MONGODB, MŨI TÊN TỪ SERVICE LAYER; NHÃN: BỘ ĐẾM, BỘ NHỚ ĐỆM PHIÊN, HÀNG ĐỢI TÁC VỤ&gt;</w:t>
+      </w:r>
+    </w:p>
+    <w:p>
+      <w:pPr>
+        <w:spacing w:before="120" w:after="120" w:line="312" w:lineRule="auto"/>
+        <w:jc w:val="both"/>
+      </w:pPr>
+      <w:r>
+        <w:t>Về phần dữ liệu, ứng dụng dùng ba kho lưu trữ cho ba loại dữ liệu khác nhau thay vì gộp chung vào một cơ sở dữ liệu quan hệ: PostgreSQL lưu thông tin có cấu trúc cố định như tài khoản, dự án, danh sách tài liệu; MongoDB lưu metadata linh hoạt của từng tài liệu, trong đó mỗi tài liệu có thể có số trường khác nhau; MinIO, một dịch vụ tương thích giao thức S3, lưu tệp gốc người dùng tải lên. Ngoài ba kho đó, ứng dụng dùng Redis cho dữ liệu tạm thời dùng chung giữa các tiến trình: bộ đếm giới hạn tần suất, bộ nhớ đệm phiên đăng nhập, kênh đồng bộ cấu hình và hàng đợi tác vụ nền. Dữ liệu trong Redis tạo lại được nên Redis không phải kho lưu trữ chính. Kết quả khảo sát là căn cứ để chương 3 thiết kế Docker Compose liên kết ứng dụng với từng dịch vụ dữ liệu thay vì một ứng dụng với một cơ sở dữ liệu.</w:t>
       </w:r>
     </w:p>
     <w:p>
@@ -5665,7 +5677,7 @@
         <w:rPr>
           <w:highlight w:val="yellow"/>
         </w:rPr>
-        <w:t xml:space="preserve">&lt;CẬP NHẬT HÌNH 3.1: VẼ THÊM KHỐI REDIS NỐI VỚI SERVICE WEB TRONG MẠNG NỘI BỘ, KHÔNG MỞ CỔNG RA NGOÀI&gt;</w:t>
+        <w:t xml:space="preserve">&lt;CẬP NHẬT HÌNH 3.1: VẼ THÊM KHỐI REDIS VÀ KHỐI WORKER; WEB VÀ WORKER CÙNG NỐI TỚI REDIS TRONG MẠNG NỘI BỘ, KHÔNG MỞ CỔNG RA NGOÀI&gt;</w:t>
       </w:r>
     </w:p>
     <w:p>
@@ -5702,11 +5714,9 @@
         <w:pStyle w:val="Heading2"/>
         <w:spacing w:before="240" w:after="120" w:line="312" w:lineRule="auto"/>
       </w:pPr>
-      <w:bookmarkStart w:id="22" w:name="_Toc242258335"/>
-      <w:r>
-        <w:t>3.6. THIẾT KẾ BỔ SUNG REDIS</w:t>
-      </w:r>
-      <w:bookmarkEnd w:id="22"/>
+      <w:r>
+        <w:t xml:space="preserve">3.6. THIẾT KẾ REDIS VÀ SERVICE WORKER</w:t>
+      </w:r>
     </w:p>
     <w:p>
       <w:pPr>
@@ -5714,11 +5724,7 @@
         <w:jc w:val="both"/>
       </w:pPr>
       <w:r>
-        <w:t xml:space="preserve">Khảo sát mã nguồn cho thấy hai thành phần của ứng dụng giữ trạng thái ngay trong bộ nhớ của tiến trình web: bộ đếm giới hạn tần suất cho các biểu mẫu đăng nhập, đăng ký, quên mật khẩu và endpoint hỏi đáp, cùng cấu hình mô hình ngôn ngữ lớn mà quản trị viên đổi từ giao diện. Hai thành phần đó chỉ đúng khi container web chạy một tiến trình uvicorn </w:t>
-      </w:r>
-      <w:r>
-        <w:lastRenderedPageBreak/>
-        <w:t>duy nhất. Khi tăng số worker hoặc số bản sao container, mỗi tiến trình giữ một bộ đếm riêng nên giới hạn thực tế bị nhân lên theo số tiến trình; bộ đếm cũng trở về 0 mỗi lần container web khởi động lại.</w:t>
+        <w:t xml:space="preserve">Hai thành phần của ứng dụng cần trạng thái dùng chung giữa các tiến trình web: bộ đếm giới hạn tần suất cho các biểu mẫu đăng nhập, đăng ký, quên mật khẩu và endpoint hỏi đáp, cùng cấu hình mô hình ngôn ngữ lớn mà quản trị viên đổi từ giao diện. Nếu giữ trong bộ nhớ của từng tiến trình, hai thành phần đó chỉ đúng khi container web chạy một tiến trình uvicorn duy nhất. Với nhiều worker hoặc nhiều bản sao container, mỗi tiến trình giữ một bộ đếm riêng nên giới hạn thực tế bị nhân lên theo số tiến trình; bộ đếm cũng trở về 0 mỗi lần container web khởi động lại.</w:t>
       </w:r>
     </w:p>
     <w:p>
@@ -5754,7 +5760,7 @@
         <w:t xml:space="preserve"> (Key-Value)</w:t>
       </w:r>
       <w:r>
-        <w:t xml:space="preserve"> lưu trên bộ nhớ, có sẵn các cấu trúc như chuỗi, danh sách, tập hợp có thứ tự và cơ chế tự hết hạn khóa (TTL). Đồ án bổ sung Redis thành service thứ năm trong Docker Compose để lưu trạng thái dùng chung giữa các tiến trình web. Bộ đếm giới hạn tần suất chuyển sang tập hợp có thứ tự của Redis theo cơ chế cửa sổ trượt: mỗi lượt gọi thêm một phần tử mang mốc thời gian, các phần tử cũ hơn độ dài cửa sổ bị xóa, số phần tử còn lại là số lượt đã dùng trong cửa sổ.</w:t>
+        <w:t xml:space="preserve"> lưu trên bộ nhớ, có sẵn các cấu trúc như chuỗi, danh sách, tập hợp có thứ tự và cơ chế tự hết hạn khóa (TTL). Đồ án dùng Redis làm một service trong Docker Compose để lưu trạng thái dùng chung giữa các tiến trình web. Bộ đếm giới hạn tần suất chuyển sang tập hợp có thứ tự của Redis theo cơ chế cửa sổ trượt: mỗi lượt gọi thêm một phần tử mang mốc thời gian, các phần tử cũ hơn độ dài cửa sổ bị xóa, số phần tử còn lại là số lượt đã dùng trong cửa sổ.</w:t>
       </w:r>
     </w:p>
     <w:p>
@@ -5763,7 +5769,7 @@
         <w:jc w:val="both"/>
       </w:pPr>
       <w:r>
-        <w:t>Thành phần thứ hai chuyển sang Redis là bước kiểm tra phiên đăng nhập. Với mỗi yêu cầu, ứng dụng đọc lại tài khoản trong PostgreSQL để biết tài khoản còn hoạt động và phiên chưa bị thu hồi. Kết quả hợp lệ được lưu trong Redis 30 giây dưới khóa session:&lt;mã người dùng&gt;, kèm giá trị session_version tại thời điểm kiểm tra; yêu cầu tiếp theo trong khoảng đó đọc từ Redis thay vì truy vấn PostgreSQL. Các thao tác thu hồi phiên, gồm đổi mật khẩu, khóa tài khoản, đổi vai trò và đăng xuất khỏi mọi thiết bị, xóa khóa đó ngay sau khi ghi vào PostgreSQL, nên tài khoản bị khóa không dùng tiếp được phiên đang nằm trong bộ nhớ đệm.</w:t>
+        <w:t>Thành phần thứ hai lưu trên Redis là bước kiểm tra phiên đăng nhập. Với mỗi yêu cầu, ứng dụng đọc lại tài khoản trong PostgreSQL để biết tài khoản còn hoạt động và phiên chưa bị thu hồi. Kết quả hợp lệ được lưu trong Redis 30 giây dưới khóa session:&lt;mã người dùng&gt;, kèm giá trị session_version tại thời điểm kiểm tra; yêu cầu tiếp theo trong khoảng đó đọc từ Redis thay vì truy vấn PostgreSQL. Các thao tác thu hồi phiên, gồm đổi mật khẩu, khóa tài khoản, đổi vai trò và đăng xuất khỏi mọi thiết bị, xóa khóa đó ngay sau khi ghi vào PostgreSQL, nên tài khoản bị khóa không dùng tiếp được phiên đang nằm trong bộ nhớ đệm.</w:t>
       </w:r>
     </w:p>
     <w:p>
@@ -5781,7 +5787,7 @@
         <w:jc w:val="both"/>
       </w:pPr>
       <w:r>
-        <w:t xml:space="preserve">Phần cuối là hàng đợi tác vụ nền cho phân tích ảnh, âm thanh và video bằng Gemini. Một lần phân tích video có thể kéo dài vài phút; trước đó yêu cầu HTTP phải chờ suốt thời gian đó và giữ một luồng xử lý của web. Đồ án dùng thư viện RQ (Redis Queue) và thêm service worker chạy cùng image với web, lệnh khởi động python -m app.worker. Khi người dùng bấm phân tích, web ghi trạng thái queued vào MongoDB, đưa tác vụ vào hàng đợi trên Redis và trả trang ngay; worker lấy tác vụ, gọi Gemini, lưu văn bản rồi xóa trạng thái, hoặc ghi trạng thái failed kèm lý do. Trang tài liệu hỏi lại trạng thái mỗi 5 giây và tự tải lại khi tác vụ xong. Khi không kết nối được hàng đợi, web phân tích ngay trong yêu cầu như trước khi có Redis.</w:t>
+        <w:t xml:space="preserve">Phần cuối là hàng đợi tác vụ nền cho phân tích ảnh, âm thanh và video bằng Gemini. Một lần phân tích video có thể kéo dài vài phút; nếu xử lý ngay trong yêu cầu HTTP, trình duyệt phải chờ suốt thời gian đó và yêu cầu giữ một luồng xử lý của web. Đồ án dùng thư viện RQ (Redis Queue) kèm service worker chạy cùng image với web, lệnh khởi động python -m app.worker. Khi người dùng bấm phân tích, web ghi trạng thái queued vào MongoDB, đưa tác vụ vào hàng đợi trên Redis và trả trang ngay; worker lấy tác vụ, gọi Gemini, lưu văn bản rồi xóa trạng thái, hoặc ghi trạng thái failed kèm lý do. Trang tài liệu hỏi lại trạng thái mỗi 5 giây và tự tải lại khi tác vụ xong. Khi không kết nối được hàng đợi, web phân tích ngay trong yêu cầu như khi hệ thống chạy không có Redis.</w:t>
       </w:r>
     </w:p>
     <w:p>
@@ -5800,7 +5806,7 @@
       </w:pPr>
       <w:r>
         <w:lastRenderedPageBreak/>
-        <w:t>Khác với PostgreSQL, MongoDB và MinIO, Redis không gắn named volume và tắt ghi dữ liệu xuống đĩa, vì dữ liệu trong Redis chỉ gồm bộ đếm và bộ nhớ đệm, tạo lại được bất cứ lúc nào. Mất dữ liệu Redis không làm mất dữ liệu người dùng, và Redis không nằm trong quy trình sao lưu. Khi Redis ngừng hoạt động, ứng dụng bắt lỗi kết nối, ghi log cảnh báo và quay về bộ đếm trong bộ nhớ tiến trình như trước khi có Redis; endpoint /health/ready báo trạng thái Redis để quan sát nhưng không đánh dấu ứng dụng chưa sẵn sàng chỉ vì Redis lỗi.</w:t>
+        <w:t>Khác với PostgreSQL, MongoDB và MinIO, Redis không gắn named volume và tắt ghi dữ liệu xuống đĩa, vì dữ liệu trong Redis chỉ gồm bộ đếm và bộ nhớ đệm, tạo lại được bất cứ lúc nào. Mất dữ liệu Redis không làm mất dữ liệu người dùng, và Redis không nằm trong quy trình sao lưu. Khi Redis ngừng hoạt động, ứng dụng bắt lỗi kết nối, ghi log cảnh báo và quay về bộ đếm trong bộ nhớ tiến trình như khi hệ thống chạy không có Redis; endpoint /health/ready báo trạng thái Redis để quan sát nhưng không đánh dấu ứng dụng chưa sẵn sàng chỉ vì Redis lỗi.</w:t>
       </w:r>
     </w:p>
     <w:p>
@@ -5815,7 +5821,7 @@
         <w:t xml:space="preserve">Bảng 3.2: </w:t>
       </w:r>
       <w:r>
-        <w:t>Vai trò của Redis theo từng giai đoạn triển khai</w:t>
+        <w:t xml:space="preserve">Vai trò của Redis trong hệ thống</w:t>
       </w:r>
     </w:p>
     <w:tbl>
@@ -5864,7 +5870,7 @@
                 <w:sz w:val="24"/>
                 <w:szCs w:val="24"/>
               </w:rPr>
-              <w:t>Giai đoạn</w:t>
+              <w:t xml:space="preserve">STT</w:t>
             </w:r>
           </w:p>
         </w:tc>
@@ -5918,7 +5924,7 @@
                 <w:sz w:val="24"/>
                 <w:szCs w:val="24"/>
               </w:rPr>
-              <w:t>Thay cho</w:t>
+              <w:t xml:space="preserve">Nếu không có Redis</w:t>
             </w:r>
           </w:p>
         </w:tc>
@@ -6190,7 +6196,7 @@
         <w:jc w:val="both"/>
       </w:pPr>
       <w:r>
-        <w:t xml:space="preserve">Đồ án đã triển khai cả bốn giai đoạn: service web chạy hai worker uvicorn, service worker riêng xử lý tác vụ nền.</w:t>
+        <w:t xml:space="preserve">Nhờ bốn vai trò trên, service web chạy hai worker uvicorn và tác vụ phân tích media chạy ở service worker riêng.</w:t>
       </w:r>
     </w:p>
     <w:p>
@@ -6213,7 +6219,7 @@
         <w:t xml:space="preserve">Chương 3 phân tích hạn chế của kiến trúc chạy trực tiếp trên máy chủ, từ đó thiết kế Dockerfile đóng gói ứng dụng, thiết kế Docker Compose liên kết bốn service với thứ tự khởi động an toàn qua healthcheck và thiết kế cách truyền cấu hình/bí mật vào container mà không ghi cứng trong image. Chương 4 trình bày kết quả build, run thật trên máy thực nghiệm cùng các lỗi môi trường gặp phải. </w:t>
       </w:r>
       <w:r>
-        <w:t>Mục 3.6 bổ sung thiết kế service Redis lưu trạng thái dùng chung giữa các tiến trình web, có cơ chế quay về bộ đếm trong bộ nhớ khi Redis lỗi.</w:t>
+        <w:t>Mục 3.6 trình bày thiết kế service Redis lưu trạng thái dùng chung giữa các tiến trình web và service worker xử lý tác vụ nền, có cơ chế quay về bộ đếm trong bộ nhớ khi Redis lỗi.</w:t>
       </w:r>
     </w:p>
     <w:p>
@@ -7248,11 +7254,9 @@
         <w:pStyle w:val="Heading3"/>
         <w:spacing w:before="180" w:after="100" w:line="312" w:lineRule="auto"/>
       </w:pPr>
-      <w:bookmarkStart w:id="32" w:name="_Toc242258345"/>
-      <w:r>
-        <w:t>4.4.4. Lỗi gặp phải khi bổ sung Redis</w:t>
-      </w:r>
-      <w:bookmarkEnd w:id="32"/>
+      <w:r>
+        <w:t xml:space="preserve">4.4.4. Lỗi gặp phải với Redis và worker</w:t>
+      </w:r>
     </w:p>
     <w:p>
       <w:pPr>
@@ -7260,7 +7264,7 @@
         <w:jc w:val="both"/>
       </w:pPr>
       <w:r>
-        <w:t>Bản thiết kế đầu của bộ nhớ đệm phiên đăng nhập đặt session_version vào tên khóa, dựa trên lập luận: thao tác thu hồi phiên luôn tăng session_version, nên không cần xóa khóa cũ. Kiểm thử đơn vị cho thấy lập luận đó sai: cookie cũ vẫn mang session_version cũ và vẫn khớp đúng khóa cũ còn trong Redis, nên tài khoản vừa bị khóa còn dùng được thêm tối đa 30 giây. Cách khắc phục là đổi tên khóa thành session:&lt;mã người dùng&gt;, lưu session_version trong giá trị để so với cookie và xóa khóa ngay trong mỗi thao tác thu hồi phiên. Bộ kiểm thử được bổ sung kịch bản khóa tài khoản và đổi vai trò trong lúc phiên đang nằm trong bộ nhớ đệm.</w:t>
+        <w:t>Bản thiết kế đầu của bộ nhớ đệm phiên đăng nhập đặt session_version vào tên khóa, dựa trên lập luận: thao tác thu hồi phiên luôn tăng session_version, nên không cần xóa khóa cũ. Kiểm thử đơn vị cho thấy lập luận đó sai: cookie cũ vẫn mang session_version cũ và vẫn khớp đúng khóa cũ còn trong Redis, nên tài khoản vừa bị khóa còn dùng được thêm tối đa 30 giây. Cách khắc phục là đổi tên khóa thành session:&lt;mã người dùng&gt;, lưu session_version trong giá trị để so với cookie và xóa khóa ngay trong mỗi thao tác thu hồi phiên. Bộ kiểm thử có thêm kịch bản khóa tài khoản và đổi vai trò trong lúc phiên đang nằm trong bộ nhớ đệm.</w:t>
       </w:r>
     </w:p>
     <w:p>
@@ -7269,7 +7273,7 @@
         <w:jc w:val="both"/>
       </w:pPr>
       <w:r>
-        <w:t xml:space="preserve">Khi thêm hàng đợi tác vụ, cấu hình Redis ban đầu đặt chính sách allkeys-lru. Với chính sách đó, lúc Redis chạm giới hạn 64 MB, bất kỳ khóa nào cũng có thể bị xóa, kể cả tác vụ đang chờ trong hàng đợi, và tài liệu sẽ nằm ở trạng thái chờ mà không có worker nào xử lý. Cách khắc phục là đổi sang volatile-lru: Redis chỉ xóa khóa có thời hạn, gồm bộ đếm giới hạn tần suất và bộ nhớ đệm phiên đăng nhập, còn tác vụ trong hàng đợi không có thời hạn nên được giữ lại.</w:t>
+        <w:t xml:space="preserve">Cấu hình Redis ban đầu đặt chính sách allkeys-lru, chưa tính tới hàng đợi tác vụ. Với chính sách đó, lúc Redis chạm giới hạn 64 MB, bất kỳ khóa nào cũng có thể bị xóa, kể cả tác vụ đang chờ trong hàng đợi, và tài liệu sẽ nằm ở trạng thái chờ mà không có worker nào xử lý. Cách khắc phục là đổi sang volatile-lru: Redis chỉ xóa khóa có thời hạn, gồm bộ đếm giới hạn tần suất và bộ nhớ đệm phiên đăng nhập, còn tác vụ trong hàng đợi không có thời hạn nên được giữ lại.</w:t>
       </w:r>
     </w:p>
     <w:p>
@@ -7278,7 +7282,7 @@
         <w:jc w:val="both"/>
       </w:pPr>
       <w:r>
-        <w:t xml:space="preserve">Lần chạy kiểm thử tích hợp đầu tiên sau khi thêm service worker cho kết quả docker compose ps báo worker ở trạng thái unhealthy, dù worker vẫn chạy xong tác vụ thử. Log cho thấy nguyên nhân: kịch bản kiểm thử dừng Redis rồi bật lại, Redis không lưu dữ liệu xuống đĩa nên khởi động lại với bộ nhớ trống, mất luôn tập rq:workers mà RQ dùng để liệt kê các worker đã đăng ký. Healthcheck ban đầu đọc đúng tập đó nên báo lỗi mãi, trong khi worker đã tự kết nối lại và vẫn nhận tác vụ. Cách khắc phục là đặt tên riêng cho worker khi khởi động, ghi tên vào tệp /tmp/rq-worker-name và cho healthcheck kiểm tra khóa heartbeat rq:worker:&lt;tên&gt; của chính worker đó; RQ tạo lại khóa heartbeat ở lần gia hạn kế tiếp nên healthcheck trở lại healthy sau khi Redis khởi động lại.</w:t>
+        <w:t xml:space="preserve">Lần chạy kiểm thử tích hợp đầu tiên với service worker cho kết quả docker compose ps báo worker ở trạng thái unhealthy, dù worker vẫn chạy xong tác vụ thử. Log cho thấy nguyên nhân: kịch bản kiểm thử dừng Redis rồi bật lại, Redis không lưu dữ liệu xuống đĩa nên khởi động lại với bộ nhớ trống, mất luôn tập rq:workers mà RQ dùng để liệt kê các worker đã đăng ký. Healthcheck ban đầu đọc đúng tập đó nên báo lỗi mãi, trong khi worker đã tự kết nối lại và vẫn nhận tác vụ. Cách khắc phục là đặt tên riêng cho worker khi khởi động, ghi tên vào tệp /tmp/rq-worker-name và cho healthcheck kiểm tra khóa heartbeat rq:worker:&lt;tên&gt; của chính worker đó; RQ tạo lại khóa heartbeat ở lần gia hạn kế tiếp nên healthcheck trở lại healthy sau khi Redis khởi động lại.</w:t>
       </w:r>
     </w:p>
     <w:p>
@@ -7290,7 +7294,7 @@
         <w:rPr>
           <w:highlight w:val="yellow"/>
         </w:rPr>
-        <w:t xml:space="preserve">&lt;ĐIỀN LỖI THẬT GẶP KHI THÊM REDIS VÀ CÁCH KHẮC PHỤC. GỢI Ý LỖI HAY GẶP: (1) thiếu REDIS_PASSWORD trong .env làm docker compose báo lỗi "required variable REDIS_PASSWORD is missing a value" ngay khi đọc cấu hình; (2) healthcheck báo NOAUTH khi redis-cli không có mật khẩu, khắc phục bằng biến REDISCLI_AUTH trong container; (3) mật khẩu có ký tự @ hoặc : làm hỏng chuỗi REDIS_URL, khắc phục bằng mật khẩu chỉ gồm chữ, số, - và _&gt;</w:t>
+        <w:t xml:space="preserve">&lt;ĐIỀN LỖI THẬT GẶP VỚI REDIS VÀ CÁCH KHẮC PHỤC. GỢI Ý LỖI HAY GẶP: (1) thiếu REDIS_PASSWORD trong .env làm docker compose báo lỗi "required variable REDIS_PASSWORD is missing a value" ngay khi đọc cấu hình; (2) healthcheck báo NOAUTH khi redis-cli không có mật khẩu, khắc phục bằng biến REDISCLI_AUTH trong container; (3) mật khẩu có ký tự @ hoặc : làm hỏng chuỗi REDIS_URL, khắc phục bằng mật khẩu chỉ gồm chữ, số, - và _&gt;</w:t>
       </w:r>
     </w:p>
     <w:p>
@@ -7322,11 +7326,9 @@
         <w:pStyle w:val="Heading2"/>
         <w:spacing w:before="240" w:after="120" w:line="312" w:lineRule="auto"/>
       </w:pPr>
-      <w:bookmarkStart w:id="34" w:name="_Toc242258347"/>
-      <w:r>
-        <w:t>4.6. BỔ SUNG REDIS VÀO HỆ THỐNG</w:t>
-      </w:r>
-      <w:bookmarkEnd w:id="34"/>
+      <w:r>
+        <w:t xml:space="preserve">4.6. TRIỂN KHAI REDIS VÀ SERVICE WORKER</w:t>
+      </w:r>
     </w:p>
     <w:p>
       <w:pPr>
@@ -7334,7 +7336,7 @@
         <w:jc w:val="both"/>
       </w:pPr>
       <w:r>
-        <w:t xml:space="preserve">Sau khi thêm service redis, service worker vào docker-compose.yaml và biến REDIS_PASSWORD vào tệp .env, hệ thống được khởi động lại bằng cùng lệnh ở mục 4.3. Lệnh docker compose ps xác nhận sáu container ở trạng thái healthy:</w:t>
+        <w:t xml:space="preserve">Service redis và service worker khai báo trong docker-compose.yaml, mật khẩu Redis đặt qua biến REDIS_PASSWORD trong tệp .env; hệ thống khởi động bằng cùng lệnh ở mục 4.3. Lệnh docker compose ps xác nhận sáu container ở trạng thái healthy:</w:t>
       </w:r>
     </w:p>
     <w:tbl>
@@ -7412,7 +7414,7 @@
         <w:t xml:space="preserve">Hình 4.4: </w:t>
       </w:r>
       <w:r>
-        <w:t xml:space="preserve">Trạng thái sáu container sau khi bổ sung Redis và worker</w:t>
+        <w:t xml:space="preserve">Trạng thái sáu container của hệ thống</w:t>
       </w:r>
     </w:p>
     <w:p>
@@ -7421,7 +7423,7 @@
         <w:jc w:val="both"/>
       </w:pPr>
       <w:r>
-        <w:t>Bảng 4.2 ghi kết quả kiểm thử sau khi chuyển bộ đếm giới hạn tần suất và bước kiểm tra phiên đăng nhập sang Redis, gồm trường hợp container web khởi động lại và trường hợp Redis ngừng hoạt động. Giới hạn đăng nhập của ứng dụng là 20 lượt trong 5 phút cho mỗi địa chỉ IP. Các kịch bản được chạy tự động bằng script tests/integration/redis_test.py.</w:t>
+        <w:t>Bảng 4.2 ghi kết quả kiểm thử bộ đếm giới hạn tần suất, bộ nhớ đệm phiên đăng nhập, đồng bộ cấu hình và hàng đợi tác vụ trên Redis, gồm trường hợp container web khởi động lại và trường hợp Redis ngừng hoạt động. Giới hạn đăng nhập của ứng dụng là 20 lượt trong 5 phút cho mỗi địa chỉ IP. Các kịch bản được chạy tự động bằng script tests/integration/redis_test.py.</w:t>
       </w:r>
     </w:p>
     <w:p>
@@ -7436,7 +7438,7 @@
         <w:t xml:space="preserve">Bảng 4.2: </w:t>
       </w:r>
       <w:r>
-        <w:t>Kết quả kiểm thử sau khi bổ sung Redis</w:t>
+        <w:t xml:space="preserve">Kết quả kiểm thử Redis và service worker</w:t>
       </w:r>
     </w:p>
     <w:tbl>
@@ -8396,7 +8398,7 @@
         <w:t>Chương 4 trình bày quá trình build và run bốn container theo thiết kế ở chương 3, cùng ba lỗi môi trường gặp phải: thứ tự khởi động giữa ứng dụng và cơ sở dữ liệu, biến môi trường bí mật còn giá trị mẫu và nguy cơ log bị loãng khi gọi mô hình ngôn ngữ lớn không giới hạn tần suất. Chương cũng trình bày kết quả thực nghiệm sau khi hệ thống chạy ổn định</w:t>
       </w:r>
       <w:r>
-        <w:t>, kết quả bổ sung Redis và service worker và kết quả triển khai lên VPS có tên miền.</w:t>
+        <w:t>, kết quả triển khai Redis và service worker và kết quả triển khai lên VPS có tên miền.</w:t>
       </w:r>
     </w:p>
     <w:p>
@@ -8418,10 +8420,10 @@
         <w:jc w:val="both"/>
       </w:pPr>
       <w:r>
-        <w:t xml:space="preserve">Đồ án đã đóng gói một ứng dụng web monolithic có ba dịch vụ dữ liệu đi kèm thành bốn container liên kết bằng Docker Compose: viết Dockerfile đóng gói ứng dụng, thiết kế thứ tự khởi động an toàn bằng healthcheck, tách cấu hình/bí mật khỏi image và ghi nhận lại ba lỗi môi trường thật gặp phải trong quá trình build/run cùng cách khắc phục từng lỗi. </w:t>
-      </w:r>
-      <w:r>
-        <w:t>Ngoài yêu cầu gợi ý của đề tài, hệ thống được triển khai lên VPS có tên miền và HTTPS, và bổ sung Redis lưu bộ đếm giới hạn tần suất dùng chung, bộ nhớ đệm cho bước kiểm tra phiên đăng nhập, kênh đồng bộ cấu hình và hàng đợi tác vụ nền, nhờ đó service web chạy được hai worker uvicorn và phân tích media chạy ở service worker riêng.</w:t>
+        <w:t xml:space="preserve">Đồ án đã đóng gói một ứng dụng web monolithic có ba dịch vụ dữ liệu đi kèm thành sáu container liên kết bằng Docker Compose (web, worker, PostgreSQL, MongoDB, MinIO, Redis): viết Dockerfile đóng gói ứng dụng, thiết kế thứ tự khởi động an toàn bằng healthcheck, tách cấu hình/bí mật khỏi image và ghi nhận lại ba lỗi môi trường thật gặp phải trong quá trình build/run cùng cách khắc phục từng lỗi. </w:t>
+      </w:r>
+      <w:r>
+        <w:t>Ngoài yêu cầu gợi ý của đề tài, hệ thống được triển khai lên VPS có tên miền và HTTPS, và dùng Redis lưu bộ đếm giới hạn tần suất dùng chung, bộ nhớ đệm cho bước kiểm tra phiên đăng nhập, kênh đồng bộ cấu hình và hàng đợi tác vụ nền, nhờ đó service web chạy được hai worker uvicorn và phân tích media chạy ở service worker riêng.</w:t>
       </w:r>
     </w:p>
     <w:p>

</xml_diff>